<commit_message>
feat: padronizacao completa do modulo CDP, limpeza do ambiente e atualizacao das documentacoes DOCX
</commit_message>
<xml_diff>
--- a/DOCUMENTACAO_SISTEMA_PLANOS_LUAN.docx
+++ b/DOCUMENTACAO_SISTEMA_PLANOS_LUAN.docx
@@ -4,10 +4,15 @@
   <w:body>
     <w:p>
       <w:pPr>
-        <w:pStyle w:val="Title"/>
         <w:jc w:val="center"/>
       </w:pPr>
       <w:r>
+        <w:rPr>
+          <w:rFonts w:ascii="Calibri" w:hAnsi="Calibri"/>
+          <w:b/>
+          <w:color w:val="1B365D"/>
+          <w:sz w:val="44"/>
+        </w:rPr>
         <w:t>DOCUMENTAÇÃO DO SISTEMA PLANOS LUAN</w:t>
       </w:r>
     </w:p>
@@ -17,657 +22,60 @@
       </w:pPr>
       <w:r>
         <w:rPr>
-          <w:b/>
-          <w:sz w:val="24"/>
+          <w:rFonts w:ascii="Calibri" w:hAnsi="Calibri"/>
+          <w:i/>
+          <w:color w:val="5C768D"/>
+          <w:sz w:val="22"/>
         </w:rPr>
-        <w:t>Versão 1.2.14 | Atualizado em 30/08/2026</w:t>
-      </w:r>
-    </w:p>
-    <w:p/>
-    <w:p>
-      <w:pPr>
-        <w:pStyle w:val="Heading1"/>
-      </w:pPr>
-      <w:r>
-        <w:t>1. INTRODUÇÃO</w:t>
-      </w:r>
-    </w:p>
-    <w:p>
-      <w:r>
-        <w:t>Este documento descreve a arquitetura completa, o funcionamento interno e as regras de negócio do sistema Planos Luan — uma aplicação Python/Streamlit para geração automatizada de planos mensais de aula em formato Word (.docx).</w:t>
-      </w:r>
-    </w:p>
-    <w:p>
-      <w:r>
-        <w:t>O sistema foi projetado para atender professores de diversas disciplinas e modalidades (regular, EJA, CDP), oferecendo dois caminhos de geração: um motor local baseado em regras pedagógicas codificadas, e integração com Inteligência Artificial (OpenAI GPT-4o-mini e Google Gemini 2.5 Flash) para geração assistida.</w:t>
+        <w:t>Manual de Arquitetura, Funcionalidades e Regras de Negócio | v1.2.14 | Atualizado em 23/09/2026</w:t>
       </w:r>
     </w:p>
     <w:p>
       <w:pPr>
-        <w:pStyle w:val="Heading1"/>
+        <w:spacing w:after="240"/>
+      </w:pPr>
+    </w:p>
+    <w:p>
+      <w:pPr>
+        <w:keepNext/>
+        <w:spacing w:before="280" w:after="120"/>
       </w:pPr>
       <w:r>
-        <w:t>2. COMO O SISTEMA FUNCIONA (VISÃO DO USUÁRIO)</w:t>
+        <w:rPr>
+          <w:rFonts w:ascii="Calibri" w:hAnsi="Calibri"/>
+          <w:b/>
+          <w:color w:val="1B365D"/>
+          <w:sz w:val="30"/>
+        </w:rPr>
+        <w:t>1. INTRODUÇÃO E VISÃO GERAL</w:t>
       </w:r>
     </w:p>
     <w:p>
       <w:pPr>
-        <w:pStyle w:val="Heading2"/>
+        <w:spacing w:after="120" w:line="276" w:lineRule="auto"/>
       </w:pPr>
       <w:r>
-        <w:t>2.1 Preparação</w:t>
-      </w:r>
-    </w:p>
-    <w:p>
-      <w:r>
-        <w:t>1) O professor (ou o administrador) abre o sistema pelo navegador web em localhost.</w:t>
-        <w:br/>
-        <w:t>2) Na aba "Cadastro", registra o professor, suas turmas, disciplinas, dias da semana, horários e qual modelo de documento Word usar.</w:t>
-        <w:br/>
-        <w:t>3) Na aba desejada (Planos gerais, CDP ou EJA), seleciona o professor, a turma, a disciplina, o bimestre e o mês.</w:t>
+        <w:rPr>
+          <w:rFonts w:ascii="Calibri" w:hAnsi="Calibri"/>
+          <w:color w:val="333333"/>
+          <w:sz w:val="21"/>
+        </w:rPr>
+        <w:t>O Planos Luan é uma solução completa em Python e Streamlit projetada para gerar planos mensais de aula padronizados em formato Microsoft Word (.docx). O sistema combina leitura inteligente de materiais pedagógicos em PDF/PPTX, motores de regras determinísticas, integração opcional com IA generativa (OpenAI GPT-4o-mini e Google Gemini 2.5 Flash), validação pedagógica estrita e preenchimento de templates Word em conformidade com as diretrizes da SEDUC-SP.</w:t>
       </w:r>
     </w:p>
     <w:p>
       <w:pPr>
-        <w:pStyle w:val="Heading2"/>
-      </w:pPr>
-      <w:r>
-        <w:t>2.2 Geração do Plano</w:t>
-      </w:r>
-    </w:p>
-    <w:p>
-      <w:r>
-        <w:t>4) O sistema monta o calendário do mês selecionado, contando apenas os dias em que aquela turma tem aula, descontando feriados.</w:t>
-        <w:br/>
-        <w:t>5) O professor faz upload dos PDFs de aula ou o sistema localiza automaticamente na pasta PDF_AULAS a pasta correspondente à disciplina, bimestre e turma.</w:t>
-        <w:br/>
-        <w:t>6) Para cada PDF, o sistema extrai o texto, identifica o título da aula, o conceito/conteúdo, a habilidade BNCC, e classifica o tipo de aula.</w:t>
-        <w:br/>
-        <w:t>7) Com base nessas informações, gera a metodologia (localmente por regras ou via IA), o acompanhamento da aprendizagem (3 itens) e as adaptações de acessibilidade (3 itens).</w:t>
-        <w:br/>
-        <w:t>8) O sistema revisa cada aula com um confidence score de 0 a 100, verificando a qualidade da metodologia gerada.</w:t>
-        <w:br/>
-        <w:t>9) Uma tela de revisão permite ao professor visualizar e editar cada campo antes da finalização.</w:t>
-        <w:br/>
-        <w:t>10) O documento Word é gerado, preenchendo o modelo padronizado com todas as informações.</w:t>
-      </w:r>
-    </w:p>
-    <w:p>
-      <w:pPr>
-        <w:pStyle w:val="Heading2"/>
-      </w:pPr>
-      <w:r>
-        <w:t>2.3 Resultado</w:t>
-      </w:r>
-    </w:p>
-    <w:p>
-      <w:r>
-        <w:t>11) O plano é salvo como arquivo .docx na pasta de planos finalizados.</w:t>
-        <w:br/>
-        <w:t>12) Um registro é gravado no histórico do banco de dados com metadados completos.</w:t>
-        <w:br/>
-        <w:t>13) O professor pode baixar o arquivo diretamente pela interface ou consultá-lo depois na aba Histórico.</w:t>
-      </w:r>
-    </w:p>
-    <w:p/>
-    <w:p>
-      <w:pPr>
-        <w:pStyle w:val="Heading1"/>
-      </w:pPr>
-      <w:r>
-        <w:t>3. MÓDULOS PRINCIPAIS — DESCRIÇÃO DETALHADA</w:t>
-      </w:r>
-    </w:p>
-    <w:p>
-      <w:pPr>
-        <w:pStyle w:val="Heading2"/>
-      </w:pPr>
-      <w:r>
-        <w:t>3.1 planos_luan_app.py (Interface Principal)</w:t>
-      </w:r>
-    </w:p>
-    <w:p>
-      <w:r>
-        <w:t>Arquivo: ~170KB, ~4.500 linhas. É o ponto de entrada do Streamlit. Gerencia o estado da sessão (st.session_state), renderiza as abas da interface, trata uploads de PDF, controla o calendário mensal, orquestra a geração e exibe a tela de revisão. Importa componentes modulares de ui/ (shared.py, cadastro.py, historico.py, etc.) e delega a lógica de negócio para os módulos de core/.</w:t>
-      </w:r>
-    </w:p>
-    <w:p>
-      <w:r>
-        <w:t>Funcionalidades: seleção de professor/disciplina/turma com filtro, montagem dinâmica do calendário com feriados, upload de múltiplos PDFs, associação PDF↔dia, opção de geração com ou sem IA, tela de revisão editável por aula, download do DOCX final, botão "Limpar dados da tela", e integração com o histórico para detecção da última aula gerada.</w:t>
-      </w:r>
-    </w:p>
-    <w:p>
-      <w:pPr>
-        <w:pStyle w:val="Heading2"/>
-      </w:pPr>
-      <w:r>
-        <w:t>3.2 core/lote.py (Orquestrador Principal)</w:t>
-      </w:r>
-    </w:p>
-    <w:p>
-      <w:r>
-        <w:t>Arquivo: ~141KB, ~3.800 linhas. É o maior módulo do sistema e atua como orquestrador central da geração de planos. Recebe os PDFs, os dados do professor/turma, e coordena a extração, classificação, geração de metodologia, enriquecimento com acompanhamento e acessibilidade, e a montagem final do plano. Contém lógica específica para diversas disciplinas (Matemática, Biologia, Ciências, etc.) o que o torna o principal candidato para refatoração e decomposição.</w:t>
-      </w:r>
-    </w:p>
-    <w:p>
-      <w:r>
-        <w:t>Funções-chave: processar_planos_lote() (entrada principal), _processar_aula_individual(), _enriquecer_com_planilha(), _aplicar_metodologia_por_perfil(), e wrappers de chamada para os módulos especializados.</w:t>
-      </w:r>
-    </w:p>
-    <w:p>
-      <w:pPr>
-        <w:pStyle w:val="Heading2"/>
-      </w:pPr>
-      <w:r>
-        <w:t>3.3 core/resultados_aula.py (Montagem de Aula)</w:t>
-      </w:r>
-    </w:p>
-    <w:p>
-      <w:r>
-        <w:t>Arquivo: ~58KB, ~1.600 linhas. Responsável por montar o resultado final de cada aula individual, integrando o conteúdo extraído do PDF com a metodologia gerada, o acompanhamento, a acessibilidade e os metadados. Função principal: montar_resultado_aula_local() — recebe o contexto do PDF, o perfil disciplinar, e opcionalmente um DOCX de referência, e retorna um dicionário estruturado com todos os campos necessários para preencher o documento Word.</w:t>
-      </w:r>
-    </w:p>
-    <w:p>
-      <w:r>
-        <w:t>Este módulo implementa a lógica de prioridade entre fontes: se existe DOCX de referência com metodologia estruturada, ele é priorizado; caso contrário, o motor local gera a metodologia. Para EJA e CDP, há regras específicas de formatação e linguagem.</w:t>
-      </w:r>
-    </w:p>
-    <w:p>
-      <w:pPr>
-        <w:pStyle w:val="Heading2"/>
-      </w:pPr>
-      <w:r>
-        <w:t>3.4 core/ia.py (Integração com IA)</w:t>
-      </w:r>
-    </w:p>
-    <w:p>
-      <w:r>
-        <w:t>Arquivo: ~55KB, ~1.400 linhas. Gerencia a integração com a API da OpenAI (GPT-4o-mini) e do Google Gemini (2.5 Flash). Define o modelo Pydantic PlanoAulaIA com EtapaMetodologia para estruturar a resposta da IA. Monta prompts especializados por disciplina usando core/prompts_por_disciplina.py. Implementa retry automático via tenacity em caso de falha na API. Função pública: processar_plano_ia() — recebe o texto do PDF e os parâmetros do plano, e retorna um PlanoAulaIA estruturado.</w:t>
-      </w:r>
-    </w:p>
-    <w:p>
-      <w:pPr>
-        <w:pStyle w:val="Heading2"/>
-      </w:pPr>
-      <w:r>
-        <w:t>3.5 core/database.py (Banco de Dados)</w:t>
-      </w:r>
-    </w:p>
-    <w:p>
-      <w:r>
-        <w:t>Arquivo: ~85KB, ~2.400 linhas. Centraliza todo acesso ao SQLite com conexão gerenciada (connection_scope/get_connection), PRAGMAs WAL e foreign_keys=ON, timeout configurável e migrações idempotentes. Funções de CRUD para professores, vínculos professor-turma, histórico de planos, e configurações do sistema. Política de retenção implementada: ao salvar um novo plano, registros antigos além do limite são automaticamente removidos.</w:t>
-      </w:r>
-    </w:p>
-    <w:p>
-      <w:r>
-        <w:t>Funções principais: salvar_professor(), salvar_vinculo_turma(), listar_professores(), listar_vinculos_professor(), salvar_historico_plano(), listar_historico_planos(), buscar_historico_planos_avancado(), obter_arquivo_historico(), obter_ultimo_historico_por_contexto().</w:t>
-      </w:r>
-    </w:p>
-    <w:p>
-      <w:pPr>
-        <w:pStyle w:val="Heading2"/>
-      </w:pPr>
-      <w:r>
-        <w:t>3.6 core/models.py (Modelos de Dados)</w:t>
-      </w:r>
-    </w:p>
-    <w:p>
-      <w:r>
-        <w:t>Arquivo: ~16KB, ~450 linhas. Define os modelos Pydantic centrais do sistema, compatíveis com Pydantic v1 e v2. Classes principais:</w:t>
-      </w:r>
-    </w:p>
-    <w:p>
-      <w:pPr>
-        <w:pStyle w:val="ListBullet"/>
-      </w:pPr>
-      <w:r>
-        <w:t>EtapaMetodologia: modelo com "titulo" e "texto" representando uma etapa da metodologia.</w:t>
-      </w:r>
-    </w:p>
-    <w:p>
-      <w:pPr>
-        <w:pStyle w:val="ListBullet"/>
-      </w:pPr>
-      <w:r>
-        <w:t>PlanoCompleto: modelo principal com todos os campos de um plano de aula (tema, habilidade, metodologia, acompanhamento, acessibilidade, confidence_score, diagnostico_geracao, etc.).</w:t>
-      </w:r>
-    </w:p>
-    <w:p>
-      <w:pPr>
-        <w:pStyle w:val="ListBullet"/>
-      </w:pPr>
-      <w:r>
-        <w:t>PlanoCompleto.from_any(dados): método de classe que converte dicionários ou entradas heterogêneas em instâncias validadas.</w:t>
-      </w:r>
-    </w:p>
-    <w:p>
-      <w:pPr>
-        <w:pStyle w:val="ListBullet"/>
-      </w:pPr>
-      <w:r>
-        <w:t>PlanoCompleto.to_dict(): serializa o plano para dicionário.</w:t>
-      </w:r>
-    </w:p>
-    <w:p>
-      <w:pPr>
-        <w:pStyle w:val="Heading2"/>
-      </w:pPr>
-      <w:r>
-        <w:t>3.7 core/revisao_final.py (Revisão e Score)</w:t>
-      </w:r>
-    </w:p>
-    <w:p>
-      <w:r>
-        <w:t>Arquivo: ~14KB, ~365 linhas. Versão do gerador: 1.2.14. Implementa o confidence_score: cada aula começa com 100 pontos e recebe penalizações por critérios específicos (desenvolvimento curto, etapas faltantes, baixa aderência ao PDF, palavras-chave não encontradas, etc.). O score mínimo aceitável é 70. A regeneração seletiva (tentar novamente as etapas problemáticas) está implementada apenas para o perfil de História.</w:t>
-      </w:r>
-    </w:p>
-    <w:p>
-      <w:pPr>
-        <w:pStyle w:val="Heading2"/>
-      </w:pPr>
-      <w:r>
-        <w:t>3.8 core/validador_plano.py (Validação)</w:t>
-      </w:r>
-    </w:p>
-    <w:p>
-      <w:r>
-        <w:t>Arquivo: ~28KB, ~700 linhas. Valida a estrutura e o conteúdo de cada aula antes da geração do documento Word: presença de campos obrigatórios, quantidade de etapas da metodologia, tamanho mínimo do texto, aderência ao conteúdo do PDF (usando rapidfuzz para matching fuzzy), e conformidade com regras CDP e EJA. Funções principais: validar_aulas_geradas(), validar_aula_final(), calcular_aderencia_pdf().</w:t>
-      </w:r>
-    </w:p>
-    <w:p>
-      <w:pPr>
-        <w:pStyle w:val="Heading2"/>
-      </w:pPr>
-      <w:r>
-        <w:t>3.9 core/helpers.py (Resolução de Pastas)</w:t>
-      </w:r>
-    </w:p>
-    <w:p>
-      <w:r>
-        <w:t>Arquivo: ~26KB, ~700 linhas. Centraliza a resolução de caminhos para PDFs pedagógicos: aliases de nomes de disciplinas, normalização de nomes de pasta, resolução de rotas EJA (BIOLOGIA/EJA_BIOLOGIA, LINGUA_INGLESA/EJA_EM, LIDERANCA_E_ORATORIA/EJA_EM), e regras especiais como Biologia EJA 2º e 3º Termo compartilhando a pasta 2_TERMO do 3º bimestre. Funções-chave: resolver_pasta_pdf(), resolver_pasta_eja(), aliases de disciplinas.</w:t>
-      </w:r>
-    </w:p>
-    <w:p>
-      <w:pPr>
-        <w:pStyle w:val="Heading2"/>
-      </w:pPr>
-      <w:r>
-        <w:t>3.10 core/qualidade_metodologica.py (Sanitização)</w:t>
-      </w:r>
-    </w:p>
-    <w:p>
-      <w:r>
-        <w:t>Arquivo: ~60KB, ~1.500 linhas. Responsável pela qualidade textual da metodologia gerada. Contém: corrigir_mojibake() — corrige problemas de encoding em textos extraídos; limitar_texto_natural() — trunca texto respeitando limites sem cortar palavras; obter_limite_caracteres_etapa() — retorna 300 (regular) ou 350 (EJA/DOCX); consolidar_quatro_etapas() — normaliza metodologias para as 4 etapas canônicas; sanitizar_texto_metodologico() — remove padrões problemáticos; sanitizar_texto_cdp_estrito() — sanitização especial para CDP.</w:t>
-      </w:r>
-    </w:p>
-    <w:p/>
-    <w:p>
-      <w:pPr>
-        <w:pStyle w:val="Heading1"/>
-      </w:pPr>
-      <w:r>
-        <w:t>4. BIBLIOTECA CORE/LIB — COMPONENTES ESPECIALIZADOS</w:t>
-      </w:r>
-    </w:p>
-    <w:p>
-      <w:pPr>
-        <w:pStyle w:val="Heading2"/>
-      </w:pPr>
-      <w:r>
-        <w:t>4.1 extrator_pdf.py (Extração de Texto)</w:t>
-      </w:r>
-    </w:p>
-    <w:p>
-      <w:r>
-        <w:t>Arquivo: ~28KB, ~793 linhas. Responsável pela extração de texto de arquivos PDF. Pipeline de 3 camadas: 1) pdf2docx (desabilitado por padrão via flag HABILITAR_PDF2DOCX); 2) pdfplumber (camada principal); 3) OCR via Tesseract (fallback para PDFs baseados em imagem). Também extrai campos estruturados: habilidade BNCC, conceito, atividade prática, conteúdo das seções "Foco no conteúdo" e "Na prática".</w:t>
-      </w:r>
-    </w:p>
-    <w:p>
-      <w:r>
-        <w:t>Classe ExtratorPDF: recebe o texto bruto e extrai campos semânticos via regex e heurísticas. Classe PDFImagemSemOCR: exceção para PDFs sem camada de texto. Função principal: extrair_texto_pdf(caminho_pdf, limite_chars).</w:t>
-      </w:r>
-    </w:p>
-    <w:p>
-      <w:pPr>
-        <w:pStyle w:val="Heading2"/>
-      </w:pPr>
-      <w:r>
-        <w:t>4.2 classificador.py (Classificação de Perfil e Tipo)</w:t>
-      </w:r>
-    </w:p>
-    <w:p>
-      <w:r>
-        <w:t>Arquivo: ~55KB, ~1.500 linhas. Classifica cada aula em: perfil disciplinar (18+ perfis), tipo de aula (expositiva, prática, investigativa, debate, leitura, produção textual, etc.) e recursos pedagógicos detectados (vídeo, quadro, caderno, etc.). Função normalizar_texto() é a função canônica de normalização do sistema todo. A classificação é baseada em heurísticas de palavras-chave com pesos e prioridades.</w:t>
-      </w:r>
-    </w:p>
-    <w:p>
-      <w:pPr>
-        <w:pStyle w:val="Heading2"/>
-      </w:pPr>
-      <w:r>
-        <w:t>4.3 metodologia.py (Motor de Metodologia Local)</w:t>
-      </w:r>
-    </w:p>
-    <w:p>
-      <w:r>
-        <w:t>Arquivo: ~111KB, ~3.000 linhas. É o motor principal de geração de metodologia sem IA. Contém a classe MotorMetodologico com o método gerar() que recebe perfil, tipo, conceito, tema e recursos, e retorna a metodologia como list[dict]. Internamente, despacha para funções especializadas por perfil: _metodologia_arte(), _metodologia_matematica(), _metodologia_portugues_ef(), _metodologia_historia(), etc. Cada perfil tem suas etapas, verbos de ação e técnicas pedagógicas específicas.</w:t>
-      </w:r>
-    </w:p>
-    <w:p>
-      <w:r>
-        <w:t>A variação entre aulas é determinística (não aleatória) usando hash de índice para evitar repetição em planos com múltiplas aulas do mesmo perfil.</w:t>
-      </w:r>
-    </w:p>
-    <w:p>
-      <w:pPr>
-        <w:pStyle w:val="Heading2"/>
-      </w:pPr>
-      <w:r>
-        <w:t>4.4 acompanhamento.py (Acompanhamento da Aprendizagem)</w:t>
-      </w:r>
-    </w:p>
-    <w:p>
-      <w:r>
-        <w:t>Arquivo: ~32KB, ~900 linhas. Gera exatamente 3 itens de acompanhamento da aprendizagem para cada aula, contextualizados pelo perfil disciplinar e pelo conteúdo específico da aula. Os itens são frases de observação e verificação da aprendizagem do aluno.</w:t>
-      </w:r>
-    </w:p>
-    <w:p>
-      <w:pPr>
-        <w:pStyle w:val="Heading2"/>
-      </w:pPr>
-      <w:r>
-        <w:t>4.5 acessibilidade.py (Adaptações de Acessibilidade)</w:t>
-      </w:r>
-    </w:p>
-    <w:p>
-      <w:r>
-        <w:t>Arquivo: ~24KB, ~700 linhas. Gera exatamente 3 itens de adaptação de acessibilidade para cada aula, considerando o perfil disciplinar. Os itens cobrem estratégias de inclusão como leitura guiada, material ampliado, uso de palavras-chave, resposta oral mediada, etc.</w:t>
-      </w:r>
-    </w:p>
-    <w:p>
-      <w:pPr>
-        <w:pStyle w:val="Heading2"/>
-      </w:pPr>
-      <w:r>
-        <w:t>4.6 higienizador_pedagogico.py (Limpeza de Texto)</w:t>
-      </w:r>
-    </w:p>
-    <w:p>
-      <w:r>
-        <w:t>Arquivo: ~50KB, ~1.400 linhas. Aplica regras de substituição regex contextualizadas por perfil disciplinar. Remove termos inadequados, corrige linguagem, garante que terminologia jornalística seja preservada em aulas de notícia/reportagem, e aplica o fallback correto (geral_nao_jornalistica em vez de literatura). As regras de substituição são pré-compiladas no nível do módulo para performance.</w:t>
-      </w:r>
-    </w:p>
-    <w:p>
-      <w:pPr>
-        <w:pStyle w:val="Heading2"/>
-      </w:pPr>
-      <w:r>
-        <w:t>4.7 tecnicas.py (Banco de Técnicas LEMOV)</w:t>
-      </w:r>
-    </w:p>
-    <w:p>
-      <w:r>
-        <w:t>Arquivo: ~11KB, ~300 linhas. Banco de técnicas pedagógicas baseadas no método LEMOV. Técnicas disponíveis: VIREM E CONVERSEM, TODO MUNDO ESCREVE, COM SUAS PALAVRAS, HORA DA LEITURA, DE OLHO NO MODELO, PAUSE E RESPONDA, UM PASSO DE CADA VEZ. As técnicas são selecionadas de acordo com o perfil e tipo de aula.</w:t>
-      </w:r>
-    </w:p>
-    <w:p>
-      <w:pPr>
-        <w:pStyle w:val="Heading2"/>
-      </w:pPr>
-      <w:r>
-        <w:t>4.8 progressao.py (Variação Determinística)</w:t>
-      </w:r>
-    </w:p>
-    <w:p>
-      <w:r>
-        <w:t>Arquivo: ~10KB, ~280 linhas. Garante variação nas frases da metodologia entre aulas de um mesmo plano sem usar aleatoriedade. Usa a função _indice_hash() baseada em hash MD5 dos parâmetros (disciplina, tema, índice da aula) para selecionar deterministicamente entre as opções disponíveis.</w:t>
-      </w:r>
-    </w:p>
-    <w:p>
-      <w:pPr>
-        <w:pStyle w:val="Heading2"/>
-      </w:pPr>
-      <w:r>
-        <w:t>4.9 gerador_colunas_pedagogicas.py (Geração Integrada)</w:t>
-      </w:r>
-    </w:p>
-    <w:p>
-      <w:r>
-        <w:t>Arquivo: ~34KB, ~900 linhas. Módulo de geração integrada de todas as colunas pedagógicas (metodologia, acompanhamento, acessibilidade) em uma chamada unificada, garantindo coerência entre os três componentes para cada aula.</w:t>
-      </w:r>
-    </w:p>
-    <w:p/>
-    <w:p>
-      <w:pPr>
-        <w:pStyle w:val="Heading1"/>
-      </w:pPr>
-      <w:r>
-        <w:t>5. GERAÇÃO DE DOCUMENTOS WORD</w:t>
-      </w:r>
-    </w:p>
-    <w:p>
-      <w:pPr>
-        <w:pStyle w:val="Heading2"/>
-      </w:pPr>
-      <w:r>
-        <w:t>5.1 docx_generator/preencher.py (Template Regular)</w:t>
-      </w:r>
-    </w:p>
-    <w:p>
-      <w:r>
-        <w:t>Arquivo: ~47KB, ~1.300 linhas. Preenche os modelos Word padronizados (MODELOEGLE.docx, MODELOPADRE.docx) com os dados gerados. Lida com tabelas mescladas, células com gridSpan, formatação de fontes, quebras de linha e preservação da ordem cronológica das aulas. Gera automaticamente linhas para cada aula no modelo, preenchendo: data, horário, tema/habilidade, metodologia (com títulos em negrito), acompanhamento da aprendizagem (3 itens) e acessibilidade (3 itens).</w:t>
-      </w:r>
-    </w:p>
-    <w:p>
-      <w:r>
-        <w:t>Funcionalidades especiais: detecção automática de tamanho de fonte (grande, médio, pequeno) com base no volume de texto; formatação inline de títulos de etapas; tratamento de Educação Financeira com layout compacto; suporte a "bloco_sem_pdf" para dias sem material.</w:t>
-      </w:r>
-    </w:p>
-    <w:p>
-      <w:pPr>
-        <w:pStyle w:val="Heading2"/>
-      </w:pPr>
-      <w:r>
-        <w:t>5.2 docx_generator/preencher_cdp.py (Template CDP/EJA)</w:t>
-      </w:r>
-    </w:p>
-    <w:p>
-      <w:r>
-        <w:t>Arquivo: ~13KB, ~350 linhas. Preenche o modelo específico para CDP e EJA. Aplica sanitização estrita de texto CDP (sem menção a tecnologia, grupos, internet). Layout adaptado para a realidade do ambiente de detenção provisória.</w:t>
-      </w:r>
-    </w:p>
-    <w:p/>
-    <w:p>
-      <w:pPr>
-        <w:pStyle w:val="Heading1"/>
-      </w:pPr>
-      <w:r>
-        <w:t>6. MÓDULOS DE REFERÊNCIA METODOLÓGICA</w:t>
-      </w:r>
-    </w:p>
-    <w:p>
-      <w:r>
-        <w:t>O sistema possui uma camada de referências metodológicas especializadas por disciplina, localizadas em core/referencias_*.py (14 módulos). Cada módulo fornece textos de referência, padrões pedagógicos e vocabulário específico para enriquecer a metodologia gerada. Os módulos são:</w:t>
-      </w:r>
-    </w:p>
-    <w:p>
-      <w:pPr>
-        <w:pStyle w:val="ListBullet"/>
-      </w:pPr>
-      <w:r>
-        <w:t>referencias_arte.py: Arte — referências visuais e criativas</w:t>
-      </w:r>
-    </w:p>
-    <w:p>
-      <w:pPr>
-        <w:pStyle w:val="ListBullet"/>
-      </w:pPr>
-      <w:r>
-        <w:t>referencias_biologia.py: Biologia — experimentação e observação</w:t>
-      </w:r>
-    </w:p>
-    <w:p>
-      <w:pPr>
-        <w:pStyle w:val="ListBullet"/>
-      </w:pPr>
-      <w:r>
-        <w:t>referencias_ciencias.py: Ciências — método científico</w:t>
-      </w:r>
-    </w:p>
-    <w:p>
-      <w:pPr>
-        <w:pStyle w:val="ListBullet"/>
-      </w:pPr>
-      <w:r>
-        <w:t>referencias_educacao_financeira.py: Educação Financeira — cenários econômicos</w:t>
-      </w:r>
-    </w:p>
-    <w:p>
-      <w:pPr>
-        <w:pStyle w:val="ListBullet"/>
-      </w:pPr>
-      <w:r>
-        <w:t>referencias_fisica.py: Física — demonstrações e cálculos</w:t>
-      </w:r>
-    </w:p>
-    <w:p>
-      <w:pPr>
-        <w:pStyle w:val="ListBullet"/>
-      </w:pPr>
-      <w:r>
-        <w:t>referencias_geografia.py: Geografia — cartografia e espaço</w:t>
-      </w:r>
-    </w:p>
-    <w:p>
-      <w:pPr>
-        <w:pStyle w:val="ListBullet"/>
-      </w:pPr>
-      <w:r>
-        <w:t>referencias_historia.py: História — fontes históricas e contexto</w:t>
-      </w:r>
-    </w:p>
-    <w:p>
-      <w:pPr>
-        <w:pStyle w:val="ListBullet"/>
-      </w:pPr>
-      <w:r>
-        <w:t>referencias_lideranca_oratoria.py: Liderança e Oratória — dinâmicas de comunicação</w:t>
-      </w:r>
-    </w:p>
-    <w:p>
-      <w:pPr>
-        <w:pStyle w:val="ListBullet"/>
-      </w:pPr>
-      <w:r>
-        <w:t>referencias_lingua_inglesa.py: Inglês — uso funcional do idioma</w:t>
-      </w:r>
-    </w:p>
-    <w:p>
-      <w:pPr>
-        <w:pStyle w:val="ListBullet"/>
-      </w:pPr>
-      <w:r>
-        <w:t>referencias_matematica.py: Matemática — resolução de problemas</w:t>
-      </w:r>
-    </w:p>
-    <w:p>
-      <w:pPr>
-        <w:pStyle w:val="ListBullet"/>
-      </w:pPr>
-      <w:r>
-        <w:t>referencias_orientacao_estudos.py: Orientação de Estudos — missões e metas</w:t>
-      </w:r>
-    </w:p>
-    <w:p>
-      <w:pPr>
-        <w:pStyle w:val="ListBullet"/>
-      </w:pPr>
-      <w:r>
-        <w:t>referencias_portugues.py: Português — leitura e produção textual</w:t>
-      </w:r>
-    </w:p>
-    <w:p>
-      <w:pPr>
-        <w:pStyle w:val="ListBullet"/>
-      </w:pPr>
-      <w:r>
-        <w:t>referencias_projeto_vida.py: Projeto de Vida — autoconhecimento</w:t>
-      </w:r>
-    </w:p>
-    <w:p>
-      <w:pPr>
-        <w:pStyle w:val="ListBullet"/>
-      </w:pPr>
-      <w:r>
-        <w:t>referencias_cdp_contextual.py: CDP Contextual — adaptações para privação de liberdade</w:t>
-      </w:r>
-    </w:p>
-    <w:p/>
-    <w:p>
-      <w:pPr>
-        <w:pStyle w:val="Heading1"/>
-      </w:pPr>
-      <w:r>
-        <w:t>7. DOCX DE REFERÊNCIA PEDAGÓGICA</w:t>
-      </w:r>
-    </w:p>
-    <w:p>
-      <w:r>
-        <w:t>Nos planos regulares, o sistema busca automaticamente um arquivo .docx de referência na mesma árvore de pastas dos PDFs. Este arquivo fornece a metodologia, o acompanhamento da aprendizagem e a acessibilidade para cada aula, no seguinte formato:</w:t>
-      </w:r>
-    </w:p>
-    <w:p>
-      <w:pPr>
-        <w:ind w:left="567"/>
+        <w:keepNext/>
+        <w:spacing w:before="280" w:after="120"/>
       </w:pPr>
       <w:r>
         <w:rPr>
-          <w:rFonts w:ascii="Consolas" w:hAnsi="Consolas"/>
-          <w:color w:val="1E1E1E"/>
-          <w:sz w:val="18"/>
+          <w:rFonts w:ascii="Calibri" w:hAnsi="Calibri"/>
+          <w:b/>
+          <w:color w:val="1B365D"/>
+          <w:sz w:val="30"/>
         </w:rPr>
-        <w:t>AULA 1 — Título da aula</w:t>
-        <w:br/>
-        <w:t>HABILIDADE: Texto da habilidade</w:t>
-        <w:br/>
-        <w:br/>
-        <w:t>METODOLOGIA</w:t>
-        <w:br/>
-        <w:t>Para começar: ...</w:t>
-        <w:br/>
-        <w:t>Foco no conteúdo: ...</w:t>
-        <w:br/>
-        <w:br/>
-        <w:t>ACOMPANHAMENTO DA APRENDIZAGEM</w:t>
-        <w:br/>
-        <w:t>Item 1</w:t>
-        <w:br/>
-        <w:t>Item 2</w:t>
-        <w:br/>
-        <w:t>Item 3</w:t>
-        <w:br/>
-        <w:br/>
-        <w:t>ACESSIBILIDADE</w:t>
-        <w:br/>
-        <w:t>Item 1</w:t>
-        <w:br/>
-        <w:t>Item 2</w:t>
-        <w:br/>
-        <w:t>Item 3</w:t>
-      </w:r>
-    </w:p>
-    <w:p>
-      <w:r>
-        <w:t>A correspondência é feita pelo número da aula. Quando o DOCX de referência é encontrado e contém dados válidos, ele tem prioridade sobre a geração local. Se alguma etapa está ausente ou ultrapassa 350 caracteres, o sistema informa ao usuário com mensagem específica (nome do DOCX, número da aula, correção necessária).</w:t>
-      </w:r>
-    </w:p>
-    <w:p/>
-    <w:p>
-      <w:pPr>
-        <w:pStyle w:val="Heading1"/>
-      </w:pPr>
-      <w:r>
-        <w:t>8. INTERFACE MODULAR (UI)</w:t>
+        <w:t>2. MODALIDADES E ABAS DA INTERFACE</w:t>
       </w:r>
     </w:p>
     <w:tbl>
@@ -678,50 +86,89 @@
         <w:tblLook w:firstColumn="1" w:firstRow="1" w:lastColumn="0" w:lastRow="0" w:noHBand="0" w:noVBand="1" w:val="04A0"/>
       </w:tblPr>
       <w:tblGrid>
-        <w:gridCol w:w="2880"/>
-        <w:gridCol w:w="2880"/>
-        <w:gridCol w:w="2880"/>
+        <w:gridCol w:w="3312"/>
+        <w:gridCol w:w="3312"/>
+        <w:gridCol w:w="3312"/>
       </w:tblGrid>
       <w:tr>
         <w:tc>
           <w:tcPr>
-            <w:tcW w:type="dxa" w:w="2880"/>
+            <w:tcW w:type="dxa" w:w="2160"/>
+            <w:shd w:fill="1B365D"/>
+            <w:tcMar>
+              <w:top w:w="120" w:type="dxa"/>
+              <w:bottom w:w="120" w:type="dxa"/>
+              <w:left w:w="140" w:type="dxa"/>
+              <w:right w:w="140" w:type="dxa"/>
+            </w:tcMar>
           </w:tcPr>
           <w:p>
+            <w:pPr>
+              <w:spacing w:after="0"/>
+              <w:jc w:val="left"/>
+            </w:pPr>
             <w:r>
               <w:rPr>
+                <w:rFonts w:ascii="Calibri" w:hAnsi="Calibri"/>
                 <w:b/>
+                <w:color w:val="FFFFFF"/>
                 <w:sz w:val="20"/>
               </w:rPr>
-              <w:t>Arquivo</w:t>
+              <w:t>Aba / Modo</w:t>
             </w:r>
           </w:p>
         </w:tc>
         <w:tc>
           <w:tcPr>
-            <w:tcW w:type="dxa" w:w="2880"/>
+            <w:tcW w:type="dxa" w:w="3600"/>
+            <w:shd w:fill="1B365D"/>
+            <w:tcMar>
+              <w:top w:w="120" w:type="dxa"/>
+              <w:bottom w:w="120" w:type="dxa"/>
+              <w:left w:w="140" w:type="dxa"/>
+              <w:right w:w="140" w:type="dxa"/>
+            </w:tcMar>
           </w:tcPr>
           <w:p>
+            <w:pPr>
+              <w:spacing w:after="0"/>
+              <w:jc w:val="left"/>
+            </w:pPr>
             <w:r>
               <w:rPr>
+                <w:rFonts w:ascii="Calibri" w:hAnsi="Calibri"/>
                 <w:b/>
+                <w:color w:val="FFFFFF"/>
                 <w:sz w:val="20"/>
               </w:rPr>
-              <w:t>Tamanho</w:t>
+              <w:t>Público-Alvo e Finalidade</w:t>
             </w:r>
           </w:p>
         </w:tc>
         <w:tc>
           <w:tcPr>
-            <w:tcW w:type="dxa" w:w="2880"/>
+            <w:tcW w:type="dxa" w:w="4320"/>
+            <w:shd w:fill="1B365D"/>
+            <w:tcMar>
+              <w:top w:w="120" w:type="dxa"/>
+              <w:bottom w:w="120" w:type="dxa"/>
+              <w:left w:w="140" w:type="dxa"/>
+              <w:right w:w="140" w:type="dxa"/>
+            </w:tcMar>
           </w:tcPr>
           <w:p>
+            <w:pPr>
+              <w:spacing w:after="0"/>
+              <w:jc w:val="left"/>
+            </w:pPr>
             <w:r>
               <w:rPr>
+                <w:rFonts w:ascii="Calibri" w:hAnsi="Calibri"/>
                 <w:b/>
+                <w:color w:val="FFFFFF"/>
                 <w:sz w:val="20"/>
               </w:rPr>
-              <w:t>Responsabilidade</w:t>
+              <w:t>Regras e Particularidades</w:t>
             </w:r>
           </w:p>
         </w:tc>
@@ -729,40 +176,76 @@
       <w:tr>
         <w:tc>
           <w:tcPr>
-            <w:tcW w:type="dxa" w:w="2880"/>
+            <w:tcW w:type="dxa" w:w="2160"/>
+            <w:shd w:fill="FFFFFF"/>
+            <w:tcMar>
+              <w:top w:w="90" w:type="dxa"/>
+              <w:bottom w:w="90" w:type="dxa"/>
+              <w:left w:w="140" w:type="dxa"/>
+              <w:right w:w="140" w:type="dxa"/>
+            </w:tcMar>
           </w:tcPr>
           <w:p>
+            <w:pPr>
+              <w:spacing w:after="0"/>
+            </w:pPr>
             <w:r>
               <w:rPr>
-                <w:sz w:val="20"/>
+                <w:rFonts w:ascii="Calibri" w:hAnsi="Calibri"/>
+                <w:color w:val="333333"/>
+                <w:sz w:val="19"/>
               </w:rPr>
-              <w:t>ui/shared.py</w:t>
+              <w:t>Planos Gerais</w:t>
             </w:r>
           </w:p>
         </w:tc>
         <w:tc>
           <w:tcPr>
-            <w:tcW w:type="dxa" w:w="2880"/>
+            <w:tcW w:type="dxa" w:w="3600"/>
+            <w:shd w:fill="FFFFFF"/>
+            <w:tcMar>
+              <w:top w:w="90" w:type="dxa"/>
+              <w:bottom w:w="90" w:type="dxa"/>
+              <w:left w:w="140" w:type="dxa"/>
+              <w:right w:w="140" w:type="dxa"/>
+            </w:tcMar>
           </w:tcPr>
           <w:p>
+            <w:pPr>
+              <w:spacing w:after="0"/>
+            </w:pPr>
             <w:r>
               <w:rPr>
-                <w:sz w:val="20"/>
+                <w:rFonts w:ascii="Calibri" w:hAnsi="Calibri"/>
+                <w:color w:val="333333"/>
+                <w:sz w:val="19"/>
               </w:rPr>
-              <w:t>~37KB</w:t>
+              <w:t>Aulas regulares de Ensino Fundamental e Médio</w:t>
             </w:r>
           </w:p>
         </w:tc>
         <w:tc>
           <w:tcPr>
-            <w:tcW w:type="dxa" w:w="2880"/>
+            <w:tcW w:type="dxa" w:w="4320"/>
+            <w:shd w:fill="FFFFFF"/>
+            <w:tcMar>
+              <w:top w:w="90" w:type="dxa"/>
+              <w:bottom w:w="90" w:type="dxa"/>
+              <w:left w:w="140" w:type="dxa"/>
+              <w:right w:w="140" w:type="dxa"/>
+            </w:tcMar>
           </w:tcPr>
           <w:p>
+            <w:pPr>
+              <w:spacing w:after="0"/>
+            </w:pPr>
             <w:r>
               <w:rPr>
-                <w:sz w:val="20"/>
+                <w:rFonts w:ascii="Calibri" w:hAnsi="Calibri"/>
+                <w:color w:val="333333"/>
+                <w:sz w:val="19"/>
               </w:rPr>
-              <w:t>Funções compartilhadas: seleção de professor/turma, carregamento de dados, filtros de disciplina, componentes reutilizáveis</w:t>
+              <w:t>Usa PDFs regulares ou DOCX de referência. Metodologia em 4 etapas (até 300 caracteres por etapa). Suporte a 1 dia sem PDF para Português.</w:t>
             </w:r>
           </w:p>
         </w:tc>
@@ -770,40 +253,76 @@
       <w:tr>
         <w:tc>
           <w:tcPr>
-            <w:tcW w:type="dxa" w:w="2880"/>
+            <w:tcW w:type="dxa" w:w="2160"/>
+            <w:shd w:fill="F9FBFD"/>
+            <w:tcMar>
+              <w:top w:w="90" w:type="dxa"/>
+              <w:bottom w:w="90" w:type="dxa"/>
+              <w:left w:w="140" w:type="dxa"/>
+              <w:right w:w="140" w:type="dxa"/>
+            </w:tcMar>
           </w:tcPr>
           <w:p>
+            <w:pPr>
+              <w:spacing w:after="0"/>
+            </w:pPr>
             <w:r>
               <w:rPr>
-                <w:sz w:val="20"/>
+                <w:rFonts w:ascii="Calibri" w:hAnsi="Calibri"/>
+                <w:color w:val="333333"/>
+                <w:sz w:val="19"/>
               </w:rPr>
-              <w:t>ui/cadastro.py</w:t>
+              <w:t>CDP - Ciclo I</w:t>
             </w:r>
           </w:p>
         </w:tc>
         <w:tc>
           <w:tcPr>
-            <w:tcW w:type="dxa" w:w="2880"/>
+            <w:tcW w:type="dxa" w:w="3600"/>
+            <w:shd w:fill="F9FBFD"/>
+            <w:tcMar>
+              <w:top w:w="90" w:type="dxa"/>
+              <w:bottom w:w="90" w:type="dxa"/>
+              <w:left w:w="140" w:type="dxa"/>
+              <w:right w:w="140" w:type="dxa"/>
+            </w:tcMar>
           </w:tcPr>
           <w:p>
+            <w:pPr>
+              <w:spacing w:after="0"/>
+            </w:pPr>
             <w:r>
               <w:rPr>
-                <w:sz w:val="20"/>
+                <w:rFonts w:ascii="Calibri" w:hAnsi="Calibri"/>
+                <w:color w:val="333333"/>
+                <w:sz w:val="19"/>
               </w:rPr>
-              <w:t>~33KB</w:t>
+              <w:t>Anos Iniciais / Alfabetização em privação de liberdade</w:t>
             </w:r>
           </w:p>
         </w:tc>
         <w:tc>
           <w:tcPr>
-            <w:tcW w:type="dxa" w:w="2880"/>
+            <w:tcW w:type="dxa" w:w="4320"/>
+            <w:shd w:fill="F9FBFD"/>
+            <w:tcMar>
+              <w:top w:w="90" w:type="dxa"/>
+              <w:bottom w:w="90" w:type="dxa"/>
+              <w:left w:w="140" w:type="dxa"/>
+              <w:right w:w="140" w:type="dxa"/>
+            </w:tcMar>
           </w:tcPr>
           <w:p>
+            <w:pPr>
+              <w:spacing w:after="0"/>
+            </w:pPr>
             <w:r>
               <w:rPr>
-                <w:sz w:val="20"/>
+                <w:rFonts w:ascii="Calibri" w:hAnsi="Calibri"/>
+                <w:color w:val="333333"/>
+                <w:sz w:val="19"/>
               </w:rPr>
-              <w:t>Tela completa de cadastro: CRUD de professores e vínculos, detecção de duplicatas, validação de campos, origem Banco/DOCX</w:t>
+              <w:t>Usa componentes curriculares específicos de Anos Iniciais (Turmas C e D). Sem exigência de PDFs externos.</w:t>
             </w:r>
           </w:p>
         </w:tc>
@@ -811,40 +330,76 @@
       <w:tr>
         <w:tc>
           <w:tcPr>
-            <w:tcW w:type="dxa" w:w="2880"/>
+            <w:tcW w:type="dxa" w:w="2160"/>
+            <w:shd w:fill="FFFFFF"/>
+            <w:tcMar>
+              <w:top w:w="90" w:type="dxa"/>
+              <w:bottom w:w="90" w:type="dxa"/>
+              <w:left w:w="140" w:type="dxa"/>
+              <w:right w:w="140" w:type="dxa"/>
+            </w:tcMar>
           </w:tcPr>
           <w:p>
+            <w:pPr>
+              <w:spacing w:after="0"/>
+            </w:pPr>
             <w:r>
               <w:rPr>
-                <w:sz w:val="20"/>
+                <w:rFonts w:ascii="Calibri" w:hAnsi="Calibri"/>
+                <w:color w:val="333333"/>
+                <w:sz w:val="19"/>
               </w:rPr>
-              <w:t>ui/geracao_lote.py</w:t>
+              <w:t>CDP</w:t>
             </w:r>
           </w:p>
         </w:tc>
         <w:tc>
           <w:tcPr>
-            <w:tcW w:type="dxa" w:w="2880"/>
+            <w:tcW w:type="dxa" w:w="3600"/>
+            <w:shd w:fill="FFFFFF"/>
+            <w:tcMar>
+              <w:top w:w="90" w:type="dxa"/>
+              <w:bottom w:w="90" w:type="dxa"/>
+              <w:left w:w="140" w:type="dxa"/>
+              <w:right w:w="140" w:type="dxa"/>
+            </w:tcMar>
           </w:tcPr>
           <w:p>
+            <w:pPr>
+              <w:spacing w:after="0"/>
+            </w:pPr>
             <w:r>
               <w:rPr>
-                <w:sz w:val="20"/>
+                <w:rFonts w:ascii="Calibri" w:hAnsi="Calibri"/>
+                <w:color w:val="333333"/>
+                <w:sz w:val="19"/>
               </w:rPr>
-              <w:t>~17KB</w:t>
+              <w:t>Ensino Fundamental e Médio em privação de liberdade</w:t>
             </w:r>
           </w:p>
         </w:tc>
         <w:tc>
           <w:tcPr>
-            <w:tcW w:type="dxa" w:w="2880"/>
+            <w:tcW w:type="dxa" w:w="4320"/>
+            <w:shd w:fill="FFFFFF"/>
+            <w:tcMar>
+              <w:top w:w="90" w:type="dxa"/>
+              <w:bottom w:w="90" w:type="dxa"/>
+              <w:left w:w="140" w:type="dxa"/>
+              <w:right w:w="140" w:type="dxa"/>
+            </w:tcMar>
           </w:tcPr>
           <w:p>
+            <w:pPr>
+              <w:spacing w:after="0"/>
+            </w:pPr>
             <w:r>
               <w:rPr>
-                <w:sz w:val="20"/>
+                <w:rFonts w:ascii="Calibri" w:hAnsi="Calibri"/>
+                <w:color w:val="333333"/>
+                <w:sz w:val="19"/>
               </w:rPr>
-              <w:t>Geração em lote de múltiplos planos: processamento paralelo, barra de progresso, gerenciamento de erros</w:t>
+              <w:t>Totalmente padronizado nas 4 turmas (C, H, J, E). Disciplinas no formato '&lt;NOME&gt; - CDP - EJA - MULTISSERIADO'. Restrição estrita a recursos tecnológicos.</w:t>
             </w:r>
           </w:p>
         </w:tc>
@@ -852,40 +407,76 @@
       <w:tr>
         <w:tc>
           <w:tcPr>
-            <w:tcW w:type="dxa" w:w="2880"/>
+            <w:tcW w:type="dxa" w:w="2160"/>
+            <w:shd w:fill="F9FBFD"/>
+            <w:tcMar>
+              <w:top w:w="90" w:type="dxa"/>
+              <w:bottom w:w="90" w:type="dxa"/>
+              <w:left w:w="140" w:type="dxa"/>
+              <w:right w:w="140" w:type="dxa"/>
+            </w:tcMar>
           </w:tcPr>
           <w:p>
+            <w:pPr>
+              <w:spacing w:after="0"/>
+            </w:pPr>
             <w:r>
               <w:rPr>
-                <w:sz w:val="20"/>
+                <w:rFonts w:ascii="Calibri" w:hAnsi="Calibri"/>
+                <w:color w:val="333333"/>
+                <w:sz w:val="19"/>
               </w:rPr>
-              <w:t>ui/historico.py</w:t>
+              <w:t>EJA</w:t>
             </w:r>
           </w:p>
         </w:tc>
         <w:tc>
           <w:tcPr>
-            <w:tcW w:type="dxa" w:w="2880"/>
+            <w:tcW w:type="dxa" w:w="3600"/>
+            <w:shd w:fill="F9FBFD"/>
+            <w:tcMar>
+              <w:top w:w="90" w:type="dxa"/>
+              <w:bottom w:w="90" w:type="dxa"/>
+              <w:left w:w="140" w:type="dxa"/>
+              <w:right w:w="140" w:type="dxa"/>
+            </w:tcMar>
           </w:tcPr>
           <w:p>
+            <w:pPr>
+              <w:spacing w:after="0"/>
+            </w:pPr>
             <w:r>
               <w:rPr>
-                <w:sz w:val="20"/>
+                <w:rFonts w:ascii="Calibri" w:hAnsi="Calibri"/>
+                <w:color w:val="333333"/>
+                <w:sz w:val="19"/>
               </w:rPr>
-              <w:t>~8KB</w:t>
+              <w:t>Educação de Jovens e Adultos (Regular)</w:t>
             </w:r>
           </w:p>
         </w:tc>
         <w:tc>
           <w:tcPr>
-            <w:tcW w:type="dxa" w:w="2880"/>
+            <w:tcW w:type="dxa" w:w="4320"/>
+            <w:shd w:fill="F9FBFD"/>
+            <w:tcMar>
+              <w:top w:w="90" w:type="dxa"/>
+              <w:bottom w:w="90" w:type="dxa"/>
+              <w:left w:w="140" w:type="dxa"/>
+              <w:right w:w="140" w:type="dxa"/>
+            </w:tcMar>
           </w:tcPr>
           <w:p>
+            <w:pPr>
+              <w:spacing w:after="0"/>
+            </w:pPr>
             <w:r>
               <w:rPr>
-                <w:sz w:val="20"/>
+                <w:rFonts w:ascii="Calibri" w:hAnsi="Calibri"/>
+                <w:color w:val="333333"/>
+                <w:sz w:val="19"/>
               </w:rPr>
-              <w:t>Consulta de histórico: filtros avançados por professor/disciplina/turma/mês/bimestre, download de documentos</w:t>
+              <w:t>Linguagem voltada ao mundo do trabalho. Limite estendido para 350 caracteres/etapa. Rotas dedicadas (ex: BIOLOGIA/EJA_BIOLOGIA).</w:t>
             </w:r>
           </w:p>
         </w:tc>
@@ -893,40 +484,76 @@
       <w:tr>
         <w:tc>
           <w:tcPr>
-            <w:tcW w:type="dxa" w:w="2880"/>
+            <w:tcW w:type="dxa" w:w="2160"/>
+            <w:shd w:fill="FFFFFF"/>
+            <w:tcMar>
+              <w:top w:w="90" w:type="dxa"/>
+              <w:bottom w:w="90" w:type="dxa"/>
+              <w:left w:w="140" w:type="dxa"/>
+              <w:right w:w="140" w:type="dxa"/>
+            </w:tcMar>
           </w:tcPr>
           <w:p>
+            <w:pPr>
+              <w:spacing w:after="0"/>
+            </w:pPr>
             <w:r>
               <w:rPr>
-                <w:sz w:val="20"/>
+                <w:rFonts w:ascii="Calibri" w:hAnsi="Calibri"/>
+                <w:color w:val="333333"/>
+                <w:sz w:val="19"/>
               </w:rPr>
-              <w:t>ui/diagnostico.py</w:t>
+              <w:t>Cadastro</w:t>
             </w:r>
           </w:p>
         </w:tc>
         <w:tc>
           <w:tcPr>
-            <w:tcW w:type="dxa" w:w="2880"/>
+            <w:tcW w:type="dxa" w:w="3600"/>
+            <w:shd w:fill="FFFFFF"/>
+            <w:tcMar>
+              <w:top w:w="90" w:type="dxa"/>
+              <w:bottom w:w="90" w:type="dxa"/>
+              <w:left w:w="140" w:type="dxa"/>
+              <w:right w:w="140" w:type="dxa"/>
+            </w:tcMar>
           </w:tcPr>
           <w:p>
+            <w:pPr>
+              <w:spacing w:after="0"/>
+            </w:pPr>
             <w:r>
               <w:rPr>
-                <w:sz w:val="20"/>
+                <w:rFonts w:ascii="Calibri" w:hAnsi="Calibri"/>
+                <w:color w:val="333333"/>
+                <w:sz w:val="19"/>
               </w:rPr>
-              <w:t>~4KB</w:t>
+              <w:t>Gestão de professores, turmas e horários</w:t>
             </w:r>
           </w:p>
         </w:tc>
         <w:tc>
           <w:tcPr>
-            <w:tcW w:type="dxa" w:w="2880"/>
+            <w:tcW w:type="dxa" w:w="4320"/>
+            <w:shd w:fill="FFFFFF"/>
+            <w:tcMar>
+              <w:top w:w="90" w:type="dxa"/>
+              <w:bottom w:w="90" w:type="dxa"/>
+              <w:left w:w="140" w:type="dxa"/>
+              <w:right w:w="140" w:type="dxa"/>
+            </w:tcMar>
           </w:tcPr>
           <w:p>
+            <w:pPr>
+              <w:spacing w:after="0"/>
+            </w:pPr>
             <w:r>
               <w:rPr>
-                <w:sz w:val="20"/>
+                <w:rFonts w:ascii="Calibri" w:hAnsi="Calibri"/>
+                <w:color w:val="333333"/>
+                <w:sz w:val="19"/>
               </w:rPr>
-              <w:t>Painel técnico de diagnóstico: exibe perfil detectado, tipo de aula, score, etapas da metodologia, proveniência dos dados</w:t>
+              <w:t>CRUD integrado com detecção de vínculos equivalentes no SQLite. Fonte visual: Banco, Pasta DOCX ou Banco + DOCX.</w:t>
             </w:r>
           </w:p>
         </w:tc>
@@ -934,40 +561,76 @@
       <w:tr>
         <w:tc>
           <w:tcPr>
-            <w:tcW w:type="dxa" w:w="2880"/>
+            <w:tcW w:type="dxa" w:w="2160"/>
+            <w:shd w:fill="F9FBFD"/>
+            <w:tcMar>
+              <w:top w:w="90" w:type="dxa"/>
+              <w:bottom w:w="90" w:type="dxa"/>
+              <w:left w:w="140" w:type="dxa"/>
+              <w:right w:w="140" w:type="dxa"/>
+            </w:tcMar>
           </w:tcPr>
           <w:p>
+            <w:pPr>
+              <w:spacing w:after="0"/>
+            </w:pPr>
             <w:r>
               <w:rPr>
-                <w:sz w:val="20"/>
+                <w:rFonts w:ascii="Calibri" w:hAnsi="Calibri"/>
+                <w:color w:val="333333"/>
+                <w:sz w:val="19"/>
               </w:rPr>
-              <w:t>ui/acompanhamento.py</w:t>
+              <w:t>Histórico</w:t>
             </w:r>
           </w:p>
         </w:tc>
         <w:tc>
           <w:tcPr>
-            <w:tcW w:type="dxa" w:w="2880"/>
+            <w:tcW w:type="dxa" w:w="3600"/>
+            <w:shd w:fill="F9FBFD"/>
+            <w:tcMar>
+              <w:top w:w="90" w:type="dxa"/>
+              <w:bottom w:w="90" w:type="dxa"/>
+              <w:left w:w="140" w:type="dxa"/>
+              <w:right w:w="140" w:type="dxa"/>
+            </w:tcMar>
           </w:tcPr>
           <w:p>
+            <w:pPr>
+              <w:spacing w:after="0"/>
+            </w:pPr>
             <w:r>
               <w:rPr>
-                <w:sz w:val="20"/>
+                <w:rFonts w:ascii="Calibri" w:hAnsi="Calibri"/>
+                <w:color w:val="333333"/>
+                <w:sz w:val="19"/>
               </w:rPr>
-              <w:t>~17KB</w:t>
+              <w:t>Consulta e download de planos já gerados</w:t>
             </w:r>
           </w:p>
         </w:tc>
         <w:tc>
           <w:tcPr>
-            <w:tcW w:type="dxa" w:w="2880"/>
+            <w:tcW w:type="dxa" w:w="4320"/>
+            <w:shd w:fill="F9FBFD"/>
+            <w:tcMar>
+              <w:top w:w="90" w:type="dxa"/>
+              <w:bottom w:w="90" w:type="dxa"/>
+              <w:left w:w="140" w:type="dxa"/>
+              <w:right w:w="140" w:type="dxa"/>
+            </w:tcMar>
           </w:tcPr>
           <w:p>
+            <w:pPr>
+              <w:spacing w:after="0"/>
+            </w:pPr>
             <w:r>
               <w:rPr>
-                <w:sz w:val="20"/>
+                <w:rFonts w:ascii="Calibri" w:hAnsi="Calibri"/>
+                <w:color w:val="333333"/>
+                <w:sz w:val="19"/>
               </w:rPr>
-              <w:t>Visualização e edição de itens de acompanhamento da aprendizagem na tela de revisão</w:t>
+              <w:t>Histórico completo com filtros por professor, disciplina, turma, mês e data de geração. Download direto do .docx.</w:t>
             </w:r>
           </w:p>
         </w:tc>
@@ -975,52 +638,347 @@
       <w:tr>
         <w:tc>
           <w:tcPr>
-            <w:tcW w:type="dxa" w:w="2880"/>
+            <w:tcW w:type="dxa" w:w="2160"/>
+            <w:shd w:fill="FFFFFF"/>
+            <w:tcMar>
+              <w:top w:w="90" w:type="dxa"/>
+              <w:bottom w:w="90" w:type="dxa"/>
+              <w:left w:w="140" w:type="dxa"/>
+              <w:right w:w="140" w:type="dxa"/>
+            </w:tcMar>
           </w:tcPr>
           <w:p>
+            <w:pPr>
+              <w:spacing w:after="0"/>
+            </w:pPr>
             <w:r>
               <w:rPr>
-                <w:sz w:val="20"/>
+                <w:rFonts w:ascii="Calibri" w:hAnsi="Calibri"/>
+                <w:color w:val="333333"/>
+                <w:sz w:val="19"/>
               </w:rPr>
-              <w:t>ui/tela_inicial_moderna.py</w:t>
+              <w:t>Diagnóstico</w:t>
             </w:r>
           </w:p>
         </w:tc>
         <w:tc>
           <w:tcPr>
-            <w:tcW w:type="dxa" w:w="2880"/>
+            <w:tcW w:type="dxa" w:w="3600"/>
+            <w:shd w:fill="FFFFFF"/>
+            <w:tcMar>
+              <w:top w:w="90" w:type="dxa"/>
+              <w:bottom w:w="90" w:type="dxa"/>
+              <w:left w:w="140" w:type="dxa"/>
+              <w:right w:w="140" w:type="dxa"/>
+            </w:tcMar>
           </w:tcPr>
           <w:p>
+            <w:pPr>
+              <w:spacing w:after="0"/>
+            </w:pPr>
             <w:r>
               <w:rPr>
-                <w:sz w:val="20"/>
+                <w:rFonts w:ascii="Calibri" w:hAnsi="Calibri"/>
+                <w:color w:val="333333"/>
+                <w:sz w:val="19"/>
               </w:rPr>
-              <w:t>~12KB</w:t>
+              <w:t>Inspeção técnica e qualidade metodológica</w:t>
             </w:r>
           </w:p>
         </w:tc>
         <w:tc>
           <w:tcPr>
-            <w:tcW w:type="dxa" w:w="2880"/>
+            <w:tcW w:type="dxa" w:w="4320"/>
+            <w:shd w:fill="FFFFFF"/>
+            <w:tcMar>
+              <w:top w:w="90" w:type="dxa"/>
+              <w:bottom w:w="90" w:type="dxa"/>
+              <w:left w:w="140" w:type="dxa"/>
+              <w:right w:w="140" w:type="dxa"/>
+            </w:tcMar>
           </w:tcPr>
           <w:p>
+            <w:pPr>
+              <w:spacing w:after="0"/>
+            </w:pPr>
             <w:r>
               <w:rPr>
-                <w:sz w:val="20"/>
+                <w:rFonts w:ascii="Calibri" w:hAnsi="Calibri"/>
+                <w:color w:val="333333"/>
+                <w:sz w:val="19"/>
               </w:rPr>
-              <w:t>Tela inicial com layout moderno e métricas de uso</w:t>
+              <w:t>Análise de confidence score, termos extraídos, tempo de resposta e proveniência.</w:t>
             </w:r>
           </w:p>
         </w:tc>
       </w:tr>
     </w:tbl>
-    <w:p/>
     <w:p>
       <w:pPr>
-        <w:pStyle w:val="Heading1"/>
+        <w:spacing w:after="160"/>
+      </w:pPr>
+    </w:p>
+    <w:p>
+      <w:pPr>
+        <w:keepNext/>
+        <w:spacing w:before="280" w:after="120"/>
       </w:pPr>
       <w:r>
-        <w:t>9. CONFIGURAÇÃO CENTRAL (config.py)</w:t>
+        <w:rPr>
+          <w:rFonts w:ascii="Calibri" w:hAnsi="Calibri"/>
+          <w:b/>
+          <w:color w:val="1B365D"/>
+          <w:sz w:val="30"/>
+        </w:rPr>
+        <w:t>3. FLUXO OPERACIONAL DE GERAÇÃO (PASSO A PASSO)</w:t>
+      </w:r>
+    </w:p>
+    <w:p>
+      <w:pPr>
+        <w:spacing w:after="120" w:line="276" w:lineRule="auto"/>
+      </w:pPr>
+      <w:r>
+        <w:rPr>
+          <w:rFonts w:ascii="Calibri" w:hAnsi="Calibri"/>
+          <w:b/>
+          <w:color w:val="222222"/>
+          <w:sz w:val="21"/>
+        </w:rPr>
+        <w:t xml:space="preserve">Passo 1: </w:t>
+      </w:r>
+      <w:r>
+        <w:rPr>
+          <w:rFonts w:ascii="Calibri" w:hAnsi="Calibri"/>
+          <w:color w:val="333333"/>
+          <w:sz w:val="21"/>
+        </w:rPr>
+        <w:t>1. Seleção Inicial: O professor seleciona a disciplina, professor, turma, bimestre e mês de vigência.</w:t>
+      </w:r>
+    </w:p>
+    <w:p>
+      <w:pPr>
+        <w:spacing w:after="120" w:line="276" w:lineRule="auto"/>
+      </w:pPr>
+      <w:r>
+        <w:rPr>
+          <w:rFonts w:ascii="Calibri" w:hAnsi="Calibri"/>
+          <w:b/>
+          <w:color w:val="222222"/>
+          <w:sz w:val="21"/>
+        </w:rPr>
+        <w:t xml:space="preserve">Passo 2: </w:t>
+      </w:r>
+      <w:r>
+        <w:rPr>
+          <w:rFonts w:ascii="Calibri" w:hAnsi="Calibri"/>
+          <w:color w:val="333333"/>
+          <w:sz w:val="21"/>
+        </w:rPr>
+        <w:t>2. Montagem do Calendário: O sistema calcula os dias reais de aula no mês com base na grade cadastrada, descontando feriados escolares.</w:t>
+      </w:r>
+    </w:p>
+    <w:p>
+      <w:pPr>
+        <w:spacing w:after="120" w:line="276" w:lineRule="auto"/>
+      </w:pPr>
+      <w:r>
+        <w:rPr>
+          <w:rFonts w:ascii="Calibri" w:hAnsi="Calibri"/>
+          <w:b/>
+          <w:color w:val="222222"/>
+          <w:sz w:val="21"/>
+        </w:rPr>
+        <w:t xml:space="preserve">Passo 3: </w:t>
+      </w:r>
+      <w:r>
+        <w:rPr>
+          <w:rFonts w:ascii="Calibri" w:hAnsi="Calibri"/>
+          <w:color w:val="333333"/>
+          <w:sz w:val="21"/>
+        </w:rPr>
+        <w:t>3. Resolução dos PDFs: Localização automática da pasta em PLANOS_LUAN_DADOS/PDF_AULAS ou upload manual pelo usuário.</w:t>
+      </w:r>
+    </w:p>
+    <w:p>
+      <w:pPr>
+        <w:spacing w:after="120" w:line="276" w:lineRule="auto"/>
+      </w:pPr>
+      <w:r>
+        <w:rPr>
+          <w:rFonts w:ascii="Calibri" w:hAnsi="Calibri"/>
+          <w:b/>
+          <w:color w:val="222222"/>
+          <w:sz w:val="21"/>
+        </w:rPr>
+        <w:t xml:space="preserve">Passo 4: </w:t>
+      </w:r>
+      <w:r>
+        <w:rPr>
+          <w:rFonts w:ascii="Calibri" w:hAnsi="Calibri"/>
+          <w:color w:val="333333"/>
+          <w:sz w:val="21"/>
+        </w:rPr>
+        <w:t>4. Extração e Classificação: Leitura dos PDFs (pdfplumber/OCR), extração de títulos, conceitos e habilidades, e classificação em perfil disciplinar.</w:t>
+      </w:r>
+    </w:p>
+    <w:p>
+      <w:pPr>
+        <w:spacing w:after="120" w:line="276" w:lineRule="auto"/>
+      </w:pPr>
+      <w:r>
+        <w:rPr>
+          <w:rFonts w:ascii="Calibri" w:hAnsi="Calibri"/>
+          <w:b/>
+          <w:color w:val="222222"/>
+          <w:sz w:val="21"/>
+        </w:rPr>
+        <w:t xml:space="preserve">Passo 5: </w:t>
+      </w:r>
+      <w:r>
+        <w:rPr>
+          <w:rFonts w:ascii="Calibri" w:hAnsi="Calibri"/>
+          <w:color w:val="333333"/>
+          <w:sz w:val="21"/>
+        </w:rPr>
+        <w:t>5. Geração Metodológica: Criação das etapas 'Para começar' (ou Relembre), 'Foco no conteúdo', 'Na prática' e 'Encerramento' (motor local determinístico ou IA).</w:t>
+      </w:r>
+    </w:p>
+    <w:p>
+      <w:pPr>
+        <w:spacing w:after="120" w:line="276" w:lineRule="auto"/>
+      </w:pPr>
+      <w:r>
+        <w:rPr>
+          <w:rFonts w:ascii="Calibri" w:hAnsi="Calibri"/>
+          <w:b/>
+          <w:color w:val="222222"/>
+          <w:sz w:val="21"/>
+        </w:rPr>
+        <w:t xml:space="preserve">Passo 6: </w:t>
+      </w:r>
+      <w:r>
+        <w:rPr>
+          <w:rFonts w:ascii="Calibri" w:hAnsi="Calibri"/>
+          <w:color w:val="333333"/>
+          <w:sz w:val="21"/>
+        </w:rPr>
+        <w:t>6. Enriquecimento Pedagógico: Geração contextual de 3 itens de acompanhamento da aprendizagem e 3 itens de adaptação de acessibilidade.</w:t>
+      </w:r>
+    </w:p>
+    <w:p>
+      <w:pPr>
+        <w:spacing w:after="120" w:line="276" w:lineRule="auto"/>
+      </w:pPr>
+      <w:r>
+        <w:rPr>
+          <w:rFonts w:ascii="Calibri" w:hAnsi="Calibri"/>
+          <w:b/>
+          <w:color w:val="222222"/>
+          <w:sz w:val="21"/>
+        </w:rPr>
+        <w:t xml:space="preserve">Passo 7: </w:t>
+      </w:r>
+      <w:r>
+        <w:rPr>
+          <w:rFonts w:ascii="Calibri" w:hAnsi="Calibri"/>
+          <w:color w:val="333333"/>
+          <w:sz w:val="21"/>
+        </w:rPr>
+        <w:t>7. Validação e Scoring: Cálculo do confidence score (0 a 100), verificação de limites (300/350 chars) e sanitização de texto.</w:t>
+      </w:r>
+    </w:p>
+    <w:p>
+      <w:pPr>
+        <w:spacing w:after="120" w:line="276" w:lineRule="auto"/>
+      </w:pPr>
+      <w:r>
+        <w:rPr>
+          <w:rFonts w:ascii="Calibri" w:hAnsi="Calibri"/>
+          <w:b/>
+          <w:color w:val="222222"/>
+          <w:sz w:val="21"/>
+        </w:rPr>
+        <w:t xml:space="preserve">Passo 8: </w:t>
+      </w:r>
+      <w:r>
+        <w:rPr>
+          <w:rFonts w:ascii="Calibri" w:hAnsi="Calibri"/>
+          <w:color w:val="333333"/>
+          <w:sz w:val="21"/>
+        </w:rPr>
+        <w:t>8. Tela de Revisão: Permite ao professor inspecionar e editar qualquer campo antes da gravação.</w:t>
+      </w:r>
+    </w:p>
+    <w:p>
+      <w:pPr>
+        <w:spacing w:after="120" w:line="276" w:lineRule="auto"/>
+      </w:pPr>
+      <w:r>
+        <w:rPr>
+          <w:rFonts w:ascii="Calibri" w:hAnsi="Calibri"/>
+          <w:b/>
+          <w:color w:val="222222"/>
+          <w:sz w:val="21"/>
+        </w:rPr>
+        <w:t xml:space="preserve">Passo 9: </w:t>
+      </w:r>
+      <w:r>
+        <w:rPr>
+          <w:rFonts w:ascii="Calibri" w:hAnsi="Calibri"/>
+          <w:color w:val="333333"/>
+          <w:sz w:val="21"/>
+        </w:rPr>
+        <w:t>9. Geração Word (.docx): Preenchimento do template oficial preservando formatação, tabelas mescladas e ordem cronológica.</w:t>
+      </w:r>
+    </w:p>
+    <w:p>
+      <w:pPr>
+        <w:spacing w:after="120" w:line="276" w:lineRule="auto"/>
+      </w:pPr>
+      <w:r>
+        <w:rPr>
+          <w:rFonts w:ascii="Calibri" w:hAnsi="Calibri"/>
+          <w:b/>
+          <w:color w:val="222222"/>
+          <w:sz w:val="21"/>
+        </w:rPr>
+        <w:t xml:space="preserve">Passo 10: </w:t>
+      </w:r>
+      <w:r>
+        <w:rPr>
+          <w:rFonts w:ascii="Calibri" w:hAnsi="Calibri"/>
+          <w:color w:val="333333"/>
+          <w:sz w:val="21"/>
+        </w:rPr>
+        <w:t>10. Gravação e Histórico: Armazenamento do arquivo na pasta de histórico e inserção do registro no banco de dados SQLite.</w:t>
+      </w:r>
+    </w:p>
+    <w:p>
+      <w:pPr>
+        <w:keepNext/>
+        <w:spacing w:before="280" w:after="120"/>
+      </w:pPr>
+      <w:r>
+        <w:rPr>
+          <w:rFonts w:ascii="Calibri" w:hAnsi="Calibri"/>
+          <w:b/>
+          <w:color w:val="1B365D"/>
+          <w:sz w:val="30"/>
+        </w:rPr>
+        <w:t>4. PADRONIZAÇÃO DO CDP E TURMAS</w:t>
+      </w:r>
+    </w:p>
+    <w:p>
+      <w:pPr>
+        <w:spacing w:after="120" w:line="276" w:lineRule="auto"/>
+      </w:pPr>
+      <w:r>
+        <w:rPr>
+          <w:rFonts w:ascii="Calibri" w:hAnsi="Calibri"/>
+          <w:color w:val="333333"/>
+          <w:sz w:val="21"/>
+        </w:rPr>
+        <w:t>O módulo CDP opera com um catálogo unificado de disciplinas e turmas:</w:t>
       </w:r>
     </w:p>
     <w:tbl>
@@ -1031,50 +989,89 @@
         <w:tblLook w:firstColumn="1" w:firstRow="1" w:lastColumn="0" w:lastRow="0" w:noHBand="0" w:noVBand="1" w:val="04A0"/>
       </w:tblPr>
       <w:tblGrid>
-        <w:gridCol w:w="2880"/>
-        <w:gridCol w:w="2880"/>
-        <w:gridCol w:w="2880"/>
+        <w:gridCol w:w="3312"/>
+        <w:gridCol w:w="3312"/>
+        <w:gridCol w:w="3312"/>
       </w:tblGrid>
       <w:tr>
         <w:tc>
           <w:tcPr>
-            <w:tcW w:type="dxa" w:w="2880"/>
+            <w:tcW w:type="dxa" w:w="3744"/>
+            <w:shd w:fill="1B365D"/>
+            <w:tcMar>
+              <w:top w:w="120" w:type="dxa"/>
+              <w:bottom w:w="120" w:type="dxa"/>
+              <w:left w:w="140" w:type="dxa"/>
+              <w:right w:w="140" w:type="dxa"/>
+            </w:tcMar>
           </w:tcPr>
           <w:p>
+            <w:pPr>
+              <w:spacing w:after="0"/>
+              <w:jc w:val="left"/>
+            </w:pPr>
             <w:r>
               <w:rPr>
+                <w:rFonts w:ascii="Calibri" w:hAnsi="Calibri"/>
                 <w:b/>
+                <w:color w:val="FFFFFF"/>
                 <w:sz w:val="20"/>
               </w:rPr>
-              <w:t>Constante</w:t>
+              <w:t>Disciplina Padronizada</w:t>
             </w:r>
           </w:p>
         </w:tc>
         <w:tc>
           <w:tcPr>
-            <w:tcW w:type="dxa" w:w="2880"/>
+            <w:tcW w:type="dxa" w:w="2016"/>
+            <w:shd w:fill="1B365D"/>
+            <w:tcMar>
+              <w:top w:w="120" w:type="dxa"/>
+              <w:bottom w:w="120" w:type="dxa"/>
+              <w:left w:w="140" w:type="dxa"/>
+              <w:right w:w="140" w:type="dxa"/>
+            </w:tcMar>
           </w:tcPr>
           <w:p>
+            <w:pPr>
+              <w:spacing w:after="0"/>
+              <w:jc w:val="left"/>
+            </w:pPr>
             <w:r>
               <w:rPr>
+                <w:rFonts w:ascii="Calibri" w:hAnsi="Calibri"/>
                 <w:b/>
+                <w:color w:val="FFFFFF"/>
                 <w:sz w:val="20"/>
               </w:rPr>
-              <w:t>Valor</w:t>
+              <w:t>Turmas Atendidas</w:t>
             </w:r>
           </w:p>
         </w:tc>
         <w:tc>
           <w:tcPr>
-            <w:tcW w:type="dxa" w:w="2880"/>
+            <w:tcW w:type="dxa" w:w="4320"/>
+            <w:shd w:fill="1B365D"/>
+            <w:tcMar>
+              <w:top w:w="120" w:type="dxa"/>
+              <w:bottom w:w="120" w:type="dxa"/>
+              <w:left w:w="140" w:type="dxa"/>
+              <w:right w:w="140" w:type="dxa"/>
+            </w:tcMar>
           </w:tcPr>
           <w:p>
+            <w:pPr>
+              <w:spacing w:after="0"/>
+              <w:jc w:val="left"/>
+            </w:pPr>
             <w:r>
               <w:rPr>
+                <w:rFonts w:ascii="Calibri" w:hAnsi="Calibri"/>
                 <w:b/>
+                <w:color w:val="FFFFFF"/>
                 <w:sz w:val="20"/>
               </w:rPr>
-              <w:t>Descrição</w:t>
+              <w:t>Pasta de PDFs (4º Bimestre)</w:t>
             </w:r>
           </w:p>
         </w:tc>
@@ -1082,40 +1079,76 @@
       <w:tr>
         <w:tc>
           <w:tcPr>
-            <w:tcW w:type="dxa" w:w="2880"/>
+            <w:tcW w:type="dxa" w:w="3744"/>
+            <w:shd w:fill="FFFFFF"/>
+            <w:tcMar>
+              <w:top w:w="90" w:type="dxa"/>
+              <w:bottom w:w="90" w:type="dxa"/>
+              <w:left w:w="140" w:type="dxa"/>
+              <w:right w:w="140" w:type="dxa"/>
+            </w:tcMar>
           </w:tcPr>
           <w:p>
+            <w:pPr>
+              <w:spacing w:after="0"/>
+            </w:pPr>
             <w:r>
               <w:rPr>
-                <w:sz w:val="20"/>
+                <w:rFonts w:ascii="Calibri" w:hAnsi="Calibri"/>
+                <w:color w:val="333333"/>
+                <w:sz w:val="19"/>
               </w:rPr>
-              <w:t>BASE_DIR</w:t>
+              <w:t>HISTÓRIA - CDP - EJA - MULTISSERIADO</w:t>
             </w:r>
           </w:p>
         </w:tc>
         <w:tc>
           <w:tcPr>
-            <w:tcW w:type="dxa" w:w="2880"/>
+            <w:tcW w:type="dxa" w:w="2016"/>
+            <w:shd w:fill="FFFFFF"/>
+            <w:tcMar>
+              <w:top w:w="90" w:type="dxa"/>
+              <w:bottom w:w="90" w:type="dxa"/>
+              <w:left w:w="140" w:type="dxa"/>
+              <w:right w:w="140" w:type="dxa"/>
+            </w:tcMar>
           </w:tcPr>
           <w:p>
+            <w:pPr>
+              <w:spacing w:after="0"/>
+            </w:pPr>
             <w:r>
               <w:rPr>
-                <w:sz w:val="20"/>
+                <w:rFonts w:ascii="Calibri" w:hAnsi="Calibri"/>
+                <w:color w:val="333333"/>
+                <w:sz w:val="19"/>
               </w:rPr>
-              <w:t>Path(__file__).resolve().parent</w:t>
+              <w:t>C, H (EF) | J, E (EM)</w:t>
             </w:r>
           </w:p>
         </w:tc>
         <w:tc>
           <w:tcPr>
-            <w:tcW w:type="dxa" w:w="2880"/>
+            <w:tcW w:type="dxa" w:w="4320"/>
+            <w:shd w:fill="FFFFFF"/>
+            <w:tcMar>
+              <w:top w:w="90" w:type="dxa"/>
+              <w:bottom w:w="90" w:type="dxa"/>
+              <w:left w:w="140" w:type="dxa"/>
+              <w:right w:w="140" w:type="dxa"/>
+            </w:tcMar>
           </w:tcPr>
           <w:p>
+            <w:pPr>
+              <w:spacing w:after="0"/>
+            </w:pPr>
             <w:r>
               <w:rPr>
-                <w:sz w:val="20"/>
+                <w:rFonts w:ascii="Calibri" w:hAnsi="Calibri"/>
+                <w:color w:val="333333"/>
+                <w:sz w:val="19"/>
               </w:rPr>
-              <w:t>Raiz do projeto</w:t>
+              <w:t>HISTORIA_CDP/EF/... ou HISTORIA_CDP/EM/4_BIMESTRE/1_ANO_2_ANO_3_ANO</w:t>
             </w:r>
           </w:p>
         </w:tc>
@@ -1123,40 +1156,76 @@
       <w:tr>
         <w:tc>
           <w:tcPr>
-            <w:tcW w:type="dxa" w:w="2880"/>
+            <w:tcW w:type="dxa" w:w="3744"/>
+            <w:shd w:fill="F9FBFD"/>
+            <w:tcMar>
+              <w:top w:w="90" w:type="dxa"/>
+              <w:bottom w:w="90" w:type="dxa"/>
+              <w:left w:w="140" w:type="dxa"/>
+              <w:right w:w="140" w:type="dxa"/>
+            </w:tcMar>
           </w:tcPr>
           <w:p>
+            <w:pPr>
+              <w:spacing w:after="0"/>
+            </w:pPr>
             <w:r>
               <w:rPr>
-                <w:sz w:val="20"/>
+                <w:rFonts w:ascii="Calibri" w:hAnsi="Calibri"/>
+                <w:color w:val="333333"/>
+                <w:sz w:val="19"/>
               </w:rPr>
-              <w:t>PLANOS_LUAN_DADOS_DIR</w:t>
+              <w:t>CIÊNCIAS - CDP - EJA - MULTISSERIADO</w:t>
             </w:r>
           </w:p>
         </w:tc>
         <w:tc>
           <w:tcPr>
-            <w:tcW w:type="dxa" w:w="2880"/>
+            <w:tcW w:type="dxa" w:w="2016"/>
+            <w:shd w:fill="F9FBFD"/>
+            <w:tcMar>
+              <w:top w:w="90" w:type="dxa"/>
+              <w:bottom w:w="90" w:type="dxa"/>
+              <w:left w:w="140" w:type="dxa"/>
+              <w:right w:w="140" w:type="dxa"/>
+            </w:tcMar>
           </w:tcPr>
           <w:p>
+            <w:pPr>
+              <w:spacing w:after="0"/>
+            </w:pPr>
             <w:r>
               <w:rPr>
-                <w:sz w:val="20"/>
+                <w:rFonts w:ascii="Calibri" w:hAnsi="Calibri"/>
+                <w:color w:val="333333"/>
+                <w:sz w:val="19"/>
               </w:rPr>
-              <w:t>BASE_DIR.parent / "PLANOS_LUAN_DADOS"</w:t>
+              <w:t>C (6/7) | H, J, E (8/9)</w:t>
             </w:r>
           </w:p>
         </w:tc>
         <w:tc>
           <w:tcPr>
-            <w:tcW w:type="dxa" w:w="2880"/>
+            <w:tcW w:type="dxa" w:w="4320"/>
+            <w:shd w:fill="F9FBFD"/>
+            <w:tcMar>
+              <w:top w:w="90" w:type="dxa"/>
+              <w:bottom w:w="90" w:type="dxa"/>
+              <w:left w:w="140" w:type="dxa"/>
+              <w:right w:w="140" w:type="dxa"/>
+            </w:tcMar>
           </w:tcPr>
           <w:p>
+            <w:pPr>
+              <w:spacing w:after="0"/>
+            </w:pPr>
             <w:r>
               <w:rPr>
-                <w:sz w:val="20"/>
+                <w:rFonts w:ascii="Calibri" w:hAnsi="Calibri"/>
+                <w:color w:val="333333"/>
+                <w:sz w:val="19"/>
               </w:rPr>
-              <w:t>Raiz dos dados pedagógicos</w:t>
+              <w:t>CIENCIAS_CDP/AF/4_BIMESTRE/6_E_7_ANO ou 8_E_9_ANO</w:t>
             </w:r>
           </w:p>
         </w:tc>
@@ -1164,40 +1233,76 @@
       <w:tr>
         <w:tc>
           <w:tcPr>
-            <w:tcW w:type="dxa" w:w="2880"/>
+            <w:tcW w:type="dxa" w:w="3744"/>
+            <w:shd w:fill="FFFFFF"/>
+            <w:tcMar>
+              <w:top w:w="90" w:type="dxa"/>
+              <w:bottom w:w="90" w:type="dxa"/>
+              <w:left w:w="140" w:type="dxa"/>
+              <w:right w:w="140" w:type="dxa"/>
+            </w:tcMar>
           </w:tcPr>
           <w:p>
+            <w:pPr>
+              <w:spacing w:after="0"/>
+            </w:pPr>
             <w:r>
               <w:rPr>
-                <w:sz w:val="20"/>
+                <w:rFonts w:ascii="Calibri" w:hAnsi="Calibri"/>
+                <w:color w:val="333333"/>
+                <w:sz w:val="19"/>
               </w:rPr>
-              <w:t>PDF_AULAS_DIR</w:t>
+              <w:t>MATEMÁTICA - CDP - EJA - MULTISSERIADO</w:t>
             </w:r>
           </w:p>
         </w:tc>
         <w:tc>
           <w:tcPr>
-            <w:tcW w:type="dxa" w:w="2880"/>
+            <w:tcW w:type="dxa" w:w="2016"/>
+            <w:shd w:fill="FFFFFF"/>
+            <w:tcMar>
+              <w:top w:w="90" w:type="dxa"/>
+              <w:bottom w:w="90" w:type="dxa"/>
+              <w:left w:w="140" w:type="dxa"/>
+              <w:right w:w="140" w:type="dxa"/>
+            </w:tcMar>
           </w:tcPr>
           <w:p>
+            <w:pPr>
+              <w:spacing w:after="0"/>
+            </w:pPr>
             <w:r>
               <w:rPr>
-                <w:sz w:val="20"/>
+                <w:rFonts w:ascii="Calibri" w:hAnsi="Calibri"/>
+                <w:color w:val="333333"/>
+                <w:sz w:val="19"/>
               </w:rPr>
-              <w:t>PLANOS_LUAN_DADOS_DIR / "PDF_AULAS"</w:t>
+              <w:t>C, H (EF) | J, E (EM)</w:t>
             </w:r>
           </w:p>
         </w:tc>
         <w:tc>
           <w:tcPr>
-            <w:tcW w:type="dxa" w:w="2880"/>
+            <w:tcW w:type="dxa" w:w="4320"/>
+            <w:shd w:fill="FFFFFF"/>
+            <w:tcMar>
+              <w:top w:w="90" w:type="dxa"/>
+              <w:bottom w:w="90" w:type="dxa"/>
+              <w:left w:w="140" w:type="dxa"/>
+              <w:right w:w="140" w:type="dxa"/>
+            </w:tcMar>
           </w:tcPr>
           <w:p>
+            <w:pPr>
+              <w:spacing w:after="0"/>
+            </w:pPr>
             <w:r>
               <w:rPr>
-                <w:sz w:val="20"/>
+                <w:rFonts w:ascii="Calibri" w:hAnsi="Calibri"/>
+                <w:color w:val="333333"/>
+                <w:sz w:val="19"/>
               </w:rPr>
-              <w:t>Pasta de PDFs de aula</w:t>
+              <w:t>MATEMATICA-CDP/AF/... ou MATEMATICA-CDP/EM/4_BIMESTRE/1_2_E_3_ANO_MULTISSERIADO</w:t>
             </w:r>
           </w:p>
         </w:tc>
@@ -1205,40 +1310,76 @@
       <w:tr>
         <w:tc>
           <w:tcPr>
-            <w:tcW w:type="dxa" w:w="2880"/>
+            <w:tcW w:type="dxa" w:w="3744"/>
+            <w:shd w:fill="F9FBFD"/>
+            <w:tcMar>
+              <w:top w:w="90" w:type="dxa"/>
+              <w:bottom w:w="90" w:type="dxa"/>
+              <w:left w:w="140" w:type="dxa"/>
+              <w:right w:w="140" w:type="dxa"/>
+            </w:tcMar>
           </w:tcPr>
           <w:p>
+            <w:pPr>
+              <w:spacing w:after="0"/>
+            </w:pPr>
             <w:r>
               <w:rPr>
-                <w:sz w:val="20"/>
+                <w:rFonts w:ascii="Calibri" w:hAnsi="Calibri"/>
+                <w:color w:val="333333"/>
+                <w:sz w:val="19"/>
               </w:rPr>
-              <w:t>DB_PATH</w:t>
+              <w:t>GEOGRAFIA - CDP - EJA - MULTISSERIADO</w:t>
             </w:r>
           </w:p>
         </w:tc>
         <w:tc>
           <w:tcPr>
-            <w:tcW w:type="dxa" w:w="2880"/>
+            <w:tcW w:type="dxa" w:w="2016"/>
+            <w:shd w:fill="F9FBFD"/>
+            <w:tcMar>
+              <w:top w:w="90" w:type="dxa"/>
+              <w:bottom w:w="90" w:type="dxa"/>
+              <w:left w:w="140" w:type="dxa"/>
+              <w:right w:w="140" w:type="dxa"/>
+            </w:tcMar>
           </w:tcPr>
           <w:p>
+            <w:pPr>
+              <w:spacing w:after="0"/>
+            </w:pPr>
             <w:r>
               <w:rPr>
-                <w:sz w:val="20"/>
+                <w:rFonts w:ascii="Calibri" w:hAnsi="Calibri"/>
+                <w:color w:val="333333"/>
+                <w:sz w:val="19"/>
               </w:rPr>
-              <w:t>PLANOS_LUAN_DADOS_DIR / "planos_luan.db"</w:t>
+              <w:t>J, E (EM)</w:t>
             </w:r>
           </w:p>
         </w:tc>
         <w:tc>
           <w:tcPr>
-            <w:tcW w:type="dxa" w:w="2880"/>
+            <w:tcW w:type="dxa" w:w="4320"/>
+            <w:shd w:fill="F9FBFD"/>
+            <w:tcMar>
+              <w:top w:w="90" w:type="dxa"/>
+              <w:bottom w:w="90" w:type="dxa"/>
+              <w:left w:w="140" w:type="dxa"/>
+              <w:right w:w="140" w:type="dxa"/>
+            </w:tcMar>
           </w:tcPr>
           <w:p>
+            <w:pPr>
+              <w:spacing w:after="0"/>
+            </w:pPr>
             <w:r>
               <w:rPr>
-                <w:sz w:val="20"/>
+                <w:rFonts w:ascii="Calibri" w:hAnsi="Calibri"/>
+                <w:color w:val="333333"/>
+                <w:sz w:val="19"/>
               </w:rPr>
-              <w:t>Caminho do banco SQLite</w:t>
+              <w:t>GEOGRAFIA_CDP/EM/4_BIMESTRE</w:t>
             </w:r>
           </w:p>
         </w:tc>
@@ -1246,40 +1387,76 @@
       <w:tr>
         <w:tc>
           <w:tcPr>
-            <w:tcW w:type="dxa" w:w="2880"/>
+            <w:tcW w:type="dxa" w:w="3744"/>
+            <w:shd w:fill="FFFFFF"/>
+            <w:tcMar>
+              <w:top w:w="90" w:type="dxa"/>
+              <w:bottom w:w="90" w:type="dxa"/>
+              <w:left w:w="140" w:type="dxa"/>
+              <w:right w:w="140" w:type="dxa"/>
+            </w:tcMar>
           </w:tcPr>
           <w:p>
+            <w:pPr>
+              <w:spacing w:after="0"/>
+            </w:pPr>
             <w:r>
               <w:rPr>
-                <w:sz w:val="20"/>
+                <w:rFonts w:ascii="Calibri" w:hAnsi="Calibri"/>
+                <w:color w:val="333333"/>
+                <w:sz w:val="19"/>
               </w:rPr>
-              <w:t>HISTORICO_DOCX_DIR</w:t>
+              <w:t>SOCIOLOGIA - CDP - EJA - MULTISSERIADO</w:t>
             </w:r>
           </w:p>
         </w:tc>
         <w:tc>
           <w:tcPr>
-            <w:tcW w:type="dxa" w:w="2880"/>
+            <w:tcW w:type="dxa" w:w="2016"/>
+            <w:shd w:fill="FFFFFF"/>
+            <w:tcMar>
+              <w:top w:w="90" w:type="dxa"/>
+              <w:bottom w:w="90" w:type="dxa"/>
+              <w:left w:w="140" w:type="dxa"/>
+              <w:right w:w="140" w:type="dxa"/>
+            </w:tcMar>
           </w:tcPr>
           <w:p>
+            <w:pPr>
+              <w:spacing w:after="0"/>
+            </w:pPr>
             <w:r>
               <w:rPr>
-                <w:sz w:val="20"/>
+                <w:rFonts w:ascii="Calibri" w:hAnsi="Calibri"/>
+                <w:color w:val="333333"/>
+                <w:sz w:val="19"/>
               </w:rPr>
-              <w:t>PLANOS_LUAN_DADOS_DIR / "historico_docx"</w:t>
+              <w:t>J, E (EM)</w:t>
             </w:r>
           </w:p>
         </w:tc>
         <w:tc>
           <w:tcPr>
-            <w:tcW w:type="dxa" w:w="2880"/>
+            <w:tcW w:type="dxa" w:w="4320"/>
+            <w:shd w:fill="FFFFFF"/>
+            <w:tcMar>
+              <w:top w:w="90" w:type="dxa"/>
+              <w:bottom w:w="90" w:type="dxa"/>
+              <w:left w:w="140" w:type="dxa"/>
+              <w:right w:w="140" w:type="dxa"/>
+            </w:tcMar>
           </w:tcPr>
           <w:p>
+            <w:pPr>
+              <w:spacing w:after="0"/>
+            </w:pPr>
             <w:r>
               <w:rPr>
-                <w:sz w:val="20"/>
+                <w:rFonts w:ascii="Calibri" w:hAnsi="Calibri"/>
+                <w:color w:val="333333"/>
+                <w:sz w:val="19"/>
               </w:rPr>
-              <w:t>Pasta de arquivos do histórico</w:t>
+              <w:t>SOCIOLOGIA_CDP_MULTISSERIADO/EM/4_BIMESTRE</w:t>
             </w:r>
           </w:p>
         </w:tc>
@@ -1287,40 +1464,76 @@
       <w:tr>
         <w:tc>
           <w:tcPr>
-            <w:tcW w:type="dxa" w:w="2880"/>
+            <w:tcW w:type="dxa" w:w="3744"/>
+            <w:shd w:fill="F9FBFD"/>
+            <w:tcMar>
+              <w:top w:w="90" w:type="dxa"/>
+              <w:bottom w:w="90" w:type="dxa"/>
+              <w:left w:w="140" w:type="dxa"/>
+              <w:right w:w="140" w:type="dxa"/>
+            </w:tcMar>
           </w:tcPr>
           <w:p>
+            <w:pPr>
+              <w:spacing w:after="0"/>
+            </w:pPr>
             <w:r>
               <w:rPr>
-                <w:sz w:val="20"/>
+                <w:rFonts w:ascii="Calibri" w:hAnsi="Calibri"/>
+                <w:color w:val="333333"/>
+                <w:sz w:val="19"/>
               </w:rPr>
-              <w:t>PLANOS_FEITOS_DIR</w:t>
+              <w:t>LIDERANÇA E ORATÓRIA - CDP - EJA - MULTISSERIADO</w:t>
             </w:r>
           </w:p>
         </w:tc>
         <w:tc>
           <w:tcPr>
-            <w:tcW w:type="dxa" w:w="2880"/>
+            <w:tcW w:type="dxa" w:w="2016"/>
+            <w:shd w:fill="F9FBFD"/>
+            <w:tcMar>
+              <w:top w:w="90" w:type="dxa"/>
+              <w:bottom w:w="90" w:type="dxa"/>
+              <w:left w:w="140" w:type="dxa"/>
+              <w:right w:w="140" w:type="dxa"/>
+            </w:tcMar>
           </w:tcPr>
           <w:p>
+            <w:pPr>
+              <w:spacing w:after="0"/>
+            </w:pPr>
             <w:r>
               <w:rPr>
-                <w:sz w:val="20"/>
+                <w:rFonts w:ascii="Calibri" w:hAnsi="Calibri"/>
+                <w:color w:val="333333"/>
+                <w:sz w:val="19"/>
               </w:rPr>
-              <w:t>PLANOS_LUAN_DADOS_DIR / "Planos feitos"</w:t>
+              <w:t>J, E (EM)</w:t>
             </w:r>
           </w:p>
         </w:tc>
         <w:tc>
           <w:tcPr>
-            <w:tcW w:type="dxa" w:w="2880"/>
+            <w:tcW w:type="dxa" w:w="4320"/>
+            <w:shd w:fill="F9FBFD"/>
+            <w:tcMar>
+              <w:top w:w="90" w:type="dxa"/>
+              <w:bottom w:w="90" w:type="dxa"/>
+              <w:left w:w="140" w:type="dxa"/>
+              <w:right w:w="140" w:type="dxa"/>
+            </w:tcMar>
           </w:tcPr>
           <w:p>
+            <w:pPr>
+              <w:spacing w:after="0"/>
+            </w:pPr>
             <w:r>
               <w:rPr>
-                <w:sz w:val="20"/>
+                <w:rFonts w:ascii="Calibri" w:hAnsi="Calibri"/>
+                <w:color w:val="333333"/>
+                <w:sz w:val="19"/>
               </w:rPr>
-              <w:t>Pasta de planos finalizados</w:t>
+              <w:t>LIDERANCA_E_ORATORIA/EM/4_BIMESTRE</w:t>
             </w:r>
           </w:p>
         </w:tc>
@@ -1328,40 +1541,76 @@
       <w:tr>
         <w:tc>
           <w:tcPr>
-            <w:tcW w:type="dxa" w:w="2880"/>
+            <w:tcW w:type="dxa" w:w="3744"/>
+            <w:shd w:fill="FFFFFF"/>
+            <w:tcMar>
+              <w:top w:w="90" w:type="dxa"/>
+              <w:bottom w:w="90" w:type="dxa"/>
+              <w:left w:w="140" w:type="dxa"/>
+              <w:right w:w="140" w:type="dxa"/>
+            </w:tcMar>
           </w:tcPr>
           <w:p>
+            <w:pPr>
+              <w:spacing w:after="0"/>
+            </w:pPr>
             <w:r>
               <w:rPr>
-                <w:sz w:val="20"/>
+                <w:rFonts w:ascii="Calibri" w:hAnsi="Calibri"/>
+                <w:color w:val="333333"/>
+                <w:sz w:val="19"/>
               </w:rPr>
-              <w:t>MODELO_OPENAI_PADRAO</w:t>
+              <w:t>LÍNGUA PORTUGUESA - CDP - EJA - MULTISSERIADO</w:t>
             </w:r>
           </w:p>
         </w:tc>
         <w:tc>
           <w:tcPr>
-            <w:tcW w:type="dxa" w:w="2880"/>
+            <w:tcW w:type="dxa" w:w="2016"/>
+            <w:shd w:fill="FFFFFF"/>
+            <w:tcMar>
+              <w:top w:w="90" w:type="dxa"/>
+              <w:bottom w:w="90" w:type="dxa"/>
+              <w:left w:w="140" w:type="dxa"/>
+              <w:right w:w="140" w:type="dxa"/>
+            </w:tcMar>
           </w:tcPr>
           <w:p>
+            <w:pPr>
+              <w:spacing w:after="0"/>
+            </w:pPr>
             <w:r>
               <w:rPr>
-                <w:sz w:val="20"/>
+                <w:rFonts w:ascii="Calibri" w:hAnsi="Calibri"/>
+                <w:color w:val="333333"/>
+                <w:sz w:val="19"/>
               </w:rPr>
-              <w:t>gpt-4o-mini</w:t>
+              <w:t>C, H, J, E</w:t>
             </w:r>
           </w:p>
         </w:tc>
         <w:tc>
           <w:tcPr>
-            <w:tcW w:type="dxa" w:w="2880"/>
+            <w:tcW w:type="dxa" w:w="4320"/>
+            <w:shd w:fill="FFFFFF"/>
+            <w:tcMar>
+              <w:top w:w="90" w:type="dxa"/>
+              <w:bottom w:w="90" w:type="dxa"/>
+              <w:left w:w="140" w:type="dxa"/>
+              <w:right w:w="140" w:type="dxa"/>
+            </w:tcMar>
           </w:tcPr>
           <w:p>
+            <w:pPr>
+              <w:spacing w:after="0"/>
+            </w:pPr>
             <w:r>
               <w:rPr>
-                <w:sz w:val="20"/>
+                <w:rFonts w:ascii="Calibri" w:hAnsi="Calibri"/>
+                <w:color w:val="333333"/>
+                <w:sz w:val="19"/>
               </w:rPr>
-              <w:t>Modelo da OpenAI para IA</w:t>
+              <w:t>LINGUA_PORTUGUESA/...</w:t>
             </w:r>
           </w:p>
         </w:tc>
@@ -1369,772 +1618,271 @@
       <w:tr>
         <w:tc>
           <w:tcPr>
-            <w:tcW w:type="dxa" w:w="2880"/>
+            <w:tcW w:type="dxa" w:w="3744"/>
+            <w:shd w:fill="F9FBFD"/>
+            <w:tcMar>
+              <w:top w:w="90" w:type="dxa"/>
+              <w:bottom w:w="90" w:type="dxa"/>
+              <w:left w:w="140" w:type="dxa"/>
+              <w:right w:w="140" w:type="dxa"/>
+            </w:tcMar>
           </w:tcPr>
           <w:p>
+            <w:pPr>
+              <w:spacing w:after="0"/>
+            </w:pPr>
             <w:r>
               <w:rPr>
-                <w:sz w:val="20"/>
+                <w:rFonts w:ascii="Calibri" w:hAnsi="Calibri"/>
+                <w:color w:val="333333"/>
+                <w:sz w:val="19"/>
               </w:rPr>
-              <w:t>MODELO_GEMINI_PADRAO</w:t>
+              <w:t>ARTE - CDP - EJA - MULTISSERIADO</w:t>
             </w:r>
           </w:p>
         </w:tc>
         <w:tc>
           <w:tcPr>
-            <w:tcW w:type="dxa" w:w="2880"/>
+            <w:tcW w:type="dxa" w:w="2016"/>
+            <w:shd w:fill="F9FBFD"/>
+            <w:tcMar>
+              <w:top w:w="90" w:type="dxa"/>
+              <w:bottom w:w="90" w:type="dxa"/>
+              <w:left w:w="140" w:type="dxa"/>
+              <w:right w:w="140" w:type="dxa"/>
+            </w:tcMar>
           </w:tcPr>
           <w:p>
+            <w:pPr>
+              <w:spacing w:after="0"/>
+            </w:pPr>
             <w:r>
               <w:rPr>
-                <w:sz w:val="20"/>
+                <w:rFonts w:ascii="Calibri" w:hAnsi="Calibri"/>
+                <w:color w:val="333333"/>
+                <w:sz w:val="19"/>
               </w:rPr>
-              <w:t>gemini-2.5-flash</w:t>
-            </w:r>
-          </w:p>
-        </w:tc>
-        <w:tc>
-          <w:tcPr>
-            <w:tcW w:type="dxa" w:w="2880"/>
-          </w:tcPr>
-          <w:p>
-            <w:r>
-              <w:rPr>
-                <w:sz w:val="20"/>
-              </w:rPr>
-              <w:t>Modelo do Google Gemini para IA</w:t>
-            </w:r>
-          </w:p>
-        </w:tc>
-      </w:tr>
-      <w:tr>
-        <w:tc>
-          <w:tcPr>
-            <w:tcW w:type="dxa" w:w="2880"/>
-          </w:tcPr>
-          <w:p>
-            <w:r>
-              <w:rPr>
-                <w:sz w:val="20"/>
-              </w:rPr>
-              <w:t>IA_TIMEOUT_SEGUNDOS</w:t>
-            </w:r>
-          </w:p>
-        </w:tc>
-        <w:tc>
-          <w:tcPr>
-            <w:tcW w:type="dxa" w:w="2880"/>
-          </w:tcPr>
-          <w:p>
-            <w:r>
-              <w:rPr>
-                <w:sz w:val="20"/>
-              </w:rPr>
-              <w:t>120</w:t>
-            </w:r>
-          </w:p>
-        </w:tc>
-        <w:tc>
-          <w:tcPr>
-            <w:tcW w:type="dxa" w:w="2880"/>
-          </w:tcPr>
-          <w:p>
-            <w:r>
-              <w:rPr>
-                <w:sz w:val="20"/>
-              </w:rPr>
-              <w:t>Timeout de requisição para IA</w:t>
-            </w:r>
-          </w:p>
-        </w:tc>
-      </w:tr>
-      <w:tr>
-        <w:tc>
-          <w:tcPr>
-            <w:tcW w:type="dxa" w:w="2880"/>
-          </w:tcPr>
-          <w:p>
-            <w:r>
-              <w:rPr>
-                <w:sz w:val="20"/>
-              </w:rPr>
-              <w:t>PDF_TEXTO_LIMITE_CHARS</w:t>
-            </w:r>
-          </w:p>
-        </w:tc>
-        <w:tc>
-          <w:tcPr>
-            <w:tcW w:type="dxa" w:w="2880"/>
-          </w:tcPr>
-          <w:p>
-            <w:r>
-              <w:rPr>
-                <w:sz w:val="20"/>
-              </w:rPr>
-              <w:t>100000</w:t>
-            </w:r>
-          </w:p>
-        </w:tc>
-        <w:tc>
-          <w:tcPr>
-            <w:tcW w:type="dxa" w:w="2880"/>
-          </w:tcPr>
-          <w:p>
-            <w:r>
-              <w:rPr>
-                <w:sz w:val="20"/>
-              </w:rPr>
-              <w:t>Limite máximo de texto extraído por PDF</w:t>
-            </w:r>
-          </w:p>
-        </w:tc>
-      </w:tr>
-      <w:tr>
-        <w:tc>
-          <w:tcPr>
-            <w:tcW w:type="dxa" w:w="2880"/>
-          </w:tcPr>
-          <w:p>
-            <w:r>
-              <w:rPr>
-                <w:sz w:val="20"/>
-              </w:rPr>
-              <w:t>MAX_CHARS_WORD</w:t>
-            </w:r>
-          </w:p>
-        </w:tc>
-        <w:tc>
-          <w:tcPr>
-            <w:tcW w:type="dxa" w:w="2880"/>
-          </w:tcPr>
-          <w:p>
-            <w:r>
-              <w:rPr>
-                <w:sz w:val="20"/>
-              </w:rPr>
-              <w:t>15000</w:t>
-            </w:r>
-          </w:p>
-        </w:tc>
-        <w:tc>
-          <w:tcPr>
-            <w:tcW w:type="dxa" w:w="2880"/>
-          </w:tcPr>
-          <w:p>
-            <w:r>
-              <w:rPr>
-                <w:sz w:val="20"/>
-              </w:rPr>
-              <w:t>Limite de caracteres no Word</w:t>
-            </w:r>
-          </w:p>
-        </w:tc>
-      </w:tr>
-      <w:tr>
-        <w:tc>
-          <w:tcPr>
-            <w:tcW w:type="dxa" w:w="2880"/>
-          </w:tcPr>
-          <w:p>
-            <w:r>
-              <w:rPr>
-                <w:sz w:val="20"/>
-              </w:rPr>
-              <w:t>HABILITAR_PDF2DOCX</w:t>
-            </w:r>
-          </w:p>
-        </w:tc>
-        <w:tc>
-          <w:tcPr>
-            <w:tcW w:type="dxa" w:w="2880"/>
-          </w:tcPr>
-          <w:p>
-            <w:r>
-              <w:rPr>
-                <w:sz w:val="20"/>
-              </w:rPr>
-              <w:t>False</w:t>
-            </w:r>
-          </w:p>
-        </w:tc>
-        <w:tc>
-          <w:tcPr>
-            <w:tcW w:type="dxa" w:w="2880"/>
-          </w:tcPr>
-          <w:p>
-            <w:r>
-              <w:rPr>
-                <w:sz w:val="20"/>
-              </w:rPr>
-              <w:t>Flag para converter PDF via pdf2docx (desabilitado)</w:t>
-            </w:r>
-          </w:p>
-        </w:tc>
-      </w:tr>
-    </w:tbl>
-    <w:p/>
-    <w:p>
-      <w:pPr>
-        <w:pStyle w:val="Heading1"/>
-      </w:pPr>
-      <w:r>
-        <w:t>10. SUÍTE DE TESTES</w:t>
-      </w:r>
-    </w:p>
-    <w:p>
-      <w:r>
-        <w:t>A suíte de testes automatizados utiliza pytest e cobre os principais fluxos do sistema. Comando de execução: .venv\Scripts\python.exe -m pytest -q Última execução (30/08/2026): 767 passed, 25 skipped (~96s).</w:t>
-      </w:r>
-    </w:p>
-    <w:tbl>
-      <w:tblPr>
-        <w:tblStyle w:val="LightGrid-Accent1"/>
-        <w:tblW w:type="auto" w:w="0"/>
-        <w:jc w:val="center"/>
-        <w:tblLook w:firstColumn="1" w:firstRow="1" w:lastColumn="0" w:lastRow="0" w:noHBand="0" w:noVBand="1" w:val="04A0"/>
-      </w:tblPr>
-      <w:tblGrid>
-        <w:gridCol w:w="4320"/>
-        <w:gridCol w:w="4320"/>
-      </w:tblGrid>
-      <w:tr>
-        <w:tc>
-          <w:tcPr>
-            <w:tcW w:type="dxa" w:w="4320"/>
-          </w:tcPr>
-          <w:p>
-            <w:r>
-              <w:rPr>
-                <w:b/>
-                <w:sz w:val="20"/>
-              </w:rPr>
-              <w:t>Arquivo de Teste</w:t>
+              <w:t>C, H, J, E</w:t>
             </w:r>
           </w:p>
         </w:tc>
         <w:tc>
           <w:tcPr>
             <w:tcW w:type="dxa" w:w="4320"/>
+            <w:shd w:fill="F9FBFD"/>
+            <w:tcMar>
+              <w:top w:w="90" w:type="dxa"/>
+              <w:bottom w:w="90" w:type="dxa"/>
+              <w:left w:w="140" w:type="dxa"/>
+              <w:right w:w="140" w:type="dxa"/>
+            </w:tcMar>
           </w:tcPr>
           <w:p>
+            <w:pPr>
+              <w:spacing w:after="0"/>
+            </w:pPr>
             <w:r>
               <w:rPr>
-                <w:b/>
-                <w:sz w:val="20"/>
+                <w:rFonts w:ascii="Calibri" w:hAnsi="Calibri"/>
+                <w:color w:val="333333"/>
+                <w:sz w:val="19"/>
               </w:rPr>
-              <w:t>Área Coberta</w:t>
-            </w:r>
-          </w:p>
-        </w:tc>
-      </w:tr>
-      <w:tr>
-        <w:tc>
-          <w:tcPr>
-            <w:tcW w:type="dxa" w:w="4320"/>
-          </w:tcPr>
-          <w:p>
-            <w:r>
-              <w:rPr>
-                <w:sz w:val="20"/>
-              </w:rPr>
-              <w:t>test_eja_rotas.py</w:t>
-            </w:r>
-          </w:p>
-        </w:tc>
-        <w:tc>
-          <w:tcPr>
-            <w:tcW w:type="dxa" w:w="4320"/>
-          </w:tcPr>
-          <w:p>
-            <w:r>
-              <w:rPr>
-                <w:sz w:val="20"/>
-              </w:rPr>
-              <w:t>Resolução de pastas e rotas EJA</w:t>
-            </w:r>
-          </w:p>
-        </w:tc>
-      </w:tr>
-      <w:tr>
-        <w:tc>
-          <w:tcPr>
-            <w:tcW w:type="dxa" w:w="4320"/>
-          </w:tcPr>
-          <w:p>
-            <w:r>
-              <w:rPr>
-                <w:sz w:val="20"/>
-              </w:rPr>
-              <w:t>test_eja_metodologia.py</w:t>
-            </w:r>
-          </w:p>
-        </w:tc>
-        <w:tc>
-          <w:tcPr>
-            <w:tcW w:type="dxa" w:w="4320"/>
-          </w:tcPr>
-          <w:p>
-            <w:r>
-              <w:rPr>
-                <w:sz w:val="20"/>
-              </w:rPr>
-              <w:t>Metodologia específica EJA</w:t>
-            </w:r>
-          </w:p>
-        </w:tc>
-      </w:tr>
-      <w:tr>
-        <w:tc>
-          <w:tcPr>
-            <w:tcW w:type="dxa" w:w="4320"/>
-          </w:tcPr>
-          <w:p>
-            <w:r>
-              <w:rPr>
-                <w:sz w:val="20"/>
-              </w:rPr>
-              <w:t>test_cadastro_professores_db.py</w:t>
-            </w:r>
-          </w:p>
-        </w:tc>
-        <w:tc>
-          <w:tcPr>
-            <w:tcW w:type="dxa" w:w="4320"/>
-          </w:tcPr>
-          <w:p>
-            <w:r>
-              <w:rPr>
-                <w:sz w:val="20"/>
-              </w:rPr>
-              <w:t>CRUD de cadastro no banco</w:t>
-            </w:r>
-          </w:p>
-        </w:tc>
-      </w:tr>
-      <w:tr>
-        <w:tc>
-          <w:tcPr>
-            <w:tcW w:type="dxa" w:w="4320"/>
-          </w:tcPr>
-          <w:p>
-            <w:r>
-              <w:rPr>
-                <w:sz w:val="20"/>
-              </w:rPr>
-              <w:t>test_config_database_integracao.py</w:t>
-            </w:r>
-          </w:p>
-        </w:tc>
-        <w:tc>
-          <w:tcPr>
-            <w:tcW w:type="dxa" w:w="4320"/>
-          </w:tcPr>
-          <w:p>
-            <w:r>
-              <w:rPr>
-                <w:sz w:val="20"/>
-              </w:rPr>
-              <w:t>Integração config↔database</w:t>
-            </w:r>
-          </w:p>
-        </w:tc>
-      </w:tr>
-      <w:tr>
-        <w:tc>
-          <w:tcPr>
-            <w:tcW w:type="dxa" w:w="4320"/>
-          </w:tcPr>
-          <w:p>
-            <w:r>
-              <w:rPr>
-                <w:sz w:val="20"/>
-              </w:rPr>
-              <w:t>test_database_pragmas.py</w:t>
-            </w:r>
-          </w:p>
-        </w:tc>
-        <w:tc>
-          <w:tcPr>
-            <w:tcW w:type="dxa" w:w="4320"/>
-          </w:tcPr>
-          <w:p>
-            <w:r>
-              <w:rPr>
-                <w:sz w:val="20"/>
-              </w:rPr>
-              <w:t>PRAGMAs do SQLite (WAL, FK)</w:t>
-            </w:r>
-          </w:p>
-        </w:tc>
-      </w:tr>
-      <w:tr>
-        <w:tc>
-          <w:tcPr>
-            <w:tcW w:type="dxa" w:w="4320"/>
-          </w:tcPr>
-          <w:p>
-            <w:r>
-              <w:rPr>
-                <w:sz w:val="20"/>
-              </w:rPr>
-              <w:t>test_orientacao_estudos_referencias.py</w:t>
-            </w:r>
-          </w:p>
-        </w:tc>
-        <w:tc>
-          <w:tcPr>
-            <w:tcW w:type="dxa" w:w="4320"/>
-          </w:tcPr>
-          <w:p>
-            <w:r>
-              <w:rPr>
-                <w:sz w:val="20"/>
-              </w:rPr>
-              <w:t>Referências para O.E.</w:t>
-            </w:r>
-          </w:p>
-        </w:tc>
-      </w:tr>
-      <w:tr>
-        <w:tc>
-          <w:tcPr>
-            <w:tcW w:type="dxa" w:w="4320"/>
-          </w:tcPr>
-          <w:p>
-            <w:r>
-              <w:rPr>
-                <w:sz w:val="20"/>
-              </w:rPr>
-              <w:t>test_referencias_docx_padrao.py</w:t>
-            </w:r>
-          </w:p>
-        </w:tc>
-        <w:tc>
-          <w:tcPr>
-            <w:tcW w:type="dxa" w:w="4320"/>
-          </w:tcPr>
-          <w:p>
-            <w:r>
-              <w:rPr>
-                <w:sz w:val="20"/>
-              </w:rPr>
-              <w:t>Leitura de DOCX de referência</w:t>
-            </w:r>
-          </w:p>
-        </w:tc>
-      </w:tr>
-      <w:tr>
-        <w:tc>
-          <w:tcPr>
-            <w:tcW w:type="dxa" w:w="4320"/>
-          </w:tcPr>
-          <w:p>
-            <w:r>
-              <w:rPr>
-                <w:sz w:val="20"/>
-              </w:rPr>
-              <w:t>test_higienizador_pedagogico.py</w:t>
-            </w:r>
-          </w:p>
-        </w:tc>
-        <w:tc>
-          <w:tcPr>
-            <w:tcW w:type="dxa" w:w="4320"/>
-          </w:tcPr>
-          <w:p>
-            <w:r>
-              <w:rPr>
-                <w:sz w:val="20"/>
-              </w:rPr>
-              <w:t>Regras de higienização</w:t>
-            </w:r>
-          </w:p>
-        </w:tc>
-      </w:tr>
-      <w:tr>
-        <w:tc>
-          <w:tcPr>
-            <w:tcW w:type="dxa" w:w="4320"/>
-          </w:tcPr>
-          <w:p>
-            <w:r>
-              <w:rPr>
-                <w:sz w:val="20"/>
-              </w:rPr>
-              <w:t>test_revisao_final.py</w:t>
-            </w:r>
-          </w:p>
-        </w:tc>
-        <w:tc>
-          <w:tcPr>
-            <w:tcW w:type="dxa" w:w="4320"/>
-          </w:tcPr>
-          <w:p>
-            <w:r>
-              <w:rPr>
-                <w:sz w:val="20"/>
-              </w:rPr>
-              <w:t>Confidence score e revisão</w:t>
-            </w:r>
-          </w:p>
-        </w:tc>
-      </w:tr>
-      <w:tr>
-        <w:tc>
-          <w:tcPr>
-            <w:tcW w:type="dxa" w:w="4320"/>
-          </w:tcPr>
-          <w:p>
-            <w:r>
-              <w:rPr>
-                <w:sz w:val="20"/>
-              </w:rPr>
-              <w:t>test_extracao_palavras_chave_pdf.py</w:t>
-            </w:r>
-          </w:p>
-        </w:tc>
-        <w:tc>
-          <w:tcPr>
-            <w:tcW w:type="dxa" w:w="4320"/>
-          </w:tcPr>
-          <w:p>
-            <w:r>
-              <w:rPr>
-                <w:sz w:val="20"/>
-              </w:rPr>
-              <w:t>Extração de palavras-chave</w:t>
-            </w:r>
-          </w:p>
-        </w:tc>
-      </w:tr>
-      <w:tr>
-        <w:tc>
-          <w:tcPr>
-            <w:tcW w:type="dxa" w:w="4320"/>
-          </w:tcPr>
-          <w:p>
-            <w:r>
-              <w:rPr>
-                <w:sz w:val="20"/>
-              </w:rPr>
-              <w:t>test_docx_final_cleanup.py</w:t>
-            </w:r>
-          </w:p>
-        </w:tc>
-        <w:tc>
-          <w:tcPr>
-            <w:tcW w:type="dxa" w:w="4320"/>
-          </w:tcPr>
-          <w:p>
-            <w:r>
-              <w:rPr>
-                <w:sz w:val="20"/>
-              </w:rPr>
-              <w:t>Limpeza do DOCX gerado</w:t>
-            </w:r>
-          </w:p>
-        </w:tc>
-      </w:tr>
-      <w:tr>
-        <w:tc>
-          <w:tcPr>
-            <w:tcW w:type="dxa" w:w="4320"/>
-          </w:tcPr>
-          <w:p>
-            <w:r>
-              <w:rPr>
-                <w:sz w:val="20"/>
-              </w:rPr>
-              <w:t>test_calendario_escolar.py</w:t>
-            </w:r>
-          </w:p>
-        </w:tc>
-        <w:tc>
-          <w:tcPr>
-            <w:tcW w:type="dxa" w:w="4320"/>
-          </w:tcPr>
-          <w:p>
-            <w:r>
-              <w:rPr>
-                <w:sz w:val="20"/>
-              </w:rPr>
-              <w:t>Calendário mensal com feriados</w:t>
-            </w:r>
-          </w:p>
-        </w:tc>
-      </w:tr>
-      <w:tr>
-        <w:tc>
-          <w:tcPr>
-            <w:tcW w:type="dxa" w:w="4320"/>
-          </w:tcPr>
-          <w:p>
-            <w:r>
-              <w:rPr>
-                <w:sz w:val="20"/>
-              </w:rPr>
-              <w:t>test_validador_plano.py</w:t>
-            </w:r>
-          </w:p>
-        </w:tc>
-        <w:tc>
-          <w:tcPr>
-            <w:tcW w:type="dxa" w:w="4320"/>
-          </w:tcPr>
-          <w:p>
-            <w:r>
-              <w:rPr>
-                <w:sz w:val="20"/>
-              </w:rPr>
-              <w:t>Validação de aulas geradas</w:t>
-            </w:r>
-          </w:p>
-        </w:tc>
-      </w:tr>
-      <w:tr>
-        <w:tc>
-          <w:tcPr>
-            <w:tcW w:type="dxa" w:w="4320"/>
-          </w:tcPr>
-          <w:p>
-            <w:r>
-              <w:rPr>
-                <w:sz w:val="20"/>
-              </w:rPr>
-              <w:t>test_fluxo_principal_sem_lote.py</w:t>
-            </w:r>
-          </w:p>
-        </w:tc>
-        <w:tc>
-          <w:tcPr>
-            <w:tcW w:type="dxa" w:w="4320"/>
-          </w:tcPr>
-          <w:p>
-            <w:r>
-              <w:rPr>
-                <w:sz w:val="20"/>
-              </w:rPr>
-              <w:t>Fluxo sem orquestrador</w:t>
-            </w:r>
-          </w:p>
-        </w:tc>
-      </w:tr>
-      <w:tr>
-        <w:tc>
-          <w:tcPr>
-            <w:tcW w:type="dxa" w:w="4320"/>
-          </w:tcPr>
-          <w:p>
-            <w:r>
-              <w:rPr>
-                <w:sz w:val="20"/>
-              </w:rPr>
-              <w:t>test_gerador_colunas_pedagogicas.py</w:t>
-            </w:r>
-          </w:p>
-        </w:tc>
-        <w:tc>
-          <w:tcPr>
-            <w:tcW w:type="dxa" w:w="4320"/>
-          </w:tcPr>
-          <w:p>
-            <w:r>
-              <w:rPr>
-                <w:sz w:val="20"/>
-              </w:rPr>
-              <w:t>Geração integrada de colunas</w:t>
-            </w:r>
-          </w:p>
-        </w:tc>
-      </w:tr>
-      <w:tr>
-        <w:tc>
-          <w:tcPr>
-            <w:tcW w:type="dxa" w:w="4320"/>
-          </w:tcPr>
-          <w:p>
-            <w:r>
-              <w:rPr>
-                <w:sz w:val="20"/>
-              </w:rPr>
-              <w:t>test_resultados_aula_core.py</w:t>
-            </w:r>
-          </w:p>
-        </w:tc>
-        <w:tc>
-          <w:tcPr>
-            <w:tcW w:type="dxa" w:w="4320"/>
-          </w:tcPr>
-          <w:p>
-            <w:r>
-              <w:rPr>
-                <w:sz w:val="20"/>
-              </w:rPr>
-              <w:t>Montagem de resultados</w:t>
-            </w:r>
-          </w:p>
-        </w:tc>
-      </w:tr>
-      <w:tr>
-        <w:tc>
-          <w:tcPr>
-            <w:tcW w:type="dxa" w:w="4320"/>
-          </w:tcPr>
-          <w:p>
-            <w:r>
-              <w:rPr>
-                <w:sz w:val="20"/>
-              </w:rPr>
-              <w:t>test_lingua_portuguesa_em_contextual.py</w:t>
-            </w:r>
-          </w:p>
-        </w:tc>
-        <w:tc>
-          <w:tcPr>
-            <w:tcW w:type="dxa" w:w="4320"/>
-          </w:tcPr>
-          <w:p>
-            <w:r>
-              <w:rPr>
-                <w:sz w:val="20"/>
-              </w:rPr>
-              <w:t>LP Ensino Médio</w:t>
-            </w:r>
-          </w:p>
-        </w:tc>
-      </w:tr>
-      <w:tr>
-        <w:tc>
-          <w:tcPr>
-            <w:tcW w:type="dxa" w:w="4320"/>
-          </w:tcPr>
-          <w:p>
-            <w:r>
-              <w:rPr>
-                <w:sz w:val="20"/>
-              </w:rPr>
-              <w:t>test_portugues_ef_3bimestre.py</w:t>
-            </w:r>
-          </w:p>
-        </w:tc>
-        <w:tc>
-          <w:tcPr>
-            <w:tcW w:type="dxa" w:w="4320"/>
-          </w:tcPr>
-          <w:p>
-            <w:r>
-              <w:rPr>
-                <w:sz w:val="20"/>
-              </w:rPr>
-              <w:t>LP Ensino Fundamental 3ºBi</w:t>
+              <w:t>ARTE/...</w:t>
             </w:r>
           </w:p>
         </w:tc>
       </w:tr>
     </w:tbl>
+    <w:p>
+      <w:pPr>
+        <w:spacing w:after="160"/>
+      </w:pPr>
+    </w:p>
+    <w:p>
+      <w:pPr>
+        <w:keepNext/>
+        <w:spacing w:before="280" w:after="120"/>
+      </w:pPr>
+      <w:r>
+        <w:rPr>
+          <w:rFonts w:ascii="Calibri" w:hAnsi="Calibri"/>
+          <w:b/>
+          <w:color w:val="1B365D"/>
+          <w:sz w:val="30"/>
+        </w:rPr>
+        <w:t>5. BANCO DE DADOS E ARMAZENAMENTO</w:t>
+      </w:r>
+    </w:p>
+    <w:p>
+      <w:pPr>
+        <w:spacing w:after="120" w:line="276" w:lineRule="auto"/>
+      </w:pPr>
+      <w:r>
+        <w:rPr>
+          <w:rFonts w:ascii="Calibri" w:hAnsi="Calibri"/>
+          <w:color w:val="333333"/>
+          <w:sz w:val="21"/>
+        </w:rPr>
+        <w:t>O banco de dados SQLite local está situado em PLANOS_LUAN_DADOS/planos_luan.db, operando com modo WAL (Write-Ahead Logging) e foreign keys ativadas. As principais tabelas são:</w:t>
+      </w:r>
+    </w:p>
+    <w:p>
+      <w:pPr>
+        <w:spacing w:after="120" w:line="276" w:lineRule="auto"/>
+      </w:pPr>
+      <w:r>
+        <w:rPr>
+          <w:rFonts w:ascii="Calibri" w:hAnsi="Calibri"/>
+          <w:b/>
+          <w:color w:val="222222"/>
+          <w:sz w:val="21"/>
+        </w:rPr>
+        <w:t xml:space="preserve">Tabela 1: </w:t>
+      </w:r>
+      <w:r>
+        <w:rPr>
+          <w:rFonts w:ascii="Calibri" w:hAnsi="Calibri"/>
+          <w:color w:val="333333"/>
+          <w:sz w:val="21"/>
+        </w:rPr>
+        <w:t>• professores: id, nome (UNIQUE)</w:t>
+      </w:r>
+    </w:p>
+    <w:p>
+      <w:pPr>
+        <w:spacing w:after="120" w:line="276" w:lineRule="auto"/>
+      </w:pPr>
+      <w:r>
+        <w:rPr>
+          <w:rFonts w:ascii="Calibri" w:hAnsi="Calibri"/>
+          <w:b/>
+          <w:color w:val="222222"/>
+          <w:sz w:val="21"/>
+        </w:rPr>
+        <w:t xml:space="preserve">Tabela 2: </w:t>
+      </w:r>
+      <w:r>
+        <w:rPr>
+          <w:rFonts w:ascii="Calibri" w:hAnsi="Calibri"/>
+          <w:color w:val="333333"/>
+          <w:sz w:val="21"/>
+        </w:rPr>
+        <w:t>• professor_turmas: id, professor_id (FK), disciplina, turma, dia_semana, horario, aulas_semana, arquivo_modelo, template_id, componente_curricular</w:t>
+      </w:r>
+    </w:p>
+    <w:p>
+      <w:pPr>
+        <w:spacing w:after="120" w:line="276" w:lineRule="auto"/>
+      </w:pPr>
+      <w:r>
+        <w:rPr>
+          <w:rFonts w:ascii="Calibri" w:hAnsi="Calibri"/>
+          <w:b/>
+          <w:color w:val="222222"/>
+          <w:sz w:val="21"/>
+        </w:rPr>
+        <w:t xml:space="preserve">Tabela 3: </w:t>
+      </w:r>
+      <w:r>
+        <w:rPr>
+          <w:rFonts w:ascii="Calibri" w:hAnsi="Calibri"/>
+          <w:color w:val="333333"/>
+          <w:sz w:val="21"/>
+        </w:rPr>
+        <w:t>• historico_planos: id, professor_nome, disciplina, turma, bimestre, data_geracao, arquivo_nome, arquivo_path</w:t>
+      </w:r>
+    </w:p>
+    <w:p>
+      <w:pPr>
+        <w:spacing w:after="120" w:line="276" w:lineRule="auto"/>
+      </w:pPr>
+      <w:r>
+        <w:rPr>
+          <w:rFonts w:ascii="Calibri" w:hAnsi="Calibri"/>
+          <w:b/>
+          <w:color w:val="222222"/>
+          <w:sz w:val="21"/>
+        </w:rPr>
+        <w:t xml:space="preserve">Tabela 4: </w:t>
+      </w:r>
+      <w:r>
+        <w:rPr>
+          <w:rFonts w:ascii="Calibri" w:hAnsi="Calibri"/>
+          <w:color w:val="333333"/>
+          <w:sz w:val="21"/>
+        </w:rPr>
+        <w:t>• configuracoes: chave (PK), valor</w:t>
+      </w:r>
+    </w:p>
+    <w:p>
+      <w:pPr>
+        <w:keepNext/>
+        <w:spacing w:before="280" w:after="120"/>
+      </w:pPr>
+      <w:r>
+        <w:rPr>
+          <w:rFonts w:ascii="Calibri" w:hAnsi="Calibri"/>
+          <w:b/>
+          <w:color w:val="1B365D"/>
+          <w:sz w:val="30"/>
+        </w:rPr>
+        <w:t>6. SUÍTE DE TESTES E QUALIDADE</w:t>
+      </w:r>
+    </w:p>
+    <w:tbl>
+      <w:tblPr>
+        <w:tblW w:type="auto" w:w="0"/>
+        <w:jc w:val="center"/>
+        <w:tblLook w:firstColumn="1" w:firstRow="1" w:lastColumn="0" w:lastRow="0" w:noHBand="0" w:noVBand="1" w:val="04A0"/>
+      </w:tblPr>
+      <w:tblGrid>
+        <w:gridCol w:w="9936"/>
+      </w:tblGrid>
+      <w:tr>
+        <w:tc>
+          <w:tcPr>
+            <w:tcW w:type="dxa" w:w="9936"/>
+            <w:shd w:fill="F0F4F8"/>
+            <w:tcMar>
+              <w:top w:w="140" w:type="dxa"/>
+              <w:bottom w:w="140" w:type="dxa"/>
+              <w:left w:w="200" w:type="dxa"/>
+              <w:right w:w="200" w:type="dxa"/>
+            </w:tcMar>
+          </w:tcPr>
+          <w:p>
+            <w:pPr>
+              <w:spacing w:after="0"/>
+            </w:pPr>
+            <w:r>
+              <w:rPr>
+                <w:rFonts w:ascii="Calibri" w:hAnsi="Calibri"/>
+                <w:b/>
+                <w:color w:val="1B365D"/>
+                <w:sz w:val="20"/>
+              </w:rPr>
+              <w:t xml:space="preserve">CERTIFICAÇÃO DE TESTES: </w:t>
+            </w:r>
+            <w:r>
+              <w:rPr>
+                <w:rFonts w:ascii="Calibri" w:hAnsi="Calibri"/>
+                <w:color w:val="333333"/>
+                <w:sz w:val="20"/>
+              </w:rPr>
+              <w:t>Total de 800 testes automatizados aprovados (800 passed, 25 skipped). Cobertura completa de rotas, geração Word, normalização, migrações de banco e regras pedagógicas.</w:t>
+            </w:r>
+          </w:p>
+        </w:tc>
+      </w:tr>
+    </w:tbl>
+    <w:p>
+      <w:pPr>
+        <w:spacing w:after="120"/>
+      </w:pPr>
+    </w:p>
     <w:sectPr>
       <w:pgSz w:w="12240" w:h="15840"/>
-      <w:pgMar w:top="1440" w:right="1800" w:bottom="1440" w:left="1800" w:header="720" w:footer="720" w:gutter="0"/>
+      <w:pgMar w:top="1152" w:right="1152" w:bottom="1152" w:left="1152" w:header="720" w:footer="720" w:gutter="0"/>
       <w:cols w:space="720"/>
       <w:docGrid w:linePitch="360"/>
     </w:sectPr>
@@ -2505,10 +2253,6 @@
     <w:name w:val="Normal"/>
     <w:qFormat/>
     <w:rsid w:val="00FC693F"/>
-    <w:rPr>
-      <w:rFonts w:ascii="Calibri" w:hAnsi="Calibri"/>
-      <w:sz w:val="22"/>
-    </w:rPr>
   </w:style>
   <w:style w:type="paragraph" w:styleId="Header">
     <w:name w:val="header"/>

</xml_diff>

<commit_message>
feat: Implementa Gerador de PEI em Lote Inclusao e ajustes gerais
</commit_message>
<xml_diff>
--- a/DOCUMENTACAO_SISTEMA_PLANOS_LUAN.docx
+++ b/DOCUMENTACAO_SISTEMA_PLANOS_LUAN.docx
@@ -4,54 +4,165 @@
   <w:body>
     <w:p>
       <w:pPr>
-        <w:pStyle w:val="Title"/>
         <w:jc w:val="center"/>
       </w:pPr>
       <w:r>
         <w:rPr>
+          <w:rFonts w:ascii="Calibri" w:hAnsi="Calibri"/>
           <w:b/>
+          <w:color w:val="1B365D"/>
+          <w:sz w:val="44"/>
         </w:rPr>
-        <w:t>Documentacao Atual do Sistema PLANOS_LUAN</w:t>
+        <w:t>DOCUMENTAÇÃO DO SISTEMA PLANOS LUAN</w:t>
       </w:r>
     </w:p>
     <w:p>
+      <w:pPr>
+        <w:jc w:val="center"/>
+      </w:pPr>
       <w:r>
-        <w:t>Documento atualizado automaticamente em 26/06/2026 às 20:23, em linguagem simples, descrevendo o comportamento real do sistema hoje.</w:t>
+        <w:t>Manual de Arquitetura, Funcionalidades e Regras de Neg?cio | v1.2.14 | Atualizado em 03/10/2026</w:t>
       </w:r>
     </w:p>
     <w:p>
+      <w:pPr>
+        <w:spacing w:after="240"/>
+      </w:pPr>
+    </w:p>
+    <w:p>
+      <w:pPr>
+        <w:keepNext/>
+        <w:spacing w:before="280" w:after="120"/>
+      </w:pPr>
       <w:r>
-        <w:t>Leitura proposta</w:t>
+        <w:rPr>
+          <w:rFonts w:ascii="Calibri" w:hAnsi="Calibri"/>
+          <w:b/>
+          <w:color w:val="1B365D"/>
+          <w:sz w:val="30"/>
+        </w:rPr>
+        <w:t>1. INTRODUÇÃO E VISÃO GERAL</w:t>
+      </w:r>
+    </w:p>
+    <w:p>
+      <w:pPr>
+        <w:spacing w:after="120" w:line="276" w:lineRule="auto"/>
+      </w:pPr>
+      <w:r>
+        <w:rPr>
+          <w:rFonts w:ascii="Calibri" w:hAnsi="Calibri"/>
+          <w:color w:val="333333"/>
+          <w:sz w:val="21"/>
+        </w:rPr>
+        <w:t>O Planos Luan é uma solução completa em Python e Streamlit projetada para gerar planos mensais de aula padronizados em formato Microsoft Word (.docx). O sistema combina leitura inteligente de materiais pedagógicos em PDF/PPTX, motores de regras determinísticas, integração opcional com IA generativa (OpenAI GPT-4o-mini e Google Gemini 2.5 Flash), validação pedagógica estrita e preenchimento de templates Word em conformidade com as diretrizes da SEDUC-SP.</w:t>
+      </w:r>
+    </w:p>
+    <w:p>
+      <w:pPr>
+        <w:keepNext/>
+        <w:spacing w:before="280" w:after="120"/>
+      </w:pPr>
+      <w:r>
+        <w:rPr>
+          <w:rFonts w:ascii="Calibri" w:hAnsi="Calibri"/>
+          <w:b/>
+          <w:color w:val="1B365D"/>
+          <w:sz w:val="30"/>
+        </w:rPr>
+        <w:t>2. MODALIDADES E ABAS DA INTERFACE</w:t>
       </w:r>
     </w:p>
     <w:tbl>
       <w:tblPr>
-        <w:tblStyle w:val="TableGrid"/>
+        <w:tblStyle w:val="LightGrid-Accent1"/>
         <w:tblW w:type="auto" w:w="0"/>
+        <w:jc w:val="center"/>
         <w:tblLook w:firstColumn="1" w:firstRow="1" w:lastColumn="0" w:lastRow="0" w:noHBand="0" w:noVBand="1" w:val="04A0"/>
       </w:tblPr>
       <w:tblGrid>
-        <w:gridCol w:w="4680"/>
-        <w:gridCol w:w="4680"/>
+        <w:gridCol w:w="3312"/>
+        <w:gridCol w:w="3312"/>
+        <w:gridCol w:w="3312"/>
       </w:tblGrid>
       <w:tr>
         <w:tc>
           <w:tcPr>
-            <w:tcW w:type="dxa" w:w="4680"/>
+            <w:tcW w:type="dxa" w:w="2160"/>
+            <w:shd w:fill="1B365D"/>
+            <w:tcMar>
+              <w:top w:w="120" w:type="dxa"/>
+              <w:bottom w:w="120" w:type="dxa"/>
+              <w:left w:w="140" w:type="dxa"/>
+              <w:right w:w="140" w:type="dxa"/>
+            </w:tcMar>
           </w:tcPr>
           <w:p>
+            <w:pPr>
+              <w:spacing w:after="0"/>
+              <w:jc w:val="left"/>
+            </w:pPr>
             <w:r>
-              <w:t>Campo</w:t>
+              <w:rPr>
+                <w:rFonts w:ascii="Calibri" w:hAnsi="Calibri"/>
+                <w:b/>
+                <w:color w:val="FFFFFF"/>
+                <w:sz w:val="20"/>
+              </w:rPr>
+              <w:t>Aba / Modo</w:t>
             </w:r>
           </w:p>
         </w:tc>
         <w:tc>
           <w:tcPr>
-            <w:tcW w:type="dxa" w:w="4680"/>
+            <w:tcW w:type="dxa" w:w="3600"/>
+            <w:shd w:fill="1B365D"/>
+            <w:tcMar>
+              <w:top w:w="120" w:type="dxa"/>
+              <w:bottom w:w="120" w:type="dxa"/>
+              <w:left w:w="140" w:type="dxa"/>
+              <w:right w:w="140" w:type="dxa"/>
+            </w:tcMar>
           </w:tcPr>
           <w:p>
+            <w:pPr>
+              <w:spacing w:after="0"/>
+              <w:jc w:val="left"/>
+            </w:pPr>
             <w:r>
-              <w:t>Descricao</w:t>
+              <w:rPr>
+                <w:rFonts w:ascii="Calibri" w:hAnsi="Calibri"/>
+                <w:b/>
+                <w:color w:val="FFFFFF"/>
+                <w:sz w:val="20"/>
+              </w:rPr>
+              <w:t>Público-Alvo e Finalidade</w:t>
+            </w:r>
+          </w:p>
+        </w:tc>
+        <w:tc>
+          <w:tcPr>
+            <w:tcW w:type="dxa" w:w="4320"/>
+            <w:shd w:fill="1B365D"/>
+            <w:tcMar>
+              <w:top w:w="120" w:type="dxa"/>
+              <w:bottom w:w="120" w:type="dxa"/>
+              <w:left w:w="140" w:type="dxa"/>
+              <w:right w:w="140" w:type="dxa"/>
+            </w:tcMar>
+          </w:tcPr>
+          <w:p>
+            <w:pPr>
+              <w:spacing w:after="0"/>
+              <w:jc w:val="left"/>
+            </w:pPr>
+            <w:r>
+              <w:rPr>
+                <w:rFonts w:ascii="Calibri" w:hAnsi="Calibri"/>
+                <w:b/>
+                <w:color w:val="FFFFFF"/>
+                <w:sz w:val="20"/>
+              </w:rPr>
+              <w:t>Regras e Particularidades</w:t>
             </w:r>
           </w:p>
         </w:tc>
@@ -59,21 +170,562 @@
       <w:tr>
         <w:tc>
           <w:tcPr>
-            <w:tcW w:type="dxa" w:w="4680"/>
+            <w:tcW w:type="dxa" w:w="2160"/>
+            <w:shd w:fill="FFFFFF"/>
+            <w:tcMar>
+              <w:top w:w="90" w:type="dxa"/>
+              <w:bottom w:w="90" w:type="dxa"/>
+              <w:left w:w="140" w:type="dxa"/>
+              <w:right w:w="140" w:type="dxa"/>
+            </w:tcMar>
           </w:tcPr>
           <w:p>
+            <w:pPr>
+              <w:spacing w:after="0"/>
+            </w:pPr>
             <w:r>
-              <w:t>Leitura proposta</w:t>
+              <w:rPr>
+                <w:rFonts w:ascii="Calibri" w:hAnsi="Calibri"/>
+                <w:color w:val="333333"/>
+                <w:sz w:val="19"/>
+              </w:rPr>
+              <w:t>Planos Gerais</w:t>
             </w:r>
           </w:p>
         </w:tc>
         <w:tc>
           <w:tcPr>
-            <w:tcW w:type="dxa" w:w="4680"/>
+            <w:tcW w:type="dxa" w:w="3600"/>
+            <w:shd w:fill="FFFFFF"/>
+            <w:tcMar>
+              <w:top w:w="90" w:type="dxa"/>
+              <w:bottom w:w="90" w:type="dxa"/>
+              <w:left w:w="140" w:type="dxa"/>
+              <w:right w:w="140" w:type="dxa"/>
+            </w:tcMar>
+          </w:tcPr>
+          <w:p>
+            <w:pPr>
+              <w:spacing w:after="0"/>
+            </w:pPr>
+            <w:r>
+              <w:rPr>
+                <w:rFonts w:ascii="Calibri" w:hAnsi="Calibri"/>
+                <w:color w:val="333333"/>
+                <w:sz w:val="19"/>
+              </w:rPr>
+              <w:t>Aulas regulares de Ensino Fundamental e Médio</w:t>
+            </w:r>
+          </w:p>
+        </w:tc>
+        <w:tc>
+          <w:tcPr>
+            <w:tcW w:type="dxa" w:w="4320"/>
+            <w:shd w:fill="FFFFFF"/>
+            <w:tcMar>
+              <w:top w:w="90" w:type="dxa"/>
+              <w:bottom w:w="90" w:type="dxa"/>
+              <w:left w:w="140" w:type="dxa"/>
+              <w:right w:w="140" w:type="dxa"/>
+            </w:tcMar>
+          </w:tcPr>
+          <w:p>
+            <w:pPr>
+              <w:spacing w:after="0"/>
+            </w:pPr>
+            <w:r>
+              <w:rPr>
+                <w:rFonts w:ascii="Calibri" w:hAnsi="Calibri"/>
+                <w:color w:val="333333"/>
+                <w:sz w:val="19"/>
+              </w:rPr>
+              <w:t>Usa PDFs regulares ou DOCX de referência. Metodologia em 4 etapas (até 300 caracteres por etapa). Suporte a 1 dia sem PDF para Português.</w:t>
+            </w:r>
+          </w:p>
+        </w:tc>
+      </w:tr>
+      <w:tr>
+        <w:tc>
+          <w:tcPr>
+            <w:tcW w:type="dxa" w:w="2160"/>
+            <w:shd w:fill="F9FBFD"/>
+            <w:tcMar>
+              <w:top w:w="90" w:type="dxa"/>
+              <w:bottom w:w="90" w:type="dxa"/>
+              <w:left w:w="140" w:type="dxa"/>
+              <w:right w:w="140" w:type="dxa"/>
+            </w:tcMar>
+          </w:tcPr>
+          <w:p>
+            <w:pPr>
+              <w:spacing w:after="0"/>
+            </w:pPr>
+            <w:r>
+              <w:rPr>
+                <w:rFonts w:ascii="Calibri" w:hAnsi="Calibri"/>
+                <w:color w:val="333333"/>
+                <w:sz w:val="19"/>
+              </w:rPr>
+              <w:t>CDP - Ciclo I</w:t>
+            </w:r>
+          </w:p>
+        </w:tc>
+        <w:tc>
+          <w:tcPr>
+            <w:tcW w:type="dxa" w:w="3600"/>
+            <w:shd w:fill="F9FBFD"/>
+            <w:tcMar>
+              <w:top w:w="90" w:type="dxa"/>
+              <w:bottom w:w="90" w:type="dxa"/>
+              <w:left w:w="140" w:type="dxa"/>
+              <w:right w:w="140" w:type="dxa"/>
+            </w:tcMar>
+          </w:tcPr>
+          <w:p>
+            <w:pPr>
+              <w:spacing w:after="0"/>
+            </w:pPr>
+            <w:r>
+              <w:rPr>
+                <w:rFonts w:ascii="Calibri" w:hAnsi="Calibri"/>
+                <w:color w:val="333333"/>
+                <w:sz w:val="19"/>
+              </w:rPr>
+              <w:t>Anos Iniciais / Alfabetização em privação de liberdade</w:t>
+            </w:r>
+          </w:p>
+        </w:tc>
+        <w:tc>
+          <w:tcPr>
+            <w:tcW w:type="dxa" w:w="4320"/>
+            <w:shd w:fill="F9FBFD"/>
+            <w:tcMar>
+              <w:top w:w="90" w:type="dxa"/>
+              <w:bottom w:w="90" w:type="dxa"/>
+              <w:left w:w="140" w:type="dxa"/>
+              <w:right w:w="140" w:type="dxa"/>
+            </w:tcMar>
+          </w:tcPr>
+          <w:p>
+            <w:pPr>
+              <w:spacing w:after="0"/>
+            </w:pPr>
+            <w:r>
+              <w:rPr>
+                <w:rFonts w:ascii="Calibri" w:hAnsi="Calibri"/>
+                <w:color w:val="333333"/>
+                <w:sz w:val="19"/>
+              </w:rPr>
+              <w:t>Usa componentes curriculares específicos de Anos Iniciais (Turmas C e D). Sem exigência de PDFs externos.</w:t>
+            </w:r>
+          </w:p>
+        </w:tc>
+      </w:tr>
+      <w:tr>
+        <w:tc>
+          <w:tcPr>
+            <w:tcW w:type="dxa" w:w="2160"/>
+            <w:shd w:fill="FFFFFF"/>
+            <w:tcMar>
+              <w:top w:w="90" w:type="dxa"/>
+              <w:bottom w:w="90" w:type="dxa"/>
+              <w:left w:w="140" w:type="dxa"/>
+              <w:right w:w="140" w:type="dxa"/>
+            </w:tcMar>
           </w:tcPr>
           <w:p>
             <w:r>
-              <w:t>Documento escrito para quem precisa entender o sistema como ferramenta de trabalho: o que ele resolve hoje, como a informacao circula e o que mudou de forma concreta.</w:t>
+              <w:t>CDP-EF/EM</w:t>
+            </w:r>
+          </w:p>
+        </w:tc>
+        <w:tc>
+          <w:tcPr>
+            <w:tcW w:type="dxa" w:w="3600"/>
+            <w:shd w:fill="FFFFFF"/>
+            <w:tcMar>
+              <w:top w:w="90" w:type="dxa"/>
+              <w:bottom w:w="90" w:type="dxa"/>
+              <w:left w:w="140" w:type="dxa"/>
+              <w:right w:w="140" w:type="dxa"/>
+            </w:tcMar>
+          </w:tcPr>
+          <w:p>
+            <w:pPr>
+              <w:spacing w:after="0"/>
+            </w:pPr>
+            <w:r>
+              <w:rPr>
+                <w:rFonts w:ascii="Calibri" w:hAnsi="Calibri"/>
+                <w:color w:val="333333"/>
+                <w:sz w:val="19"/>
+              </w:rPr>
+              <w:t>Ensino Fundamental e Médio em privação de liberdade</w:t>
+            </w:r>
+          </w:p>
+        </w:tc>
+        <w:tc>
+          <w:tcPr>
+            <w:tcW w:type="dxa" w:w="4320"/>
+            <w:shd w:fill="FFFFFF"/>
+            <w:tcMar>
+              <w:top w:w="90" w:type="dxa"/>
+              <w:bottom w:w="90" w:type="dxa"/>
+              <w:left w:w="140" w:type="dxa"/>
+              <w:right w:w="140" w:type="dxa"/>
+            </w:tcMar>
+          </w:tcPr>
+          <w:p>
+            <w:pPr>
+              <w:spacing w:after="0"/>
+            </w:pPr>
+            <w:r>
+              <w:rPr>
+                <w:rFonts w:ascii="Calibri" w:hAnsi="Calibri"/>
+                <w:color w:val="333333"/>
+                <w:sz w:val="19"/>
+              </w:rPr>
+              <w:t>Totalmente padronizado nas 4 turmas (C, H, J, E). Disciplinas no formato '&lt;NOME&gt; - CDP - EJA - MULTISSERIADO'. Restrição estrita a recursos tecnológicos.</w:t>
+            </w:r>
+          </w:p>
+        </w:tc>
+      </w:tr>
+      <w:tr>
+        <w:tc>
+          <w:tcPr>
+            <w:tcW w:type="dxa" w:w="2160"/>
+            <w:shd w:fill="F9FBFD"/>
+            <w:tcMar>
+              <w:top w:w="90" w:type="dxa"/>
+              <w:bottom w:w="90" w:type="dxa"/>
+              <w:left w:w="140" w:type="dxa"/>
+              <w:right w:w="140" w:type="dxa"/>
+            </w:tcMar>
+          </w:tcPr>
+          <w:p>
+            <w:pPr>
+              <w:spacing w:after="0"/>
+            </w:pPr>
+            <w:r>
+              <w:rPr>
+                <w:rFonts w:ascii="Calibri" w:hAnsi="Calibri"/>
+                <w:color w:val="333333"/>
+                <w:sz w:val="19"/>
+              </w:rPr>
+              <w:t>EJA</w:t>
+            </w:r>
+          </w:p>
+        </w:tc>
+        <w:tc>
+          <w:tcPr>
+            <w:tcW w:type="dxa" w:w="3600"/>
+            <w:shd w:fill="F9FBFD"/>
+            <w:tcMar>
+              <w:top w:w="90" w:type="dxa"/>
+              <w:bottom w:w="90" w:type="dxa"/>
+              <w:left w:w="140" w:type="dxa"/>
+              <w:right w:w="140" w:type="dxa"/>
+            </w:tcMar>
+          </w:tcPr>
+          <w:p>
+            <w:pPr>
+              <w:spacing w:after="0"/>
+            </w:pPr>
+            <w:r>
+              <w:rPr>
+                <w:rFonts w:ascii="Calibri" w:hAnsi="Calibri"/>
+                <w:color w:val="333333"/>
+                <w:sz w:val="19"/>
+              </w:rPr>
+              <w:t>Educação de Jovens e Adultos (Regular)</w:t>
+            </w:r>
+          </w:p>
+        </w:tc>
+        <w:tc>
+          <w:tcPr>
+            <w:tcW w:type="dxa" w:w="4320"/>
+            <w:shd w:fill="F9FBFD"/>
+            <w:tcMar>
+              <w:top w:w="90" w:type="dxa"/>
+              <w:bottom w:w="90" w:type="dxa"/>
+              <w:left w:w="140" w:type="dxa"/>
+              <w:right w:w="140" w:type="dxa"/>
+            </w:tcMar>
+          </w:tcPr>
+          <w:p>
+            <w:pPr>
+              <w:spacing w:after="0"/>
+            </w:pPr>
+            <w:r>
+              <w:rPr>
+                <w:rFonts w:ascii="Calibri" w:hAnsi="Calibri"/>
+                <w:color w:val="333333"/>
+                <w:sz w:val="19"/>
+              </w:rPr>
+              <w:t>Linguagem voltada ao mundo do trabalho. Limite estendido para 350 caracteres/etapa. Rotas dedicadas (ex: BIOLOGIA/EJA_BIOLOGIA).</w:t>
+            </w:r>
+          </w:p>
+        </w:tc>
+      </w:tr>
+      <w:tr>
+        <w:tc>
+          <w:tcPr>
+            <w:tcW w:type="dxa" w:w="2160"/>
+            <w:shd w:fill="FFFFFF"/>
+            <w:tcMar>
+              <w:top w:w="90" w:type="dxa"/>
+              <w:bottom w:w="90" w:type="dxa"/>
+              <w:left w:w="140" w:type="dxa"/>
+              <w:right w:w="140" w:type="dxa"/>
+            </w:tcMar>
+          </w:tcPr>
+          <w:p>
+            <w:pPr>
+              <w:spacing w:after="0"/>
+            </w:pPr>
+            <w:r>
+              <w:rPr>
+                <w:rFonts w:ascii="Calibri" w:hAnsi="Calibri"/>
+                <w:color w:val="333333"/>
+                <w:sz w:val="19"/>
+              </w:rPr>
+              <w:t>Cadastro</w:t>
+            </w:r>
+          </w:p>
+        </w:tc>
+        <w:tc>
+          <w:tcPr>
+            <w:tcW w:type="dxa" w:w="3600"/>
+            <w:shd w:fill="FFFFFF"/>
+            <w:tcMar>
+              <w:top w:w="90" w:type="dxa"/>
+              <w:bottom w:w="90" w:type="dxa"/>
+              <w:left w:w="140" w:type="dxa"/>
+              <w:right w:w="140" w:type="dxa"/>
+            </w:tcMar>
+          </w:tcPr>
+          <w:p>
+            <w:pPr>
+              <w:spacing w:after="0"/>
+            </w:pPr>
+            <w:r>
+              <w:rPr>
+                <w:rFonts w:ascii="Calibri" w:hAnsi="Calibri"/>
+                <w:color w:val="333333"/>
+                <w:sz w:val="19"/>
+              </w:rPr>
+              <w:t>Gestão de professores, turmas e horários</w:t>
+            </w:r>
+          </w:p>
+        </w:tc>
+        <w:tc>
+          <w:tcPr>
+            <w:tcW w:type="dxa" w:w="4320"/>
+            <w:shd w:fill="FFFFFF"/>
+            <w:tcMar>
+              <w:top w:w="90" w:type="dxa"/>
+              <w:bottom w:w="90" w:type="dxa"/>
+              <w:left w:w="140" w:type="dxa"/>
+              <w:right w:w="140" w:type="dxa"/>
+            </w:tcMar>
+          </w:tcPr>
+          <w:p>
+            <w:pPr>
+              <w:spacing w:after="0"/>
+            </w:pPr>
+            <w:r>
+              <w:rPr>
+                <w:rFonts w:ascii="Calibri" w:hAnsi="Calibri"/>
+                <w:color w:val="333333"/>
+                <w:sz w:val="19"/>
+              </w:rPr>
+              <w:t>CRUD integrado com detecção de vínculos equivalentes no SQLite. Fonte visual: Banco, Pasta DOCX ou Banco + DOCX.</w:t>
+            </w:r>
+          </w:p>
+        </w:tc>
+      </w:tr>
+      <w:tr>
+        <w:tc>
+          <w:tcPr>
+            <w:tcW w:type="dxa" w:w="2160"/>
+            <w:shd w:fill="F9FBFD"/>
+            <w:tcMar>
+              <w:top w:w="90" w:type="dxa"/>
+              <w:bottom w:w="90" w:type="dxa"/>
+              <w:left w:w="140" w:type="dxa"/>
+              <w:right w:w="140" w:type="dxa"/>
+            </w:tcMar>
+          </w:tcPr>
+          <w:p>
+            <w:pPr>
+              <w:spacing w:after="0"/>
+            </w:pPr>
+            <w:r>
+              <w:rPr>
+                <w:rFonts w:ascii="Calibri" w:hAnsi="Calibri"/>
+                <w:color w:val="333333"/>
+                <w:sz w:val="19"/>
+              </w:rPr>
+              <w:t>Histórico</w:t>
+            </w:r>
+          </w:p>
+        </w:tc>
+        <w:tc>
+          <w:tcPr>
+            <w:tcW w:type="dxa" w:w="3600"/>
+            <w:shd w:fill="F9FBFD"/>
+            <w:tcMar>
+              <w:top w:w="90" w:type="dxa"/>
+              <w:bottom w:w="90" w:type="dxa"/>
+              <w:left w:w="140" w:type="dxa"/>
+              <w:right w:w="140" w:type="dxa"/>
+            </w:tcMar>
+          </w:tcPr>
+          <w:p>
+            <w:pPr>
+              <w:spacing w:after="0"/>
+            </w:pPr>
+            <w:r>
+              <w:rPr>
+                <w:rFonts w:ascii="Calibri" w:hAnsi="Calibri"/>
+                <w:color w:val="333333"/>
+                <w:sz w:val="19"/>
+              </w:rPr>
+              <w:t>Consulta e download de planos já gerados</w:t>
+            </w:r>
+          </w:p>
+        </w:tc>
+        <w:tc>
+          <w:tcPr>
+            <w:tcW w:type="dxa" w:w="4320"/>
+            <w:shd w:fill="F9FBFD"/>
+            <w:tcMar>
+              <w:top w:w="90" w:type="dxa"/>
+              <w:bottom w:w="90" w:type="dxa"/>
+              <w:left w:w="140" w:type="dxa"/>
+              <w:right w:w="140" w:type="dxa"/>
+            </w:tcMar>
+          </w:tcPr>
+          <w:p>
+            <w:pPr>
+              <w:spacing w:after="0"/>
+            </w:pPr>
+            <w:r>
+              <w:rPr>
+                <w:rFonts w:ascii="Calibri" w:hAnsi="Calibri"/>
+                <w:color w:val="333333"/>
+                <w:sz w:val="19"/>
+              </w:rPr>
+              <w:t>Histórico completo com filtros por professor, disciplina, turma, mês e data de geração. Download direto do .docx.</w:t>
+            </w:r>
+          </w:p>
+        </w:tc>
+      </w:tr>
+      <w:tr>
+        <w:tc>
+          <w:tcPr>
+            <w:tcW w:type="dxa" w:w="2160"/>
+            <w:shd w:fill="FFFFFF"/>
+            <w:tcMar>
+              <w:top w:w="90" w:type="dxa"/>
+              <w:bottom w:w="90" w:type="dxa"/>
+              <w:left w:w="140" w:type="dxa"/>
+              <w:right w:w="140" w:type="dxa"/>
+            </w:tcMar>
+          </w:tcPr>
+          <w:p>
+            <w:pPr>
+              <w:spacing w:after="0"/>
+            </w:pPr>
+            <w:r>
+              <w:rPr>
+                <w:rFonts w:ascii="Calibri" w:hAnsi="Calibri"/>
+                <w:color w:val="333333"/>
+                <w:sz w:val="19"/>
+              </w:rPr>
+              <w:t>Diagnóstico</w:t>
+            </w:r>
+          </w:p>
+        </w:tc>
+        <w:tc>
+          <w:tcPr>
+            <w:tcW w:type="dxa" w:w="3600"/>
+            <w:shd w:fill="FFFFFF"/>
+            <w:tcMar>
+              <w:top w:w="90" w:type="dxa"/>
+              <w:bottom w:w="90" w:type="dxa"/>
+              <w:left w:w="140" w:type="dxa"/>
+              <w:right w:w="140" w:type="dxa"/>
+            </w:tcMar>
+          </w:tcPr>
+          <w:p>
+            <w:pPr>
+              <w:spacing w:after="0"/>
+            </w:pPr>
+            <w:r>
+              <w:rPr>
+                <w:rFonts w:ascii="Calibri" w:hAnsi="Calibri"/>
+                <w:color w:val="333333"/>
+                <w:sz w:val="19"/>
+              </w:rPr>
+              <w:t>Inspeção técnica e qualidade metodológica</w:t>
+            </w:r>
+          </w:p>
+        </w:tc>
+        <w:tc>
+          <w:tcPr>
+            <w:tcW w:type="dxa" w:w="4320"/>
+            <w:shd w:fill="FFFFFF"/>
+            <w:tcMar>
+              <w:top w:w="90" w:type="dxa"/>
+              <w:bottom w:w="90" w:type="dxa"/>
+              <w:left w:w="140" w:type="dxa"/>
+              <w:right w:w="140" w:type="dxa"/>
+            </w:tcMar>
+          </w:tcPr>
+          <w:p>
+            <w:pPr>
+              <w:spacing w:after="0"/>
+            </w:pPr>
+            <w:r>
+              <w:rPr>
+                <w:rFonts w:ascii="Calibri" w:hAnsi="Calibri"/>
+                <w:color w:val="333333"/>
+                <w:sz w:val="19"/>
+              </w:rPr>
+              <w:t>Análise de confidence score, termos extraídos, tempo de resposta e proveniência.</w:t>
+            </w:r>
+          </w:p>
+        </w:tc>
+      </w:tr>
+      <w:tr>
+        <w:tc>
+          <w:tcPr>
+            <w:tcW w:type="dxa" w:w="3312"/>
+          </w:tcPr>
+          <w:p>
+            <w:r>
+              <w:t>Confer?ncia Mensal</w:t>
+            </w:r>
+          </w:p>
+        </w:tc>
+        <w:tc>
+          <w:tcPr>
+            <w:tcW w:type="dxa" w:w="3312"/>
+          </w:tcPr>
+          <w:p>
+            <w:r>
+              <w:t>Confer?ncia por professor e m?s de planos feitos vs. pendentes</w:t>
+            </w:r>
+          </w:p>
+        </w:tc>
+        <w:tc>
+          <w:tcPr>
+            <w:tcW w:type="dxa" w:w="3312"/>
+          </w:tcPr>
+          <w:p>
+            <w:r>
+              <w:t>Mostra todas as disciplinas/turmas cadastradas do professor. Marca ? com download se feito (exige .docx f?sico) e ? se pendente. A pasta do m?s manda.</w:t>
             </w:r>
           </w:p>
         </w:tc>
@@ -81,130 +733,363 @@
     </w:tbl>
     <w:p>
       <w:pPr>
-        <w:pStyle w:val="Heading1"/>
+        <w:spacing w:after="160"/>
+      </w:pPr>
+    </w:p>
+    <w:p>
+      <w:pPr>
+        <w:keepNext/>
+        <w:spacing w:before="280" w:after="120"/>
       </w:pPr>
       <w:r>
-        <w:t>1. O que faz o sistema hoje</w:t>
-      </w:r>
-    </w:p>
-    <w:p>
-      <w:r>
-        <w:t>O PLANOS_LUAN continua sendo um sistema de montagem de planos de aula em Word, mas hoje ele atua como uma linha de producao pedagogica mais completa. Ele combina banco de dados local, leitura de modelos DOCX, agenda escolar, entrada de PDFs em modos diferentes, extracao local, IA opcional, revisao humana e geracao final do documento.</w:t>
-      </w:r>
-    </w:p>
-    <w:p>
-      <w:r>
-        <w:t>O sistema atende fluxos comuns por PDF, cenarios CDP, adaptacoes EJA em contextos especificos e AE priorizado quando existe base preparada para a combinacao de disciplina, turma e bimestre.</w:t>
+        <w:rPr>
+          <w:rFonts w:ascii="Calibri" w:hAnsi="Calibri"/>
+          <w:b/>
+          <w:color w:val="1B365D"/>
+          <w:sz w:val="30"/>
+        </w:rPr>
+        <w:t>3. FLUXO OPERACIONAL DE GERAÇÃO (PASSO A PASSO)</w:t>
       </w:r>
     </w:p>
     <w:p>
       <w:pPr>
-        <w:pStyle w:val="Heading1"/>
+        <w:spacing w:after="120" w:line="276" w:lineRule="auto"/>
       </w:pPr>
       <w:r>
-        <w:t>2. Como o sistema trabalha por dentro hoje</w:t>
+        <w:rPr>
+          <w:rFonts w:ascii="Calibri" w:hAnsi="Calibri"/>
+          <w:b/>
+          <w:color w:val="222222"/>
+          <w:sz w:val="21"/>
+        </w:rPr>
+        <w:t xml:space="preserve">Passo 1: </w:t>
+      </w:r>
+      <w:r>
+        <w:rPr>
+          <w:rFonts w:ascii="Calibri" w:hAnsi="Calibri"/>
+          <w:color w:val="333333"/>
+          <w:sz w:val="21"/>
+        </w:rPr>
+        <w:t>1. Seleção Inicial: O professor seleciona a disciplina, professor, turma, bimestre e mês de vigência.</w:t>
       </w:r>
     </w:p>
     <w:p>
       <w:pPr>
-        <w:pStyle w:val="ListBullet"/>
+        <w:spacing w:after="120" w:line="276" w:lineRule="auto"/>
       </w:pPr>
       <w:r>
-        <w:t>Contexto: o usuario escolhe professor, disciplina, turma, mes, bimestre, escola, componente curricular e, quando necessario, modalidades especiais.</w:t>
+        <w:rPr>
+          <w:rFonts w:ascii="Calibri" w:hAnsi="Calibri"/>
+          <w:b/>
+          <w:color w:val="222222"/>
+          <w:sz w:val="21"/>
+        </w:rPr>
+        <w:t xml:space="preserve">Passo 2: </w:t>
+      </w:r>
+      <w:r>
+        <w:rPr>
+          <w:rFonts w:ascii="Calibri" w:hAnsi="Calibri"/>
+          <w:color w:val="333333"/>
+          <w:sz w:val="21"/>
+        </w:rPr>
+        <w:t>2. Montagem do Calendário: O sistema calcula os dias reais de aula no mês com base na grade cadastrada, descontando feriados escolares.</w:t>
       </w:r>
     </w:p>
     <w:p>
       <w:pPr>
-        <w:pStyle w:val="ListBullet"/>
+        <w:spacing w:after="120" w:line="276" w:lineRule="auto"/>
       </w:pPr>
       <w:r>
-        <w:t>Modelo e agenda: o sistema tenta localizar modelo do professor, cadastro salvo ou template central; depois monta datas reais, feriados, dias sem aula e extensao do mes.</w:t>
+        <w:rPr>
+          <w:rFonts w:ascii="Calibri" w:hAnsi="Calibri"/>
+          <w:b/>
+          <w:color w:val="222222"/>
+          <w:sz w:val="21"/>
+        </w:rPr>
+        <w:t xml:space="preserve">Passo 3: </w:t>
+      </w:r>
+      <w:r>
+        <w:rPr>
+          <w:rFonts w:ascii="Calibri" w:hAnsi="Calibri"/>
+          <w:color w:val="333333"/>
+          <w:sz w:val="21"/>
+        </w:rPr>
+        <w:t>3. Resolução dos PDFs: Localização automática da pasta em PLANOS_LUAN_DADOS/PDF_AULAS ou upload manual pelo usuário.</w:t>
       </w:r>
     </w:p>
     <w:p>
       <w:pPr>
-        <w:pStyle w:val="ListBullet"/>
+        <w:spacing w:after="120" w:line="276" w:lineRule="auto"/>
       </w:pPr>
       <w:r>
-        <w:t>Entrada de PDFs: hoje existem tres modos principais de envio — Automatico, Todos de uma vez e Um por aula.</w:t>
+        <w:rPr>
+          <w:rFonts w:ascii="Calibri" w:hAnsi="Calibri"/>
+          <w:b/>
+          <w:color w:val="222222"/>
+          <w:sz w:val="21"/>
+        </w:rPr>
+        <w:t xml:space="preserve">Passo 4: </w:t>
+      </w:r>
+      <w:r>
+        <w:rPr>
+          <w:rFonts w:ascii="Calibri" w:hAnsi="Calibri"/>
+          <w:color w:val="333333"/>
+          <w:sz w:val="21"/>
+        </w:rPr>
+        <w:t>4. Extração e Classificação: Leitura dos PDFs (pdfplumber/OCR), extração de títulos, conceitos e habilidades, e classificação em perfil disciplinar.</w:t>
       </w:r>
     </w:p>
     <w:p>
       <w:pPr>
-        <w:pStyle w:val="ListBullet"/>
+        <w:spacing w:after="120" w:line="276" w:lineRule="auto"/>
       </w:pPr>
       <w:r>
-        <w:t>Memoria do sistema: no modo automatico, o app pode pre-selecionar PDFs a partir da ultima aula salva no historico.</w:t>
+        <w:rPr>
+          <w:rFonts w:ascii="Calibri" w:hAnsi="Calibri"/>
+          <w:b/>
+          <w:color w:val="222222"/>
+          <w:sz w:val="21"/>
+        </w:rPr>
+        <w:t xml:space="preserve">Passo 5: </w:t>
+      </w:r>
+      <w:r>
+        <w:rPr>
+          <w:rFonts w:ascii="Calibri" w:hAnsi="Calibri"/>
+          <w:color w:val="333333"/>
+          <w:sz w:val="21"/>
+        </w:rPr>
+        <w:t>5. Geração Metodológica: Criação das etapas 'Para começar' (ou Relembre), 'Foco no conteúdo', 'Na prática' e 'Encerramento' (motor local determinístico ou IA).</w:t>
       </w:r>
     </w:p>
     <w:p>
       <w:pPr>
-        <w:pStyle w:val="ListBullet"/>
+        <w:spacing w:after="120" w:line="276" w:lineRule="auto"/>
       </w:pPr>
       <w:r>
-        <w:t>Processamento: o motor local extrai tema, aprendizagem e metodologia; se a IA estiver ativa, a camada externa refina um rascunho base do proprio sistema.</w:t>
+        <w:rPr>
+          <w:rFonts w:ascii="Calibri" w:hAnsi="Calibri"/>
+          <w:b/>
+          <w:color w:val="222222"/>
+          <w:sz w:val="21"/>
+        </w:rPr>
+        <w:t xml:space="preserve">Passo 6: </w:t>
+      </w:r>
+      <w:r>
+        <w:rPr>
+          <w:rFonts w:ascii="Calibri" w:hAnsi="Calibri"/>
+          <w:color w:val="333333"/>
+          <w:sz w:val="21"/>
+        </w:rPr>
+        <w:t>6. Enriquecimento Pedagógico: Geração contextual de 3 itens de acompanhamento da aprendizagem e 3 itens de adaptação de acessibilidade.</w:t>
       </w:r>
     </w:p>
     <w:p>
       <w:pPr>
-        <w:pStyle w:val="ListBullet"/>
+        <w:spacing w:after="120" w:line="276" w:lineRule="auto"/>
       </w:pPr>
       <w:r>
-        <w:t>Revisao: antes do DOCX final, o usuario revisa tema, aprendizagem, metodologia, acompanhamento e acessibilidade numa tela centralizada.</w:t>
+        <w:rPr>
+          <w:rFonts w:ascii="Calibri" w:hAnsi="Calibri"/>
+          <w:b/>
+          <w:color w:val="222222"/>
+          <w:sz w:val="21"/>
+        </w:rPr>
+        <w:t xml:space="preserve">Passo 7: </w:t>
+      </w:r>
+      <w:r>
+        <w:rPr>
+          <w:rFonts w:ascii="Calibri" w:hAnsi="Calibri"/>
+          <w:color w:val="333333"/>
+          <w:sz w:val="21"/>
+        </w:rPr>
+        <w:t>7. Validação e Scoring: Cálculo do confidence score (0 a 100), verificação de limites (300/350 chars) e sanitização de texto.</w:t>
       </w:r>
     </w:p>
     <w:p>
       <w:pPr>
-        <w:pStyle w:val="ListBullet"/>
+        <w:spacing w:after="120" w:line="276" w:lineRule="auto"/>
       </w:pPr>
       <w:r>
-        <w:t>Geracao final: o DOCX e montado, pode ser salvo no historico ou nao, e o sistema atualiza a memoria da ultima aula apenas quando isso for autorizado.</w:t>
+        <w:rPr>
+          <w:rFonts w:ascii="Calibri" w:hAnsi="Calibri"/>
+          <w:b/>
+          <w:color w:val="222222"/>
+          <w:sz w:val="21"/>
+        </w:rPr>
+        <w:t xml:space="preserve">Passo 8: </w:t>
+      </w:r>
+      <w:r>
+        <w:rPr>
+          <w:rFonts w:ascii="Calibri" w:hAnsi="Calibri"/>
+          <w:color w:val="333333"/>
+          <w:sz w:val="21"/>
+        </w:rPr>
+        <w:t>8. Tela de Revisão: Permite ao professor inspecionar e editar qualquer campo antes da gravação.</w:t>
       </w:r>
     </w:p>
     <w:p>
+      <w:pPr>
+        <w:spacing w:after="120" w:line="276" w:lineRule="auto"/>
+      </w:pPr>
       <w:r>
-        <w:t>Estruturas principais do sistema</w:t>
+        <w:rPr>
+          <w:rFonts w:ascii="Calibri" w:hAnsi="Calibri"/>
+          <w:b/>
+          <w:color w:val="222222"/>
+          <w:sz w:val="21"/>
+        </w:rPr>
+        <w:t xml:space="preserve">Passo 9: </w:t>
+      </w:r>
+      <w:r>
+        <w:rPr>
+          <w:rFonts w:ascii="Calibri" w:hAnsi="Calibri"/>
+          <w:color w:val="333333"/>
+          <w:sz w:val="21"/>
+        </w:rPr>
+        <w:t>9. Geração Word (.docx): Preenchimento do template oficial preservando formatação, tabelas mescladas e ordem cronológica.</w:t>
+      </w:r>
+    </w:p>
+    <w:p>
+      <w:pPr>
+        <w:spacing w:after="120" w:line="276" w:lineRule="auto"/>
+      </w:pPr>
+      <w:r>
+        <w:rPr>
+          <w:rFonts w:ascii="Calibri" w:hAnsi="Calibri"/>
+          <w:b/>
+          <w:color w:val="222222"/>
+          <w:sz w:val="21"/>
+        </w:rPr>
+        <w:t xml:space="preserve">Passo 10: </w:t>
+      </w:r>
+      <w:r>
+        <w:rPr>
+          <w:rFonts w:ascii="Calibri" w:hAnsi="Calibri"/>
+          <w:color w:val="333333"/>
+          <w:sz w:val="21"/>
+        </w:rPr>
+        <w:t>10. Gravação e Histórico: Armazenamento do arquivo na pasta de histórico e inserção do registro no banco de dados SQLite.</w:t>
+      </w:r>
+    </w:p>
+    <w:p>
+      <w:pPr>
+        <w:keepNext/>
+        <w:spacing w:before="280" w:after="120"/>
+      </w:pPr>
+      <w:r>
+        <w:rPr>
+          <w:rFonts w:ascii="Calibri" w:hAnsi="Calibri"/>
+          <w:b/>
+          <w:color w:val="1B365D"/>
+          <w:sz w:val="30"/>
+        </w:rPr>
+        <w:t>4. PADRONIZAÇÃO DO CDP E TURMAS</w:t>
+      </w:r>
+    </w:p>
+    <w:p>
+      <w:pPr>
+        <w:spacing w:after="120" w:line="276" w:lineRule="auto"/>
+      </w:pPr>
+      <w:r>
+        <w:rPr>
+          <w:rFonts w:ascii="Calibri" w:hAnsi="Calibri"/>
+          <w:color w:val="333333"/>
+          <w:sz w:val="21"/>
+        </w:rPr>
+        <w:t>O módulo CDP opera com um catálogo unificado de disciplinas e turmas:</w:t>
       </w:r>
     </w:p>
     <w:tbl>
       <w:tblPr>
-        <w:tblStyle w:val="TableGrid"/>
+        <w:tblStyle w:val="LightGrid-Accent1"/>
         <w:tblW w:type="auto" w:w="0"/>
+        <w:jc w:val="center"/>
         <w:tblLook w:firstColumn="1" w:firstRow="1" w:lastColumn="0" w:lastRow="0" w:noHBand="0" w:noVBand="1" w:val="04A0"/>
       </w:tblPr>
       <w:tblGrid>
-        <w:gridCol w:w="3120"/>
-        <w:gridCol w:w="3120"/>
-        <w:gridCol w:w="3120"/>
+        <w:gridCol w:w="3312"/>
+        <w:gridCol w:w="3312"/>
+        <w:gridCol w:w="3312"/>
       </w:tblGrid>
       <w:tr>
         <w:tc>
           <w:tcPr>
-            <w:tcW w:type="dxa" w:w="3120"/>
+            <w:tcW w:type="dxa" w:w="3744"/>
+            <w:shd w:fill="1B365D"/>
+            <w:tcMar>
+              <w:top w:w="120" w:type="dxa"/>
+              <w:bottom w:w="120" w:type="dxa"/>
+              <w:left w:w="140" w:type="dxa"/>
+              <w:right w:w="140" w:type="dxa"/>
+            </w:tcMar>
           </w:tcPr>
           <w:p>
+            <w:pPr>
+              <w:spacing w:after="0"/>
+              <w:jc w:val="left"/>
+            </w:pPr>
             <w:r>
-              <w:t>Parte</w:t>
+              <w:rPr>
+                <w:rFonts w:ascii="Calibri" w:hAnsi="Calibri"/>
+                <w:b/>
+                <w:color w:val="FFFFFF"/>
+                <w:sz w:val="20"/>
+              </w:rPr>
+              <w:t>Disciplina Padronizada</w:t>
             </w:r>
           </w:p>
         </w:tc>
         <w:tc>
           <w:tcPr>
-            <w:tcW w:type="dxa" w:w="3120"/>
+            <w:tcW w:type="dxa" w:w="2016"/>
+            <w:shd w:fill="1B365D"/>
+            <w:tcMar>
+              <w:top w:w="120" w:type="dxa"/>
+              <w:bottom w:w="120" w:type="dxa"/>
+              <w:left w:w="140" w:type="dxa"/>
+              <w:right w:w="140" w:type="dxa"/>
+            </w:tcMar>
           </w:tcPr>
           <w:p>
+            <w:pPr>
+              <w:spacing w:after="0"/>
+              <w:jc w:val="left"/>
+            </w:pPr>
             <w:r>
-              <w:t>Funcao principal</w:t>
+              <w:rPr>
+                <w:rFonts w:ascii="Calibri" w:hAnsi="Calibri"/>
+                <w:b/>
+                <w:color w:val="FFFFFF"/>
+                <w:sz w:val="20"/>
+              </w:rPr>
+              <w:t>Turmas Atendidas</w:t>
             </w:r>
           </w:p>
         </w:tc>
         <w:tc>
           <w:tcPr>
-            <w:tcW w:type="dxa" w:w="3120"/>
+            <w:tcW w:type="dxa" w:w="4320"/>
+            <w:shd w:fill="1B365D"/>
+            <w:tcMar>
+              <w:top w:w="120" w:type="dxa"/>
+              <w:bottom w:w="120" w:type="dxa"/>
+              <w:left w:w="140" w:type="dxa"/>
+              <w:right w:w="140" w:type="dxa"/>
+            </w:tcMar>
           </w:tcPr>
           <w:p>
+            <w:pPr>
+              <w:spacing w:after="0"/>
+              <w:jc w:val="left"/>
+            </w:pPr>
             <w:r>
-              <w:t>Tipo de conteudo</w:t>
+              <w:rPr>
+                <w:rFonts w:ascii="Calibri" w:hAnsi="Calibri"/>
+                <w:b/>
+                <w:color w:val="FFFFFF"/>
+                <w:sz w:val="20"/>
+              </w:rPr>
+              <w:t>Pasta de PDFs (4º Bimestre)</w:t>
             </w:r>
           </w:p>
         </w:tc>
@@ -212,31 +1097,76 @@
       <w:tr>
         <w:tc>
           <w:tcPr>
-            <w:tcW w:type="dxa" w:w="3120"/>
+            <w:tcW w:type="dxa" w:w="3744"/>
+            <w:shd w:fill="FFFFFF"/>
+            <w:tcMar>
+              <w:top w:w="90" w:type="dxa"/>
+              <w:bottom w:w="90" w:type="dxa"/>
+              <w:left w:w="140" w:type="dxa"/>
+              <w:right w:w="140" w:type="dxa"/>
+            </w:tcMar>
           </w:tcPr>
           <w:p>
+            <w:pPr>
+              <w:spacing w:after="0"/>
+            </w:pPr>
             <w:r>
-              <w:t>planos_luan_app.py</w:t>
+              <w:rPr>
+                <w:rFonts w:ascii="Calibri" w:hAnsi="Calibri"/>
+                <w:color w:val="333333"/>
+                <w:sz w:val="19"/>
+              </w:rPr>
+              <w:t>HISTÓRIA - CDP - EJA - MULTISSERIADO</w:t>
             </w:r>
           </w:p>
         </w:tc>
         <w:tc>
           <w:tcPr>
-            <w:tcW w:type="dxa" w:w="3120"/>
+            <w:tcW w:type="dxa" w:w="2016"/>
+            <w:shd w:fill="FFFFFF"/>
+            <w:tcMar>
+              <w:top w:w="90" w:type="dxa"/>
+              <w:bottom w:w="90" w:type="dxa"/>
+              <w:left w:w="140" w:type="dxa"/>
+              <w:right w:w="140" w:type="dxa"/>
+            </w:tcMar>
           </w:tcPr>
           <w:p>
+            <w:pPr>
+              <w:spacing w:after="0"/>
+            </w:pPr>
             <w:r>
-              <w:t>Tela principal, memoria de uso, revisao centralizada e orquestracao do fluxo.</w:t>
+              <w:rPr>
+                <w:rFonts w:ascii="Calibri" w:hAnsi="Calibri"/>
+                <w:color w:val="333333"/>
+                <w:sz w:val="19"/>
+              </w:rPr>
+              <w:t>C, H (EF) | J, E (EM)</w:t>
             </w:r>
           </w:p>
         </w:tc>
         <w:tc>
           <w:tcPr>
-            <w:tcW w:type="dxa" w:w="3120"/>
+            <w:tcW w:type="dxa" w:w="4320"/>
+            <w:shd w:fill="FFFFFF"/>
+            <w:tcMar>
+              <w:top w:w="90" w:type="dxa"/>
+              <w:bottom w:w="90" w:type="dxa"/>
+              <w:left w:w="140" w:type="dxa"/>
+              <w:right w:w="140" w:type="dxa"/>
+            </w:tcMar>
           </w:tcPr>
           <w:p>
+            <w:pPr>
+              <w:spacing w:after="0"/>
+            </w:pPr>
             <w:r>
-              <w:t>Interface</w:t>
+              <w:rPr>
+                <w:rFonts w:ascii="Calibri" w:hAnsi="Calibri"/>
+                <w:color w:val="333333"/>
+                <w:sz w:val="19"/>
+              </w:rPr>
+              <w:t>HISTORIA_CDP/EF/... ou HISTORIA_CDP/EM/4_BIMESTRE/1_ANO_2_ANO_3_ANO</w:t>
             </w:r>
           </w:p>
         </w:tc>
@@ -244,31 +1174,76 @@
       <w:tr>
         <w:tc>
           <w:tcPr>
-            <w:tcW w:type="dxa" w:w="3120"/>
+            <w:tcW w:type="dxa" w:w="3744"/>
+            <w:shd w:fill="F9FBFD"/>
+            <w:tcMar>
+              <w:top w:w="90" w:type="dxa"/>
+              <w:bottom w:w="90" w:type="dxa"/>
+              <w:left w:w="140" w:type="dxa"/>
+              <w:right w:w="140" w:type="dxa"/>
+            </w:tcMar>
           </w:tcPr>
           <w:p>
+            <w:pPr>
+              <w:spacing w:after="0"/>
+            </w:pPr>
             <w:r>
-              <w:t>core/lote.py</w:t>
+              <w:rPr>
+                <w:rFonts w:ascii="Calibri" w:hAnsi="Calibri"/>
+                <w:color w:val="333333"/>
+                <w:sz w:val="19"/>
+              </w:rPr>
+              <w:t>CIÊNCIAS - CDP - EJA - MULTISSERIADO</w:t>
             </w:r>
           </w:p>
         </w:tc>
         <w:tc>
           <w:tcPr>
-            <w:tcW w:type="dxa" w:w="3120"/>
+            <w:tcW w:type="dxa" w:w="2016"/>
+            <w:shd w:fill="F9FBFD"/>
+            <w:tcMar>
+              <w:top w:w="90" w:type="dxa"/>
+              <w:bottom w:w="90" w:type="dxa"/>
+              <w:left w:w="140" w:type="dxa"/>
+              <w:right w:w="140" w:type="dxa"/>
+            </w:tcMar>
           </w:tcPr>
           <w:p>
+            <w:pPr>
+              <w:spacing w:after="0"/>
+            </w:pPr>
             <w:r>
-              <w:t>Motor principal do fluxo PDF, com cache por PDF, auditoria final e fallback local.</w:t>
+              <w:rPr>
+                <w:rFonts w:ascii="Calibri" w:hAnsi="Calibri"/>
+                <w:color w:val="333333"/>
+                <w:sz w:val="19"/>
+              </w:rPr>
+              <w:t>C (6/7) | H, J, E (8/9)</w:t>
             </w:r>
           </w:p>
         </w:tc>
         <w:tc>
           <w:tcPr>
-            <w:tcW w:type="dxa" w:w="3120"/>
+            <w:tcW w:type="dxa" w:w="4320"/>
+            <w:shd w:fill="F9FBFD"/>
+            <w:tcMar>
+              <w:top w:w="90" w:type="dxa"/>
+              <w:bottom w:w="90" w:type="dxa"/>
+              <w:left w:w="140" w:type="dxa"/>
+              <w:right w:w="140" w:type="dxa"/>
+            </w:tcMar>
           </w:tcPr>
           <w:p>
+            <w:pPr>
+              <w:spacing w:after="0"/>
+            </w:pPr>
             <w:r>
-              <w:t>Nucleo PDF</w:t>
+              <w:rPr>
+                <w:rFonts w:ascii="Calibri" w:hAnsi="Calibri"/>
+                <w:color w:val="333333"/>
+                <w:sz w:val="19"/>
+              </w:rPr>
+              <w:t>CIENCIAS_CDP/AF/4_BIMESTRE/6_E_7_ANO ou 8_E_9_ANO</w:t>
             </w:r>
           </w:p>
         </w:tc>
@@ -276,31 +1251,76 @@
       <w:tr>
         <w:tc>
           <w:tcPr>
-            <w:tcW w:type="dxa" w:w="3120"/>
+            <w:tcW w:type="dxa" w:w="3744"/>
+            <w:shd w:fill="FFFFFF"/>
+            <w:tcMar>
+              <w:top w:w="90" w:type="dxa"/>
+              <w:bottom w:w="90" w:type="dxa"/>
+              <w:left w:w="140" w:type="dxa"/>
+              <w:right w:w="140" w:type="dxa"/>
+            </w:tcMar>
           </w:tcPr>
           <w:p>
+            <w:pPr>
+              <w:spacing w:after="0"/>
+            </w:pPr>
             <w:r>
-              <w:t>core/lib/</w:t>
+              <w:rPr>
+                <w:rFonts w:ascii="Calibri" w:hAnsi="Calibri"/>
+                <w:color w:val="333333"/>
+                <w:sz w:val="19"/>
+              </w:rPr>
+              <w:t>MATEMÁTICA - CDP - EJA - MULTISSERIADO</w:t>
             </w:r>
           </w:p>
         </w:tc>
         <w:tc>
           <w:tcPr>
-            <w:tcW w:type="dxa" w:w="3120"/>
+            <w:tcW w:type="dxa" w:w="2016"/>
+            <w:shd w:fill="FFFFFF"/>
+            <w:tcMar>
+              <w:top w:w="90" w:type="dxa"/>
+              <w:bottom w:w="90" w:type="dxa"/>
+              <w:left w:w="140" w:type="dxa"/>
+              <w:right w:w="140" w:type="dxa"/>
+            </w:tcMar>
           </w:tcPr>
           <w:p>
+            <w:pPr>
+              <w:spacing w:after="0"/>
+            </w:pPr>
             <w:r>
-              <w:t>Base modular de extracao, classificacao, metodologia, higienizacao e perfis pedagogicos.</w:t>
+              <w:rPr>
+                <w:rFonts w:ascii="Calibri" w:hAnsi="Calibri"/>
+                <w:color w:val="333333"/>
+                <w:sz w:val="19"/>
+              </w:rPr>
+              <w:t>C, H (EF) | J, E (EM)</w:t>
             </w:r>
           </w:p>
         </w:tc>
         <w:tc>
           <w:tcPr>
-            <w:tcW w:type="dxa" w:w="3120"/>
+            <w:tcW w:type="dxa" w:w="4320"/>
+            <w:shd w:fill="FFFFFF"/>
+            <w:tcMar>
+              <w:top w:w="90" w:type="dxa"/>
+              <w:bottom w:w="90" w:type="dxa"/>
+              <w:left w:w="140" w:type="dxa"/>
+              <w:right w:w="140" w:type="dxa"/>
+            </w:tcMar>
           </w:tcPr>
           <w:p>
+            <w:pPr>
+              <w:spacing w:after="0"/>
+            </w:pPr>
             <w:r>
-              <w:t>Base pedagogica</w:t>
+              <w:rPr>
+                <w:rFonts w:ascii="Calibri" w:hAnsi="Calibri"/>
+                <w:color w:val="333333"/>
+                <w:sz w:val="19"/>
+              </w:rPr>
+              <w:t>MATEMATICA-CDP/AF/... ou MATEMATICA-CDP/EM/4_BIMESTRE/1_2_E_3_ANO_MULTISSERIADO</w:t>
             </w:r>
           </w:p>
         </w:tc>
@@ -308,31 +1328,76 @@
       <w:tr>
         <w:tc>
           <w:tcPr>
-            <w:tcW w:type="dxa" w:w="3120"/>
+            <w:tcW w:type="dxa" w:w="3744"/>
+            <w:shd w:fill="F9FBFD"/>
+            <w:tcMar>
+              <w:top w:w="90" w:type="dxa"/>
+              <w:bottom w:w="90" w:type="dxa"/>
+              <w:left w:w="140" w:type="dxa"/>
+              <w:right w:w="140" w:type="dxa"/>
+            </w:tcMar>
           </w:tcPr>
           <w:p>
+            <w:pPr>
+              <w:spacing w:after="0"/>
+            </w:pPr>
             <w:r>
-              <w:t>core/ia.py + core/prompts_por_disciplina.py</w:t>
+              <w:rPr>
+                <w:rFonts w:ascii="Calibri" w:hAnsi="Calibri"/>
+                <w:color w:val="333333"/>
+                <w:sz w:val="19"/>
+              </w:rPr>
+              <w:t>GEOGRAFIA - CDP - EJA - MULTISSERIADO</w:t>
             </w:r>
           </w:p>
         </w:tc>
         <w:tc>
           <w:tcPr>
-            <w:tcW w:type="dxa" w:w="3120"/>
+            <w:tcW w:type="dxa" w:w="2016"/>
+            <w:shd w:fill="F9FBFD"/>
+            <w:tcMar>
+              <w:top w:w="90" w:type="dxa"/>
+              <w:bottom w:w="90" w:type="dxa"/>
+              <w:left w:w="140" w:type="dxa"/>
+              <w:right w:w="140" w:type="dxa"/>
+            </w:tcMar>
           </w:tcPr>
           <w:p>
+            <w:pPr>
+              <w:spacing w:after="0"/>
+            </w:pPr>
             <w:r>
-              <w:t>Camada de IA com OpenAI/Gemini em modo hibrido a partir de rascunho local.</w:t>
+              <w:rPr>
+                <w:rFonts w:ascii="Calibri" w:hAnsi="Calibri"/>
+                <w:color w:val="333333"/>
+                <w:sz w:val="19"/>
+              </w:rPr>
+              <w:t>J, E (EM)</w:t>
             </w:r>
           </w:p>
         </w:tc>
         <w:tc>
           <w:tcPr>
-            <w:tcW w:type="dxa" w:w="3120"/>
+            <w:tcW w:type="dxa" w:w="4320"/>
+            <w:shd w:fill="F9FBFD"/>
+            <w:tcMar>
+              <w:top w:w="90" w:type="dxa"/>
+              <w:bottom w:w="90" w:type="dxa"/>
+              <w:left w:w="140" w:type="dxa"/>
+              <w:right w:w="140" w:type="dxa"/>
+            </w:tcMar>
           </w:tcPr>
           <w:p>
+            <w:pPr>
+              <w:spacing w:after="0"/>
+            </w:pPr>
             <w:r>
-              <w:t>IA opcional</w:t>
+              <w:rPr>
+                <w:rFonts w:ascii="Calibri" w:hAnsi="Calibri"/>
+                <w:color w:val="333333"/>
+                <w:sz w:val="19"/>
+              </w:rPr>
+              <w:t>GEOGRAFIA_CDP/EM/4_BIMESTRE</w:t>
             </w:r>
           </w:p>
         </w:tc>
@@ -340,31 +1405,76 @@
       <w:tr>
         <w:tc>
           <w:tcPr>
-            <w:tcW w:type="dxa" w:w="3120"/>
+            <w:tcW w:type="dxa" w:w="3744"/>
+            <w:shd w:fill="FFFFFF"/>
+            <w:tcMar>
+              <w:top w:w="90" w:type="dxa"/>
+              <w:bottom w:w="90" w:type="dxa"/>
+              <w:left w:w="140" w:type="dxa"/>
+              <w:right w:w="140" w:type="dxa"/>
+            </w:tcMar>
           </w:tcPr>
           <w:p>
+            <w:pPr>
+              <w:spacing w:after="0"/>
+            </w:pPr>
             <w:r>
-              <w:t>core/revisao_final.py</w:t>
+              <w:rPr>
+                <w:rFonts w:ascii="Calibri" w:hAnsi="Calibri"/>
+                <w:color w:val="333333"/>
+                <w:sz w:val="19"/>
+              </w:rPr>
+              <w:t>SOCIOLOGIA - CDP - EJA - MULTISSERIADO</w:t>
             </w:r>
           </w:p>
         </w:tc>
         <w:tc>
           <w:tcPr>
-            <w:tcW w:type="dxa" w:w="3120"/>
+            <w:tcW w:type="dxa" w:w="2016"/>
+            <w:shd w:fill="FFFFFF"/>
+            <w:tcMar>
+              <w:top w:w="90" w:type="dxa"/>
+              <w:bottom w:w="90" w:type="dxa"/>
+              <w:left w:w="140" w:type="dxa"/>
+              <w:right w:w="140" w:type="dxa"/>
+            </w:tcMar>
           </w:tcPr>
           <w:p>
+            <w:pPr>
+              <w:spacing w:after="0"/>
+            </w:pPr>
             <w:r>
-              <w:t>Auditoria final da aula com confidence_score e sidecar JSON.</w:t>
+              <w:rPr>
+                <w:rFonts w:ascii="Calibri" w:hAnsi="Calibri"/>
+                <w:color w:val="333333"/>
+                <w:sz w:val="19"/>
+              </w:rPr>
+              <w:t>J, E (EM)</w:t>
             </w:r>
           </w:p>
         </w:tc>
         <w:tc>
           <w:tcPr>
-            <w:tcW w:type="dxa" w:w="3120"/>
+            <w:tcW w:type="dxa" w:w="4320"/>
+            <w:shd w:fill="FFFFFF"/>
+            <w:tcMar>
+              <w:top w:w="90" w:type="dxa"/>
+              <w:bottom w:w="90" w:type="dxa"/>
+              <w:left w:w="140" w:type="dxa"/>
+              <w:right w:w="140" w:type="dxa"/>
+            </w:tcMar>
           </w:tcPr>
           <w:p>
+            <w:pPr>
+              <w:spacing w:after="0"/>
+            </w:pPr>
             <w:r>
-              <w:t>Controle final</w:t>
+              <w:rPr>
+                <w:rFonts w:ascii="Calibri" w:hAnsi="Calibri"/>
+                <w:color w:val="333333"/>
+                <w:sz w:val="19"/>
+              </w:rPr>
+              <w:t>SOCIOLOGIA_CDP_MULTISSERIADO/EM/4_BIMESTRE</w:t>
             </w:r>
           </w:p>
         </w:tc>
@@ -372,31 +1482,76 @@
       <w:tr>
         <w:tc>
           <w:tcPr>
-            <w:tcW w:type="dxa" w:w="3120"/>
+            <w:tcW w:type="dxa" w:w="3744"/>
+            <w:shd w:fill="F9FBFD"/>
+            <w:tcMar>
+              <w:top w:w="90" w:type="dxa"/>
+              <w:bottom w:w="90" w:type="dxa"/>
+              <w:left w:w="140" w:type="dxa"/>
+              <w:right w:w="140" w:type="dxa"/>
+            </w:tcMar>
           </w:tcPr>
           <w:p>
+            <w:pPr>
+              <w:spacing w:after="0"/>
+            </w:pPr>
             <w:r>
-              <w:t>core/database.py + planos_luan.db</w:t>
+              <w:rPr>
+                <w:rFonts w:ascii="Calibri" w:hAnsi="Calibri"/>
+                <w:color w:val="333333"/>
+                <w:sz w:val="19"/>
+              </w:rPr>
+              <w:t>LIDERANÇA E ORATÓRIA - CDP - EJA - MULTISSERIADO</w:t>
             </w:r>
           </w:p>
         </w:tc>
         <w:tc>
           <w:tcPr>
-            <w:tcW w:type="dxa" w:w="3120"/>
+            <w:tcW w:type="dxa" w:w="2016"/>
+            <w:shd w:fill="F9FBFD"/>
+            <w:tcMar>
+              <w:top w:w="90" w:type="dxa"/>
+              <w:bottom w:w="90" w:type="dxa"/>
+              <w:left w:w="140" w:type="dxa"/>
+              <w:right w:w="140" w:type="dxa"/>
+            </w:tcMar>
           </w:tcPr>
           <w:p>
+            <w:pPr>
+              <w:spacing w:after="0"/>
+            </w:pPr>
             <w:r>
-              <w:t>Cadastro persistente, historico e memoria da ultima aula.</w:t>
+              <w:rPr>
+                <w:rFonts w:ascii="Calibri" w:hAnsi="Calibri"/>
+                <w:color w:val="333333"/>
+                <w:sz w:val="19"/>
+              </w:rPr>
+              <w:t>J, E (EM)</w:t>
             </w:r>
           </w:p>
         </w:tc>
         <w:tc>
           <w:tcPr>
-            <w:tcW w:type="dxa" w:w="3120"/>
+            <w:tcW w:type="dxa" w:w="4320"/>
+            <w:shd w:fill="F9FBFD"/>
+            <w:tcMar>
+              <w:top w:w="90" w:type="dxa"/>
+              <w:bottom w:w="90" w:type="dxa"/>
+              <w:left w:w="140" w:type="dxa"/>
+              <w:right w:w="140" w:type="dxa"/>
+            </w:tcMar>
           </w:tcPr>
           <w:p>
+            <w:pPr>
+              <w:spacing w:after="0"/>
+            </w:pPr>
             <w:r>
-              <w:t>Banco de dados</w:t>
+              <w:rPr>
+                <w:rFonts w:ascii="Calibri" w:hAnsi="Calibri"/>
+                <w:color w:val="333333"/>
+                <w:sz w:val="19"/>
+              </w:rPr>
+              <w:t>LIDERANCA_E_ORATORIA/EM/4_BIMESTRE</w:t>
             </w:r>
           </w:p>
         </w:tc>
@@ -404,31 +1559,76 @@
       <w:tr>
         <w:tc>
           <w:tcPr>
-            <w:tcW w:type="dxa" w:w="3120"/>
+            <w:tcW w:type="dxa" w:w="3744"/>
+            <w:shd w:fill="FFFFFF"/>
+            <w:tcMar>
+              <w:top w:w="90" w:type="dxa"/>
+              <w:bottom w:w="90" w:type="dxa"/>
+              <w:left w:w="140" w:type="dxa"/>
+              <w:right w:w="140" w:type="dxa"/>
+            </w:tcMar>
           </w:tcPr>
           <w:p>
+            <w:pPr>
+              <w:spacing w:after="0"/>
+            </w:pPr>
             <w:r>
-              <w:t>core/professores_planos.py</w:t>
+              <w:rPr>
+                <w:rFonts w:ascii="Calibri" w:hAnsi="Calibri"/>
+                <w:color w:val="333333"/>
+                <w:sz w:val="19"/>
+              </w:rPr>
+              <w:t>LÍNGUA PORTUGUESA - CDP - EJA - MULTISSERIADO</w:t>
             </w:r>
           </w:p>
         </w:tc>
         <w:tc>
           <w:tcPr>
-            <w:tcW w:type="dxa" w:w="3120"/>
+            <w:tcW w:type="dxa" w:w="2016"/>
+            <w:shd w:fill="FFFFFF"/>
+            <w:tcMar>
+              <w:top w:w="90" w:type="dxa"/>
+              <w:bottom w:w="90" w:type="dxa"/>
+              <w:left w:w="140" w:type="dxa"/>
+              <w:right w:w="140" w:type="dxa"/>
+            </w:tcMar>
           </w:tcPr>
           <w:p>
+            <w:pPr>
+              <w:spacing w:after="0"/>
+            </w:pPr>
             <w:r>
-              <w:t>Leitura e reaproveitamento de modelos DOCX dos professores.</w:t>
+              <w:rPr>
+                <w:rFonts w:ascii="Calibri" w:hAnsi="Calibri"/>
+                <w:color w:val="333333"/>
+                <w:sz w:val="19"/>
+              </w:rPr>
+              <w:t>C, H, J, E</w:t>
             </w:r>
           </w:p>
         </w:tc>
         <w:tc>
           <w:tcPr>
-            <w:tcW w:type="dxa" w:w="3120"/>
+            <w:tcW w:type="dxa" w:w="4320"/>
+            <w:shd w:fill="FFFFFF"/>
+            <w:tcMar>
+              <w:top w:w="90" w:type="dxa"/>
+              <w:bottom w:w="90" w:type="dxa"/>
+              <w:left w:w="140" w:type="dxa"/>
+              <w:right w:w="140" w:type="dxa"/>
+            </w:tcMar>
           </w:tcPr>
           <w:p>
+            <w:pPr>
+              <w:spacing w:after="0"/>
+            </w:pPr>
             <w:r>
-              <w:t>Modelos locais</w:t>
+              <w:rPr>
+                <w:rFonts w:ascii="Calibri" w:hAnsi="Calibri"/>
+                <w:color w:val="333333"/>
+                <w:sz w:val="19"/>
+              </w:rPr>
+              <w:t>LINGUA_PORTUGUESA/...</w:t>
             </w:r>
           </w:p>
         </w:tc>
@@ -436,191 +1636,76 @@
       <w:tr>
         <w:tc>
           <w:tcPr>
-            <w:tcW w:type="dxa" w:w="3120"/>
+            <w:tcW w:type="dxa" w:w="3744"/>
+            <w:shd w:fill="F9FBFD"/>
+            <w:tcMar>
+              <w:top w:w="90" w:type="dxa"/>
+              <w:bottom w:w="90" w:type="dxa"/>
+              <w:left w:w="140" w:type="dxa"/>
+              <w:right w:w="140" w:type="dxa"/>
+            </w:tcMar>
           </w:tcPr>
           <w:p>
+            <w:pPr>
+              <w:spacing w:after="0"/>
+            </w:pPr>
             <w:r>
-              <w:t>core/modelos_docx.py + templates/</w:t>
+              <w:rPr>
+                <w:rFonts w:ascii="Calibri" w:hAnsi="Calibri"/>
+                <w:color w:val="333333"/>
+                <w:sz w:val="19"/>
+              </w:rPr>
+              <w:t>ARTE - CDP - EJA - MULTISSERIADO</w:t>
             </w:r>
           </w:p>
         </w:tc>
         <w:tc>
           <w:tcPr>
-            <w:tcW w:type="dxa" w:w="3120"/>
+            <w:tcW w:type="dxa" w:w="2016"/>
+            <w:shd w:fill="F9FBFD"/>
+            <w:tcMar>
+              <w:top w:w="90" w:type="dxa"/>
+              <w:bottom w:w="90" w:type="dxa"/>
+              <w:left w:w="140" w:type="dxa"/>
+              <w:right w:w="140" w:type="dxa"/>
+            </w:tcMar>
           </w:tcPr>
           <w:p>
+            <w:pPr>
+              <w:spacing w:after="0"/>
+            </w:pPr>
             <w:r>
-              <w:t>Escolha de templates centrais por contexto e template_id.</w:t>
+              <w:rPr>
+                <w:rFonts w:ascii="Calibri" w:hAnsi="Calibri"/>
+                <w:color w:val="333333"/>
+                <w:sz w:val="19"/>
+              </w:rPr>
+              <w:t>C, H, J, E</w:t>
             </w:r>
           </w:p>
         </w:tc>
         <w:tc>
           <w:tcPr>
-            <w:tcW w:type="dxa" w:w="3120"/>
+            <w:tcW w:type="dxa" w:w="4320"/>
+            <w:shd w:fill="F9FBFD"/>
+            <w:tcMar>
+              <w:top w:w="90" w:type="dxa"/>
+              <w:bottom w:w="90" w:type="dxa"/>
+              <w:left w:w="140" w:type="dxa"/>
+              <w:right w:w="140" w:type="dxa"/>
+            </w:tcMar>
           </w:tcPr>
           <w:p>
+            <w:pPr>
+              <w:spacing w:after="0"/>
+            </w:pPr>
             <w:r>
-              <w:t>Modelos centrais</w:t>
-            </w:r>
-          </w:p>
-        </w:tc>
-      </w:tr>
-      <w:tr>
-        <w:tc>
-          <w:tcPr>
-            <w:tcW w:type="dxa" w:w="3120"/>
-          </w:tcPr>
-          <w:p>
-            <w:r>
-              <w:t>core/cdp/ + cdp_legacy.py + cdp_em_docx.py</w:t>
-            </w:r>
-          </w:p>
-        </w:tc>
-        <w:tc>
-          <w:tcPr>
-            <w:tcW w:type="dxa" w:w="3120"/>
-          </w:tcPr>
-          <w:p>
-            <w:r>
-              <w:t>Fluxo CDP atual com camada de compatibilidade legada.</w:t>
-            </w:r>
-          </w:p>
-        </w:tc>
-        <w:tc>
-          <w:tcPr>
-            <w:tcW w:type="dxa" w:w="3120"/>
-          </w:tcPr>
-          <w:p>
-            <w:r>
-              <w:t>Nucleo CDP</w:t>
-            </w:r>
-          </w:p>
-        </w:tc>
-      </w:tr>
-      <w:tr>
-        <w:tc>
-          <w:tcPr>
-            <w:tcW w:type="dxa" w:w="3120"/>
-          </w:tcPr>
-          <w:p>
-            <w:r>
-              <w:t>core/ae_priorizado.py + assets/ae_priorizado/</w:t>
-            </w:r>
-          </w:p>
-        </w:tc>
-        <w:tc>
-          <w:tcPr>
-            <w:tcW w:type="dxa" w:w="3120"/>
-          </w:tcPr>
-          <w:p>
-            <w:r>
-              <w:t>Aplicacao de AE priorizado quando houver base compativel.</w:t>
-            </w:r>
-          </w:p>
-        </w:tc>
-        <w:tc>
-          <w:tcPr>
-            <w:tcW w:type="dxa" w:w="3120"/>
-          </w:tcPr>
-          <w:p>
-            <w:r>
-              <w:t>Integracao curricular</w:t>
-            </w:r>
-          </w:p>
-        </w:tc>
-      </w:tr>
-      <w:tr>
-        <w:tc>
-          <w:tcPr>
-            <w:tcW w:type="dxa" w:w="3120"/>
-          </w:tcPr>
-          <w:p>
-            <w:r>
-              <w:t>docx_generator/</w:t>
-            </w:r>
-          </w:p>
-        </w:tc>
-        <w:tc>
-          <w:tcPr>
-            <w:tcW w:type="dxa" w:w="3120"/>
-          </w:tcPr>
-          <w:p>
-            <w:r>
-              <w:t>Preenchimento final dos documentos Word para fluxo comum e CDP.</w:t>
-            </w:r>
-          </w:p>
-        </w:tc>
-        <w:tc>
-          <w:tcPr>
-            <w:tcW w:type="dxa" w:w="3120"/>
-          </w:tcPr>
-          <w:p>
-            <w:r>
-              <w:t>Saida DOCX</w:t>
-            </w:r>
-          </w:p>
-        </w:tc>
-      </w:tr>
-      <w:tr>
-        <w:tc>
-          <w:tcPr>
-            <w:tcW w:type="dxa" w:w="3120"/>
-          </w:tcPr>
-          <w:p>
-            <w:r>
-              <w:t>tests/</w:t>
-            </w:r>
-          </w:p>
-        </w:tc>
-        <w:tc>
-          <w:tcPr>
-            <w:tcW w:type="dxa" w:w="3120"/>
-          </w:tcPr>
-          <w:p>
-            <w:r>
-              <w:t>Cobertura automatica das regras mais sensiveis do sistema.</w:t>
-            </w:r>
-          </w:p>
-        </w:tc>
-        <w:tc>
-          <w:tcPr>
-            <w:tcW w:type="dxa" w:w="3120"/>
-          </w:tcPr>
-          <w:p>
-            <w:r>
-              <w:t>Qualidade</w:t>
-            </w:r>
-          </w:p>
-        </w:tc>
-      </w:tr>
-      <w:tr>
-        <w:tc>
-          <w:tcPr>
-            <w:tcW w:type="dxa" w:w="3120"/>
-          </w:tcPr>
-          <w:p>
-            <w:r>
-              <w:t>scripts/atualizar_documentacao_sistema.py</w:t>
-            </w:r>
-          </w:p>
-        </w:tc>
-        <w:tc>
-          <w:tcPr>
-            <w:tcW w:type="dxa" w:w="3120"/>
-          </w:tcPr>
-          <w:p>
-            <w:r>
-              <w:t>Regeneracao automatica das documentacoes docx e txt.</w:t>
-            </w:r>
-          </w:p>
-        </w:tc>
-        <w:tc>
-          <w:tcPr>
-            <w:tcW w:type="dxa" w:w="3120"/>
-          </w:tcPr>
-          <w:p>
-            <w:r>
-              <w:t>Manutencao</w:t>
+              <w:rPr>
+                <w:rFonts w:ascii="Calibri" w:hAnsi="Calibri"/>
+                <w:color w:val="333333"/>
+                <w:sz w:val="19"/>
+              </w:rPr>
+              <w:t>ARTE/...</w:t>
             </w:r>
           </w:p>
         </w:tc>
@@ -628,458 +1713,153 @@
     </w:tbl>
     <w:p>
       <w:pPr>
-        <w:pStyle w:val="Heading1"/>
+        <w:spacing w:after="160"/>
+      </w:pPr>
+    </w:p>
+    <w:p>
+      <w:pPr>
+        <w:keepNext/>
+        <w:spacing w:before="280" w:after="120"/>
       </w:pPr>
       <w:r>
-        <w:t>3. Mudancas mais importantes desde a versao de 05/06/2026</w:t>
+        <w:rPr>
+          <w:rFonts w:ascii="Calibri" w:hAnsi="Calibri"/>
+          <w:b/>
+          <w:color w:val="1B365D"/>
+          <w:sz w:val="30"/>
+        </w:rPr>
+        <w:t>5. BANCO DE DADOS E ARMAZENAMENTO</w:t>
       </w:r>
     </w:p>
     <w:p>
       <w:pPr>
-        <w:pStyle w:val="ListBullet"/>
+        <w:spacing w:after="120" w:line="276" w:lineRule="auto"/>
       </w:pPr>
       <w:r>
-        <w:t>A tela principal consolidou o fluxo em contexto, extracao, revisao e download, com mais destaque para revisao pedagógica antes do DOCX.</w:t>
+        <w:rPr>
+          <w:rFonts w:ascii="Calibri" w:hAnsi="Calibri"/>
+          <w:color w:val="333333"/>
+          <w:sz w:val="21"/>
+        </w:rPr>
+        <w:t>O banco de dados SQLite local está situado em PLANOS_LUAN_DADOS/planos_luan.db, operando com modo WAL (Write-Ahead Logging) e foreign keys ativadas. As principais tabelas são:</w:t>
       </w:r>
     </w:p>
     <w:p>
       <w:pPr>
-        <w:pStyle w:val="ListBullet"/>
+        <w:spacing w:after="120" w:line="276" w:lineRule="auto"/>
       </w:pPr>
       <w:r>
-        <w:t>O envio de PDFs passou a trabalhar claramente com os modos Automatico, Todos de uma vez e Um por aula.</w:t>
+        <w:rPr>
+          <w:rFonts w:ascii="Calibri" w:hAnsi="Calibri"/>
+          <w:b/>
+          <w:color w:val="222222"/>
+          <w:sz w:val="21"/>
+        </w:rPr>
+        <w:t xml:space="preserve">Tabela 1: </w:t>
+      </w:r>
+      <w:r>
+        <w:rPr>
+          <w:rFonts w:ascii="Calibri" w:hAnsi="Calibri"/>
+          <w:color w:val="333333"/>
+          <w:sz w:val="21"/>
+        </w:rPr>
+        <w:t>• professores: id, nome (UNIQUE)</w:t>
       </w:r>
     </w:p>
     <w:p>
       <w:pPr>
-        <w:pStyle w:val="ListBullet"/>
+        <w:spacing w:after="120" w:line="276" w:lineRule="auto"/>
       </w:pPr>
       <w:r>
-        <w:t>A memoria da ultima aula deixou de ser obrigatoria: hoje o usuario pode gerar o DOCX sem salvar no historico.</w:t>
+        <w:rPr>
+          <w:rFonts w:ascii="Calibri" w:hAnsi="Calibri"/>
+          <w:b/>
+          <w:color w:val="222222"/>
+          <w:sz w:val="21"/>
+        </w:rPr>
+        <w:t xml:space="preserve">Tabela 2: </w:t>
+      </w:r>
+      <w:r>
+        <w:rPr>
+          <w:rFonts w:ascii="Calibri" w:hAnsi="Calibri"/>
+          <w:color w:val="333333"/>
+          <w:sz w:val="21"/>
+        </w:rPr>
+        <w:t>• professor_turmas: id, professor_id (FK), disciplina, turma, dia_semana, horario, aulas_semana, arquivo_modelo, template_id, componente_curricular</w:t>
       </w:r>
     </w:p>
     <w:p>
       <w:pPr>
-        <w:pStyle w:val="ListBullet"/>
+        <w:spacing w:after="120" w:line="276" w:lineRule="auto"/>
       </w:pPr>
       <w:r>
-        <w:t>A camada de IA virou refinamento sobre rascunho local, em vez de trabalhar isoladamente. Agora, as listas de acompanhamento e acessibilidade também são enviadas à IA para refinamento contextual.</w:t>
+        <w:t>Tabela 3: ? historico_planos: id, professor_nome, disciplina, turma, bimestre, data_geracao, arquivo_nome, arquivo_path, mes_plano, ultima_aula, total_aulas, hashes</w:t>
       </w:r>
     </w:p>
     <w:p>
       <w:pPr>
-        <w:pStyle w:val="ListBullet"/>
+        <w:spacing w:after="120" w:line="276" w:lineRule="auto"/>
       </w:pPr>
       <w:r>
-        <w:t>Foi criada uma auditoria final por aula, com confidence_score, avisos_validacao, hash do PDF e cache JSON reaproveitavel.</w:t>
+        <w:t>Tabela 4: ? progresso_aulas: mem?ria da ?ltima aula por professor/turma/disciplina</w:t>
+        <w:br/>
+        <w:t>? professor_dados: dados administrativos e financeiros</w:t>
+        <w:br/>
+        <w:t>? configuracoes: chave (PK), valor</w:t>
       </w:r>
     </w:p>
     <w:p>
       <w:pPr>
-        <w:pStyle w:val="ListBullet"/>
+        <w:keepNext/>
+        <w:spacing w:before="280" w:after="120"/>
       </w:pPr>
       <w:r>
-        <w:t>A higienizacao pedagogica ficou mais forte, reduzindo contaminacao entre disciplinas e trocas indevidas de recurso.</w:t>
+        <w:rPr>
+          <w:rFonts w:ascii="Calibri" w:hAnsi="Calibri"/>
+          <w:b/>
+          <w:color w:val="1B365D"/>
+          <w:sz w:val="30"/>
+        </w:rPr>
+        <w:t>6. SUÍTE DE TESTES E QUALIDADE</w:t>
       </w:r>
     </w:p>
+    <w:tbl>
+      <w:tblPr>
+        <w:tblW w:type="auto" w:w="0"/>
+        <w:jc w:val="center"/>
+        <w:tblLook w:firstColumn="1" w:firstRow="1" w:lastColumn="0" w:lastRow="0" w:noHBand="0" w:noVBand="1" w:val="04A0"/>
+      </w:tblPr>
+      <w:tblGrid>
+        <w:gridCol w:w="9936"/>
+      </w:tblGrid>
+      <w:tr>
+        <w:tc>
+          <w:tcPr>
+            <w:tcW w:type="dxa" w:w="9936"/>
+            <w:shd w:fill="F0F4F8"/>
+            <w:tcMar>
+              <w:top w:w="140" w:type="dxa"/>
+              <w:bottom w:w="140" w:type="dxa"/>
+              <w:left w:w="200" w:type="dxa"/>
+              <w:right w:w="200" w:type="dxa"/>
+            </w:tcMar>
+          </w:tcPr>
+          <w:p>
+            <w:r>
+              <w:t>CERTIFICA??O DE TESTES (03/10/2026): Total de 853 testes automatizados (828 passed, 25 skipped, 0 failed)</w:t>
+            </w:r>
+          </w:p>
+        </w:tc>
+      </w:tr>
+    </w:tbl>
     <w:p>
       <w:pPr>
-        <w:pStyle w:val="ListBullet"/>
+        <w:spacing w:after="120"/>
       </w:pPr>
-      <w:r>
-        <w:t>A base de testes cresceu e hoje cobre fluxo principal sem lote, cache JSON, revisao final, timeout de IA e blocos pedagogicos mais recentes. Também implementamos testes de cache robustos e suporte à integração de novas disciplinas.</w:t>
-      </w:r>
-    </w:p>
-    <w:p>
-      <w:pPr>
-        <w:pStyle w:val="ListBullet"/>
-      </w:pPr>
-      <w:r>
-        <w:t>Padronizacao fisica de PDFs e atualizacao automatica de caminhos no arquivo central mapa_arquivos.csv para Matematica, Ciencias, Biologia e Historia.</w:t>
-      </w:r>
-    </w:p>
-    <w:p>
-      <w:pPr>
-        <w:pStyle w:val="ListBullet"/>
-      </w:pPr>
-      <w:r>
-        <w:t>Adicionados classificadores e metodologias autorais complexas (como linha do tempo, analise critica de fontes e debate de narrativas) para Historia, Ciencias e Biologia.</w:t>
-      </w:r>
-    </w:p>
-    <w:p>
-      <w:pPr>
-        <w:pStyle w:val="ListBullet"/>
-      </w:pPr>
-      <w:r>
-        <w:t>Integração e configuração do LibreOffice no PATH para conversões headless de .docx para .pdf.</w:t>
-      </w:r>
-    </w:p>
-    <w:p>
-      <w:pPr>
-        <w:pStyle w:val="Heading1"/>
-      </w:pPr>
-      <w:r>
-        <w:t>4. Partes que merecem leitura especial hoje</w:t>
-      </w:r>
-    </w:p>
-    <w:p>
-      <w:r>
-        <w:t>planos_luan_app.py segue sendo o grande orquestrador do uso diario. Ele concentra a experiencia de tela, a memoria de historico, as escolhas de modo de upload e a revisao centralizada.</w:t>
-      </w:r>
-    </w:p>
-    <w:p>
-      <w:r>
-        <w:t>core/lote.py continua sendo o coracao do fluxo PDF, mas agora conversa mais fortemente com classificadores e higienizadores de core/lib, alem de revisar e gravar cache sidecar por PDF.</w:t>
-      </w:r>
-    </w:p>
-    <w:p>
-      <w:r>
-        <w:t>core/ia.py, prompts_por_disciplina.py e referencias_metodologia.py formam a trilha de IA opcional. O desenho atual privilegia robustez: se a IA falhar, o motor local continua sustentando o plano.</w:t>
-      </w:r>
-    </w:p>
-    <w:p>
-      <w:r>
-        <w:t>core/revisao_final.py e tests/ viraram pecas mais relevantes do que eram nos documentos antigos, porque agora o sistema nao apenas gera: ele pontua, valida, reaproveita e tenta evitar que um PDF ja processado precise ser refeito sem necessidade.</w:t>
-      </w:r>
-    </w:p>
-    <w:p>
-      <w:pPr>
-        <w:pStyle w:val="Heading1"/>
-      </w:pPr>
-      <w:r>
-        <w:t>5. Operacao e artefatos do dia a dia</w:t>
-      </w:r>
-    </w:p>
-    <w:p>
-      <w:pPr>
-        <w:pStyle w:val="ListBullet"/>
-      </w:pPr>
-      <w:r>
-        <w:t>O banco principal usado pelo app continua na raiz: planos_luan.db.</w:t>
-      </w:r>
-    </w:p>
-    <w:p>
-      <w:pPr>
-        <w:pStyle w:val="ListBullet"/>
-      </w:pPr>
-      <w:r>
-        <w:t>Cada PDF processado pode ganhar um sidecar .json com hash, tema, metodologia, confidence_score e avisos.</w:t>
-      </w:r>
-    </w:p>
-    <w:p>
-      <w:pPr>
-        <w:pStyle w:val="ListBullet"/>
-      </w:pPr>
-      <w:r>
-        <w:t>Hoje existem 14 bases JSON de AE priorizado em assets/ae_priorizado, ainda concentradas no 2o bimestre.</w:t>
-      </w:r>
-    </w:p>
-    <w:p>
-      <w:pPr>
-        <w:pStyle w:val="ListBullet"/>
-      </w:pPr>
-      <w:r>
-        <w:t>O projeto possui 75 arquivos de teste automatizado em tests/.</w:t>
-      </w:r>
-    </w:p>
-    <w:p>
-      <w:pPr>
-        <w:pStyle w:val="ListBullet"/>
-      </w:pPr>
-      <w:r>
-        <w:t>As versoes .txt extraidas da documentacao continuam existindo para leitura rapida fora do Word.</w:t>
-      </w:r>
-    </w:p>
-    <w:p>
-      <w:pPr>
-        <w:pStyle w:val="ListBullet"/>
-      </w:pPr>
-      <w:r>
-        <w:t>O LibreOffice está instalado e configurado globalmente no PATH, servindo para conversão local e rápida de DOCX em PDF.</w:t>
-      </w:r>
-    </w:p>
-    <w:p>
-      <w:pPr>
-        <w:pStyle w:val="Heading1"/>
-      </w:pPr>
-      <w:r>
-        <w:t>6. Como a documentacao fica atualizada agora</w:t>
-      </w:r>
-    </w:p>
-    <w:p>
-      <w:r>
-        <w:t>A documentacao passou a ser regenerada por um script proprio do projeto: scripts/atualizar_documentacao_sistema.py. Esse script atualiza os dois DOCX e tambem as versoes TXT extraidas, reduzindo o risco de a descricao envelhecer depois de novas melhorias.</w:t>
-      </w:r>
-    </w:p>
-    <w:p>
-      <w:pPr>
-        <w:pStyle w:val="Heading1"/>
-      </w:pPr>
-      <w:r>
-        <w:t>7. Pontos fortes atuais</w:t>
-      </w:r>
-    </w:p>
-    <w:p>
-      <w:pPr>
-        <w:pStyle w:val="ListBullet"/>
-      </w:pPr>
-      <w:r>
-        <w:t>Fluxo mais guiado e menos manual do que nas versoes mais antigas.</w:t>
-      </w:r>
-    </w:p>
-    <w:p>
-      <w:pPr>
-        <w:pStyle w:val="ListBullet"/>
-      </w:pPr>
-      <w:r>
-        <w:t>Capacidade de trabalhar com PDF comum, CDP, EJA e AE priorizado sem trocar de sistema.</w:t>
-      </w:r>
-    </w:p>
-    <w:p>
-      <w:pPr>
-        <w:pStyle w:val="ListBullet"/>
-      </w:pPr>
-      <w:r>
-        <w:t>IA opcional com fallback local e pos-processamento forte.</w:t>
-      </w:r>
-    </w:p>
-    <w:p>
-      <w:pPr>
-        <w:pStyle w:val="ListBullet"/>
-      </w:pPr>
-      <w:r>
-        <w:t>Revisao humana antes do documento final.</w:t>
-      </w:r>
-    </w:p>
-    <w:p>
-      <w:pPr>
-        <w:pStyle w:val="ListBullet"/>
-      </w:pPr>
-      <w:r>
-        <w:t>Historico persistente, memoria de ultima aula e opcao de nao avancar essa memoria quando o plano ainda nao estiver ok.</w:t>
-      </w:r>
-    </w:p>
-    <w:p>
-      <w:pPr>
-        <w:pStyle w:val="ListBullet"/>
-      </w:pPr>
-      <w:r>
-        <w:t>Cobertura de testes mais madura e mais alinhada ao comportamento real do sistema.</w:t>
-      </w:r>
-    </w:p>
-    <w:p>
-      <w:pPr>
-        <w:pStyle w:val="Heading1"/>
-      </w:pPr>
-      <w:r>
-        <w:t>8. Prioridades naturais de evolucao</w:t>
-      </w:r>
-    </w:p>
-    <w:p>
-      <w:pPr>
-        <w:pStyle w:val="ListBullet"/>
-      </w:pPr>
-      <w:r>
-        <w:t>Continuar modularizando planos_luan_app.py, que ainda concentra muitas responsabilidades de interface e orquestracao.</w:t>
-      </w:r>
-    </w:p>
-    <w:p>
-      <w:pPr>
-        <w:pStyle w:val="ListBullet"/>
-      </w:pPr>
-      <w:r>
-        <w:t>Expandir a base estruturada de AE priorizado para mais contextos quando os dados estiverem prontos.</w:t>
-      </w:r>
-    </w:p>
-    <w:p>
-      <w:pPr>
-        <w:pStyle w:val="ListBullet"/>
-      </w:pPr>
-      <w:r>
-        <w:t>Reduzir sobreposicao entre camadas novas e legadas do CDP.</w:t>
-      </w:r>
-    </w:p>
-    <w:p>
-      <w:pPr>
-        <w:pStyle w:val="ListBullet"/>
-      </w:pPr>
-      <w:r>
-        <w:t>Fortalecer diagnosticos automaticos de modelos Word, bases externas e configuracoes locais.</w:t>
-      </w:r>
-    </w:p>
-    <w:p>
-      <w:pPr>
-        <w:pStyle w:val="ListBullet"/>
-      </w:pPr>
-      <w:r>
-        <w:t>Manter a documentacao e a automacao diaria como artefatos oficiais de manutencao do projeto.</w:t>
-      </w:r>
-    </w:p>
-    <w:p>
-      <w:pPr>
-        <w:pStyle w:val="Heading1"/>
-      </w:pPr>
-      <w:r>
-        <w:t>9. Conclusao</w:t>
-      </w:r>
-    </w:p>
-    <w:p>
-      <w:r>
-        <w:t>Hoje o PLANOS_LUAN deve ser entendido como uma linha de producao pedagogica com varias camadas de seguranca: cadastro, agenda, leitura de modelos, extracao, IA opcional, higienizacao, revisao humana, auditoria final e geracao Word. Ele ja nao funciona apenas como leitor de PDF com Word na saida; ele organiza memoria, contexto e qualidade antes da entrega.</w:t>
-      </w:r>
-    </w:p>
-    <w:p>
-      <w:r>
-        <w:t>Integração completa da disciplina de Arte e de Arte e Mídias Digitais (2º Ano EM) no motor de geração, mapeados de forma especializada sob o perfil pedagógico autoral de artes.</w:t>
-      </w:r>
-    </w:p>
-    <w:p>
-      <w:r>
-        <w:t>Correção crítica no motor de cache JSON (lote.py): agora os planos refinados por IA são preservados no cache e não sofrem mais sobreposição incondicional com a referência crua DOCX.</w:t>
-      </w:r>
-    </w:p>
-    <w:p>
-      <w:r>
-        <w:t>Adicionado controle de consistência no cache: invalidação automática do cache JSON caso a escolha do usuário de usar IA (flag usar_ia) seja alternada.</w:t>
-      </w:r>
-    </w:p>
-    <w:p>
-      <w:r>
-        <w:t>Novos utilitários de interface no Streamlit: menu horizontal de navegação, dicas de digitação usando rapidfuzz (similaridade em nomes de professores/disciplinas) e botão para salvar as metodologias corrigidas na tela diretamente nos arquivos DOCX originais.</w:t>
-      </w:r>
-    </w:p>
-    <w:p>
-      <w:pPr>
-        <w:pStyle w:val="Heading2"/>
-      </w:pPr>
-      <w:r>
-        <w:t>Atualização Recente - Ajuste de Limite de Caracteres e Invalidação de Cache (Versão 1.2.10)</w:t>
-      </w:r>
-    </w:p>
-    <w:p>
-      <w:r>
-        <w:t>Ajuste na instrução da IA em core/ia.py: O limite de caracteres para cada etapa metodológica gerada pela Inteligência Artificial foi reduzido de 1200 para 600 caracteres. O objetivo é evitar planos de aula excessivamente prolixos e redundantes. Essa restrição também foi reforçada na função local de pós-processamento de strings '_compactar_metodologia' (hard limit).</w:t>
-      </w:r>
-    </w:p>
-    <w:p>
-      <w:r>
-        <w:t>Incremento da Versão do Gerador: A constante VERSAO_GERADOR_ATUAL no arquivo core/revisao_final.py foi incrementada para '1.2.10'. Isso garante que o cache antigo de json mantido pelo sistema (em core/reuso_cache_plano.py) seja ignorado, forçando a IA a reprocessar as requisições respeitando as novas diretrizes limitadoras de 600 caracteres.</w:t>
-      </w:r>
-    </w:p>
-    <w:p>
-      <w:pPr>
-        <w:pStyle w:val="Heading1"/>
-      </w:pPr>
-      <w:r>
-        <w:t>Registro de Atualizações - 07/07/2026</w:t>
-      </w:r>
-    </w:p>
-    <w:p>
-      <w:r>
-        <w:t>Atualizações recentes do sistema (Julho 2026):</w:t>
-      </w:r>
-    </w:p>
-    <w:p>
-      <w:pPr>
-        <w:pStyle w:val="ListBullet"/>
-      </w:pPr>
-      <w:r>
-        <w:t>- Correção no agrupamento de aulas duplas (divisão de metodologia) para não conflitar com a seleção automática de PDFs.</w:t>
-      </w:r>
-    </w:p>
-    <w:p>
-      <w:pPr>
-        <w:pStyle w:val="ListBullet"/>
-      </w:pPr>
-      <w:r>
-        <w:t>- Ajuste na pasta auxiliar DOCX_AUXILIARES_EXTRACAO: transferida para a raiz do projeto (BASE_DIR) para evitar conflitos de permissão do Windows Defender/OneDrive no diretório Documents.</w:t>
-      </w:r>
-    </w:p>
-    <w:p>
-      <w:pPr>
-        <w:pStyle w:val="ListBullet"/>
-      </w:pPr>
-      <w:r>
-        <w:t>- Remoção do fallback silencioso da Inteligência Artificial (OpenAI/Gemini): o sistema agora aborta o processamento com um erro explícito (RuntimeError) caso a IA falhe, em vez de recorrer silenciosamente ao motor heurístico local. Isso garante previsibilidade na geração de lotes.</w:t>
-      </w:r>
-    </w:p>
-    <w:p>
-      <w:pPr>
-        <w:pStyle w:val="ListBullet"/>
-      </w:pPr>
-      <w:r>
-        <w:t>- Nova nomenclatura de arquivos IA: planos gerados com sucesso utilizando motor de IA agora recebem obrigatoriamente o sufixo '_In' (ex: Plano_1o_ANO_A_Biologia_In.docx) indicando Inteligência Artificial, substituindo o antigo '_IA'.</w:t>
-      </w:r>
-    </w:p>
-    <w:p>
-      <w:pPr>
-        <w:pStyle w:val="Heading1"/>
-      </w:pPr>
-      <w:r>
-        <w:t>Registro de Atualizações - 12/07/2026</w:t>
-      </w:r>
-    </w:p>
-    <w:p>
-      <w:pPr>
-        <w:pStyle w:val="ListBullet"/>
-      </w:pPr>
-      <w:r>
-        <w:t>Correção no layout das tabelas do template EJA (MODELOCDP), garantindo a preservação da primeira coluna (Data e Horário) ao lidar com células mescladas na extração do acompanhamento.</w:t>
-      </w:r>
-    </w:p>
-    <w:p>
-      <w:pPr>
-        <w:pStyle w:val="ListBullet"/>
-      </w:pPr>
-      <w:r>
-        <w:t>Melhoria na formatação dos rótulos de horários contendo tuplas no gerador de lote (ui/geracao_lote.py), evitando que estruturas de código apareçam na impressão do Word.</w:t>
-      </w:r>
-    </w:p>
-    <w:p>
-      <w:pPr>
-        <w:pStyle w:val="ListBullet"/>
-      </w:pPr>
-      <w:r>
-        <w:t>Nova disciplina 'Biologia-EJA' incorporada nativamente aos identificadores do core (core/disciplinas.py e aliases do core/helpers.py).</w:t>
-      </w:r>
-    </w:p>
-    <w:p>
-      <w:pPr>
-        <w:pStyle w:val="ListBullet"/>
-      </w:pPr>
-      <w:r>
-        <w:t>Ampliação do dicionário de conjugação e normalização de verbos metodológicos da Inteligência Artificial em core/metodologia_texto.py (ex: Projete, Peça, Divida, Sugira, etc.).</w:t>
-      </w:r>
-    </w:p>
-    <w:p>
-      <w:pPr>
-        <w:pStyle w:val="ListBullet"/>
-      </w:pPr>
-      <w:r>
-        <w:t>Limpeza de interface aprimorada no Histórico (ui/historico.py): planos deletados das pastas físicas ocultam-se totalmente, ao invés de constarem como 'Indisponível'.</w:t>
-      </w:r>
-    </w:p>
-    <w:p>
-      <w:r>
-        <w:t>Registro de Atualizações - 13/07/2026 (Auditoria Fases 1 a 3)</w:t>
-        <w:br/>
-        <w:t>Resumo das últimas atualizações focadas na estabilidade do banco de dados, resiliência do Word e reestruturação arquitetural (Padrão Strangler Fig):</w:t>
-        <w:br/>
-        <w:t>- Refatoração do Word (Logical Grid): A gravação nas células (.docx) foi protegida contra o bug do `gridSpan` e `vMerge` (células mescladas). Isso previne a sobreposição de textos silenciosa no arquivo final gerado.</w:t>
-        <w:br/>
-        <w:t>- UUID4 no Histórico: Ao salvar no banco de dados e no disco físico, o timestamp obsoleto foi substituído por geração baseada em UUID, mitigando riscos de sobrescrita de arquivos se gerados no mesmo milissegundo.</w:t>
-        <w:br/>
-        <w:t>- Fallback Transparente de Inteligência Artificial: Se a requisição de IA (Gemini/OpenAI) retornar um Timeout ou Erro de Servidor, a rotina não fará o lote inteiro falhar. O sistema registrará o erro no log e utilizará, com transparência, o motor local de geração heurística, evitando interrupções na fila.</w:t>
-        <w:br/>
-        <w:t>- Desacoplamento Estrutural (Fase 3): A gigantesca rotina do arquivo `lote.py` começou a ser dividida em módulos dedicados (`core/application`, `core/domain`, `core/extraction`, `core/generation`).</w:t>
-        <w:br/>
-        <w:t>- Padrão Strangler Fig: Um orquestrador (`GerarPlanoService`) com injeção de contexto (`ContextBuilder`) e motor de geração (`PlanGenerator`) foi injetado em paralelo no sistema legado. Eles processam e logam a geração de planos usando as novas lógicas otimizadas sem interferir no pipeline original enquanto são validados em produção.</w:t>
-        <w:br/>
-      </w:r>
     </w:p>
     <w:sectPr>
       <w:pgSz w:w="12240" w:h="15840"/>
-      <w:pgMar w:top="1440" w:right="1440" w:bottom="1440" w:left="1440" w:header="720" w:footer="720" w:gutter="0"/>
+      <w:pgMar w:top="1152" w:right="1152" w:bottom="1152" w:left="1152" w:header="720" w:footer="720" w:gutter="0"/>
       <w:cols w:space="720"/>
       <w:docGrid w:linePitch="360"/>
     </w:sectPr>
@@ -1450,10 +2230,6 @@
     <w:name w:val="Normal"/>
     <w:qFormat/>
     <w:rsid w:val="00FC693F"/>
-    <w:rPr>
-      <w:rFonts w:ascii="Calibri" w:hAnsi="Calibri"/>
-      <w:sz w:val="22"/>
-    </w:rPr>
   </w:style>
   <w:style w:type="paragraph" w:styleId="Header">
     <w:name w:val="header"/>
@@ -1514,7 +2290,7 @@
       <w:outlineLvl w:val="0"/>
     </w:pPr>
     <w:rPr>
-      <w:rFonts w:asciiTheme="majorHAnsi" w:eastAsiaTheme="majorEastAsia" w:hAnsiTheme="majorHAnsi" w:cstheme="majorBidi" w:ascii="Calibri" w:hAnsi="Calibri"/>
+      <w:rFonts w:asciiTheme="majorHAnsi" w:eastAsiaTheme="majorEastAsia" w:hAnsiTheme="majorHAnsi" w:cstheme="majorBidi"/>
       <w:b/>
       <w:bCs/>
       <w:color w:val="365F91" w:themeColor="accent1" w:themeShade="BF"/>
@@ -1538,11 +2314,11 @@
       <w:outlineLvl w:val="1"/>
     </w:pPr>
     <w:rPr>
-      <w:rFonts w:asciiTheme="majorHAnsi" w:eastAsiaTheme="majorEastAsia" w:hAnsiTheme="majorHAnsi" w:cstheme="majorBidi" w:ascii="Calibri" w:hAnsi="Calibri"/>
+      <w:rFonts w:asciiTheme="majorHAnsi" w:eastAsiaTheme="majorEastAsia" w:hAnsiTheme="majorHAnsi" w:cstheme="majorBidi"/>
       <w:b/>
       <w:bCs/>
       <w:color w:val="4F81BD" w:themeColor="accent1"/>
-      <w:sz w:val="24"/>
+      <w:sz w:val="26"/>
       <w:szCs w:val="26"/>
     </w:rPr>
   </w:style>
@@ -1803,11 +2579,11 @@
       <w:contextualSpacing/>
     </w:pPr>
     <w:rPr>
-      <w:rFonts w:asciiTheme="majorHAnsi" w:eastAsiaTheme="majorEastAsia" w:hAnsiTheme="majorHAnsi" w:cstheme="majorBidi" w:ascii="Calibri" w:hAnsi="Calibri"/>
+      <w:rFonts w:asciiTheme="majorHAnsi" w:eastAsiaTheme="majorEastAsia" w:hAnsiTheme="majorHAnsi" w:cstheme="majorBidi"/>
       <w:color w:val="17365D" w:themeColor="text2" w:themeShade="BF"/>
       <w:spacing w:val="5"/>
       <w:kern w:val="28"/>
-      <w:sz w:val="36"/>
+      <w:sz w:val="52"/>
       <w:szCs w:val="52"/>
     </w:rPr>
   </w:style>

</xml_diff>